<commit_message>
Map all 32-bit lIndicators channel values in the TCS guide.
Document the bit-weight table, signed-long decoding note, combined-value examples, and a quick-reference list for digital indicator channels 0 through 31. Sync the Word export to match.

Co-authored-by: rodrigogismondi <rodrigogismondi@users.noreply.github.com>
</commit_message>
<xml_diff>
--- a/remas/TCS_STRUCT/Word Document/tcs-logger-mtos-current.docx
+++ b/remas/TCS_STRUCT/Word Document/tcs-logger-mtos-current.docx
@@ -7435,16 +7435,27 @@
             <w:tcW w:type="dxa" w:w="3216"/>
           </w:tcPr>
           <w:p>
+            <w:r>
+              <w:rPr>
+                <w:rFonts w:ascii="Calibri" w:hAnsi="Calibri" w:eastAsia="Calibri"/>
+                <w:b w:val="0"/>
+                <w:i w:val="0"/>
+                <w:color w:val="000000"/>
+                <w:sz w:val="20"/>
+              </w:rPr>
+              <w:t>32-bit bitfield. Bit n = digital indicator channel n (0..31). Bit set = lamp on. Combined value is the sum of those bit weights. Lamp text is vessel-defined in TCSView.ini.</w:t>
+            </w:r>
+          </w:p>
+        </w:tc>
+      </w:tr>
+      <w:tr>
+        <w:tc>
+          <w:tcPr>
+            <w:tcW w:type="dxa" w:w="3216"/>
+            <w:shd w:fill="EEF3F8" w:val="clear"/>
+          </w:tcPr>
+          <w:p>
             <w:r/>
-            <w:r>
-              <w:rPr>
-                <w:rFonts w:ascii="Calibri" w:hAnsi="Calibri" w:eastAsia="Calibri"/>
-                <w:b w:val="0"/>
-                <w:i w:val="0"/>
-                <w:sz w:val="20"/>
-              </w:rPr>
-              <w:t>Up to 32 bits (</w:t>
-            </w:r>
             <w:r>
               <w:rPr>
                 <w:rFonts w:ascii="Consolas" w:hAnsi="Consolas" w:eastAsia="Consolas"/>
@@ -7453,16 +7464,119 @@
                 <w:color w:val="333333"/>
                 <w:sz w:val="18"/>
               </w:rPr>
-              <w:t>0..31</w:t>
-            </w:r>
-            <w:r>
-              <w:rPr>
-                <w:rFonts w:ascii="Calibri" w:hAnsi="Calibri" w:eastAsia="Calibri"/>
-                <w:b w:val="0"/>
-                <w:i w:val="0"/>
-                <w:sz w:val="20"/>
-              </w:rPr>
-              <w:t>). Bit meaning is vessel-defined.</w:t>
+              <w:t>sButtonInd[i][g]</w:t>
+            </w:r>
+          </w:p>
+        </w:tc>
+        <w:tc>
+          <w:tcPr>
+            <w:tcW w:type="dxa" w:w="3216"/>
+            <w:shd w:fill="EEF3F8" w:val="clear"/>
+          </w:tcPr>
+          <w:p>
+            <w:r/>
+            <w:r>
+              <w:rPr>
+                <w:rFonts w:ascii="Calibri" w:hAnsi="Calibri" w:eastAsia="Calibri"/>
+                <w:b w:val="0"/>
+                <w:i w:val="0"/>
+                <w:sz w:val="20"/>
+              </w:rPr>
+              <w:t>Custom button LED state</w:t>
+            </w:r>
+          </w:p>
+        </w:tc>
+        <w:tc>
+          <w:tcPr>
+            <w:tcW w:type="dxa" w:w="3216"/>
+            <w:shd w:fill="EEF3F8" w:val="clear"/>
+          </w:tcPr>
+          <w:p>
+            <w:r/>
+            <w:r>
+              <w:rPr>
+                <w:rFonts w:ascii="Calibri" w:hAnsi="Calibri" w:eastAsia="Calibri"/>
+                <w:b w:val="0"/>
+                <w:i w:val="0"/>
+                <w:sz w:val="20"/>
+              </w:rPr>
+              <w:t xml:space="preserve">Thruster </w:t>
+            </w:r>
+            <w:r>
+              <w:rPr>
+                <w:rFonts w:ascii="Consolas" w:hAnsi="Consolas" w:eastAsia="Consolas"/>
+                <w:b w:val="0"/>
+                <w:i w:val="0"/>
+                <w:color w:val="333333"/>
+                <w:sz w:val="18"/>
+              </w:rPr>
+              <w:t>i</w:t>
+            </w:r>
+            <w:r>
+              <w:rPr>
+                <w:rFonts w:ascii="Calibri" w:hAnsi="Calibri" w:eastAsia="Calibri"/>
+                <w:b w:val="0"/>
+                <w:i w:val="0"/>
+                <w:sz w:val="20"/>
+              </w:rPr>
+              <w:t xml:space="preserve">, button group </w:t>
+            </w:r>
+            <w:r>
+              <w:rPr>
+                <w:rFonts w:ascii="Consolas" w:hAnsi="Consolas" w:eastAsia="Consolas"/>
+                <w:b w:val="0"/>
+                <w:i w:val="0"/>
+                <w:color w:val="333333"/>
+                <w:sz w:val="18"/>
+              </w:rPr>
+              <w:t>g</w:t>
+            </w:r>
+            <w:r>
+              <w:rPr>
+                <w:rFonts w:ascii="Calibri" w:hAnsi="Calibri" w:eastAsia="Calibri"/>
+                <w:b w:val="0"/>
+                <w:i w:val="0"/>
+                <w:sz w:val="20"/>
+              </w:rPr>
+              <w:t xml:space="preserve"> (</w:t>
+            </w:r>
+            <w:r>
+              <w:rPr>
+                <w:rFonts w:ascii="Consolas" w:hAnsi="Consolas" w:eastAsia="Consolas"/>
+                <w:b w:val="0"/>
+                <w:i w:val="0"/>
+                <w:color w:val="333333"/>
+                <w:sz w:val="18"/>
+              </w:rPr>
+              <w:t>0..23</w:t>
+            </w:r>
+            <w:r>
+              <w:rPr>
+                <w:rFonts w:ascii="Calibri" w:hAnsi="Calibri" w:eastAsia="Calibri"/>
+                <w:b w:val="0"/>
+                <w:i w:val="0"/>
+                <w:sz w:val="20"/>
+              </w:rPr>
+              <w:t xml:space="preserve">). Bits </w:t>
+            </w:r>
+            <w:r>
+              <w:rPr>
+                <w:rFonts w:ascii="Consolas" w:hAnsi="Consolas" w:eastAsia="Consolas"/>
+                <w:b w:val="0"/>
+                <w:i w:val="0"/>
+                <w:color w:val="333333"/>
+                <w:sz w:val="18"/>
+              </w:rPr>
+              <w:t>0..4</w:t>
+            </w:r>
+            <w:r>
+              <w:rPr>
+                <w:rFonts w:ascii="Calibri" w:hAnsi="Calibri" w:eastAsia="Calibri"/>
+                <w:b w:val="0"/>
+                <w:i w:val="0"/>
+                <w:sz w:val="20"/>
+              </w:rPr>
+              <w:t xml:space="preserve"> are the five buttons in that group. Bit set = indication on.</w:t>
             </w:r>
           </w:p>
         </w:tc>
@@ -7471,7 +7585,6 @@
         <w:tc>
           <w:tcPr>
             <w:tcW w:type="dxa" w:w="3216"/>
-            <w:shd w:fill="EEF3F8" w:val="clear"/>
           </w:tcPr>
           <w:p>
             <w:r/>
@@ -7483,10 +7596,46 @@
                 <w:color w:val="333333"/>
                 <w:sz w:val="18"/>
               </w:rPr>
-              <w:t>sButtonInd[i][g]</w:t>
-            </w:r>
-          </w:p>
-        </w:tc>
+              <w:t>sButtonDisable[i][g]</w:t>
+            </w:r>
+          </w:p>
+        </w:tc>
+        <w:tc>
+          <w:tcPr>
+            <w:tcW w:type="dxa" w:w="3216"/>
+          </w:tcPr>
+          <w:p>
+            <w:r/>
+            <w:r>
+              <w:rPr>
+                <w:rFonts w:ascii="Calibri" w:hAnsi="Calibri" w:eastAsia="Calibri"/>
+                <w:b w:val="0"/>
+                <w:i w:val="0"/>
+                <w:sz w:val="20"/>
+              </w:rPr>
+              <w:t>Custom button unavailable state</w:t>
+            </w:r>
+          </w:p>
+        </w:tc>
+        <w:tc>
+          <w:tcPr>
+            <w:tcW w:type="dxa" w:w="3216"/>
+          </w:tcPr>
+          <w:p>
+            <w:r/>
+            <w:r>
+              <w:rPr>
+                <w:rFonts w:ascii="Calibri" w:hAnsi="Calibri" w:eastAsia="Calibri"/>
+                <w:b w:val="0"/>
+                <w:i w:val="0"/>
+                <w:sz w:val="20"/>
+              </w:rPr>
+              <w:t>Same packing as above. Bit set = button disabled / not available.</w:t>
+            </w:r>
+          </w:p>
+        </w:tc>
+      </w:tr>
+      <w:tr>
         <w:tc>
           <w:tcPr>
             <w:tcW w:type="dxa" w:w="3216"/>
@@ -7496,12 +7645,13 @@
             <w:r/>
             <w:r>
               <w:rPr>
-                <w:rFonts w:ascii="Calibri" w:hAnsi="Calibri" w:eastAsia="Calibri"/>
-                <w:b w:val="0"/>
-                <w:i w:val="0"/>
-                <w:sz w:val="20"/>
-              </w:rPr>
-              <w:t>Custom button LED state</w:t>
+                <w:rFonts w:ascii="Consolas" w:hAnsi="Consolas" w:eastAsia="Consolas"/>
+                <w:b w:val="0"/>
+                <w:i w:val="0"/>
+                <w:color w:val="333333"/>
+                <w:sz w:val="18"/>
+              </w:rPr>
+              <w:t>dAnalogIndValue[i][a]</w:t>
             </w:r>
           </w:p>
         </w:tc>
@@ -7519,6 +7669,24 @@
                 <w:i w:val="0"/>
                 <w:sz w:val="20"/>
               </w:rPr>
+              <w:t>Custom analog indication</w:t>
+            </w:r>
+          </w:p>
+        </w:tc>
+        <w:tc>
+          <w:tcPr>
+            <w:tcW w:type="dxa" w:w="3216"/>
+            <w:shd w:fill="EEF3F8" w:val="clear"/>
+          </w:tcPr>
+          <w:p>
+            <w:r/>
+            <w:r>
+              <w:rPr>
+                <w:rFonts w:ascii="Calibri" w:hAnsi="Calibri" w:eastAsia="Calibri"/>
+                <w:b w:val="0"/>
+                <w:i w:val="0"/>
+                <w:sz w:val="20"/>
+              </w:rPr>
               <w:t xml:space="preserve">Thruster </w:t>
             </w:r>
             <w:r>
@@ -7538,7 +7706,7 @@
                 <w:i w:val="0"/>
                 <w:sz w:val="20"/>
               </w:rPr>
-              <w:t xml:space="preserve">, button group </w:t>
+              <w:t xml:space="preserve">, analog slot </w:t>
             </w:r>
             <w:r>
               <w:rPr>
@@ -7548,7 +7716,7 @@
                 <w:color w:val="333333"/>
                 <w:sz w:val="18"/>
               </w:rPr>
-              <w:t>g</w:t>
+              <w:t>a</w:t>
             </w:r>
             <w:r>
               <w:rPr>
@@ -7567,35 +7735,197 @@
                 <w:color w:val="333333"/>
                 <w:sz w:val="18"/>
               </w:rPr>
-              <w:t>0..23</w:t>
-            </w:r>
-            <w:r>
-              <w:rPr>
-                <w:rFonts w:ascii="Calibri" w:hAnsi="Calibri" w:eastAsia="Calibri"/>
-                <w:b w:val="0"/>
-                <w:i w:val="0"/>
-                <w:sz w:val="20"/>
-              </w:rPr>
-              <w:t xml:space="preserve">). Bits </w:t>
-            </w:r>
-            <w:r>
-              <w:rPr>
-                <w:rFonts w:ascii="Consolas" w:hAnsi="Consolas" w:eastAsia="Consolas"/>
-                <w:b w:val="0"/>
-                <w:i w:val="0"/>
-                <w:color w:val="333333"/>
-                <w:sz w:val="18"/>
-              </w:rPr>
-              <w:t>0..4</w:t>
-            </w:r>
-            <w:r>
-              <w:rPr>
-                <w:rFonts w:ascii="Calibri" w:hAnsi="Calibri" w:eastAsia="Calibri"/>
-                <w:b w:val="0"/>
-                <w:i w:val="0"/>
-                <w:sz w:val="20"/>
-              </w:rPr>
-              <w:t xml:space="preserve"> are the five buttons in that group. Bit set = indication on.</w:t>
+              <w:t>0..9</w:t>
+            </w:r>
+            <w:r>
+              <w:rPr>
+                <w:rFonts w:ascii="Calibri" w:hAnsi="Calibri" w:eastAsia="Calibri"/>
+                <w:b w:val="0"/>
+                <w:i w:val="0"/>
+                <w:sz w:val="20"/>
+              </w:rPr>
+              <w:t>). Meaning/unit come from vessel GUI config.</w:t>
+            </w:r>
+          </w:p>
+        </w:tc>
+      </w:tr>
+    </w:tbl>
+    <w:p>
+      <w:pPr>
+        <w:pStyle w:val="Normal"/>
+      </w:pPr>
+      <w:r>
+        <w:rPr>
+          <w:rFonts w:ascii="Calibri" w:hAnsi="Calibri" w:eastAsia="Calibri"/>
+          <w:sz w:val="22"/>
+        </w:rPr>
+      </w:r>
+    </w:p>
+    <w:p>
+      <w:pPr>
+        <w:pStyle w:val="Normal"/>
+      </w:pPr>
+      <w:r>
+        <w:rPr>
+          <w:rFonts w:ascii="Calibri" w:hAnsi="Calibri" w:eastAsia="Calibri"/>
+          <w:sz w:val="22"/>
+        </w:rPr>
+        <w:t xml:space="preserve">For </w:t>
+      </w:r>
+      <w:r>
+        <w:rPr>
+          <w:rFonts w:ascii="Consolas" w:hAnsi="Consolas" w:eastAsia="Consolas"/>
+          <w:sz w:val="20"/>
+        </w:rPr>
+        <w:t>lIndicators[i]</w:t>
+      </w:r>
+      <w:r>
+        <w:rPr>
+          <w:rFonts w:ascii="Calibri" w:hAnsi="Calibri" w:eastAsia="Calibri"/>
+          <w:sz w:val="22"/>
+        </w:rPr>
+        <w:t xml:space="preserve">, each value is one 32-bit number for thruster slot </w:t>
+      </w:r>
+      <w:r>
+        <w:rPr>
+          <w:rFonts w:ascii="Consolas" w:hAnsi="Consolas" w:eastAsia="Consolas"/>
+          <w:sz w:val="20"/>
+        </w:rPr>
+        <w:t>i</w:t>
+      </w:r>
+      <w:r>
+        <w:rPr>
+          <w:rFonts w:ascii="Calibri" w:hAnsi="Calibri" w:eastAsia="Calibri"/>
+          <w:sz w:val="22"/>
+        </w:rPr>
+        <w:t xml:space="preserve">. Channel </w:t>
+      </w:r>
+      <w:r>
+        <w:rPr>
+          <w:rFonts w:ascii="Consolas" w:hAnsi="Consolas" w:eastAsia="Consolas"/>
+          <w:sz w:val="20"/>
+        </w:rPr>
+        <w:t>0</w:t>
+      </w:r>
+      <w:r>
+        <w:rPr>
+          <w:rFonts w:ascii="Calibri" w:hAnsi="Calibri" w:eastAsia="Calibri"/>
+          <w:sz w:val="22"/>
+        </w:rPr>
+        <w:t xml:space="preserve"> = bit 0, channel </w:t>
+      </w:r>
+      <w:r>
+        <w:rPr>
+          <w:rFonts w:ascii="Consolas" w:hAnsi="Consolas" w:eastAsia="Consolas"/>
+          <w:sz w:val="20"/>
+        </w:rPr>
+        <w:t>1</w:t>
+      </w:r>
+      <w:r>
+        <w:rPr>
+          <w:rFonts w:ascii="Calibri" w:hAnsi="Calibri" w:eastAsia="Calibri"/>
+          <w:sz w:val="22"/>
+        </w:rPr>
+        <w:t xml:space="preserve"> = bit 1, ... channel </w:t>
+      </w:r>
+      <w:r>
+        <w:rPr>
+          <w:rFonts w:ascii="Consolas" w:hAnsi="Consolas" w:eastAsia="Consolas"/>
+          <w:sz w:val="20"/>
+        </w:rPr>
+        <w:t>31</w:t>
+      </w:r>
+      <w:r>
+        <w:rPr>
+          <w:rFonts w:ascii="Calibri" w:hAnsi="Calibri" w:eastAsia="Calibri"/>
+          <w:sz w:val="22"/>
+        </w:rPr>
+        <w:t xml:space="preserve"> = bit 31:</w:t>
+      </w:r>
+    </w:p>
+    <w:p>
+      <w:pPr>
+        <w:pStyle w:val="Normal"/>
+      </w:pPr>
+      <w:r>
+        <w:rPr>
+          <w:rFonts w:ascii="Calibri" w:hAnsi="Calibri" w:eastAsia="Calibri"/>
+          <w:sz w:val="22"/>
+        </w:rPr>
+      </w:r>
+    </w:p>
+    <w:tbl>
+      <w:tblPr>
+        <w:tblStyle w:val="TableGrid"/>
+        <w:tblW w:type="auto" w:w="0"/>
+        <w:tblLook w:firstColumn="1" w:firstRow="1" w:lastColumn="0" w:lastRow="0" w:noHBand="0" w:noVBand="1" w:val="04A0"/>
+      </w:tblPr>
+      <w:tblGrid>
+        <w:gridCol w:w="3216"/>
+        <w:gridCol w:w="3216"/>
+        <w:gridCol w:w="3216"/>
+      </w:tblGrid>
+      <w:tr>
+        <w:tc>
+          <w:tcPr>
+            <w:tcW w:type="dxa" w:w="3216"/>
+            <w:shd w:fill="1F4E79" w:val="clear"/>
+          </w:tcPr>
+          <w:p>
+            <w:pPr>
+              <w:jc w:val="right"/>
+            </w:pPr>
+            <w:r>
+              <w:rPr>
+                <w:rFonts w:ascii="Calibri" w:hAnsi="Calibri" w:eastAsia="Calibri"/>
+                <w:b/>
+                <w:i w:val="0"/>
+                <w:color w:val="FFFFFF"/>
+                <w:sz w:val="20"/>
+              </w:rPr>
+              <w:t>Channel</w:t>
+            </w:r>
+          </w:p>
+        </w:tc>
+        <w:tc>
+          <w:tcPr>
+            <w:tcW w:type="dxa" w:w="3216"/>
+            <w:shd w:fill="1F4E79" w:val="clear"/>
+          </w:tcPr>
+          <w:p>
+            <w:pPr>
+              <w:jc w:val="right"/>
+            </w:pPr>
+            <w:r>
+              <w:rPr>
+                <w:rFonts w:ascii="Calibri" w:hAnsi="Calibri" w:eastAsia="Calibri"/>
+                <w:b/>
+                <w:i w:val="0"/>
+                <w:color w:val="FFFFFF"/>
+                <w:sz w:val="20"/>
+              </w:rPr>
+              <w:t>Bit</w:t>
+            </w:r>
+          </w:p>
+        </w:tc>
+        <w:tc>
+          <w:tcPr>
+            <w:tcW w:type="dxa" w:w="3216"/>
+            <w:shd w:fill="1F4E79" w:val="clear"/>
+          </w:tcPr>
+          <w:p>
+            <w:pPr>
+              <w:jc w:val="right"/>
+            </w:pPr>
+            <w:r>
+              <w:rPr>
+                <w:rFonts w:ascii="Calibri" w:hAnsi="Calibri" w:eastAsia="Calibri"/>
+                <w:b/>
+                <w:i w:val="0"/>
+                <w:color w:val="FFFFFF"/>
+                <w:sz w:val="20"/>
+              </w:rPr>
+              <w:t>Bit weight</w:t>
             </w:r>
           </w:p>
         </w:tc>
@@ -7606,16 +7936,18 @@
             <w:tcW w:type="dxa" w:w="3216"/>
           </w:tcPr>
           <w:p>
-            <w:r/>
-            <w:r>
-              <w:rPr>
-                <w:rFonts w:ascii="Consolas" w:hAnsi="Consolas" w:eastAsia="Consolas"/>
-                <w:b w:val="0"/>
-                <w:i w:val="0"/>
-                <w:color w:val="333333"/>
-                <w:sz w:val="18"/>
-              </w:rPr>
-              <w:t>sButtonDisable[i][g]</w:t>
+            <w:pPr>
+              <w:jc w:val="right"/>
+            </w:pPr>
+            <w:r>
+              <w:rPr>
+                <w:rFonts w:ascii="Calibri" w:hAnsi="Calibri" w:eastAsia="Calibri"/>
+                <w:b w:val="0"/>
+                <w:i w:val="0"/>
+                <w:color w:val="000000"/>
+                <w:sz w:val="20"/>
+              </w:rPr>
+              <w:t>0</w:t>
             </w:r>
           </w:p>
         </w:tc>
@@ -7624,15 +7956,18 @@
             <w:tcW w:type="dxa" w:w="3216"/>
           </w:tcPr>
           <w:p>
-            <w:r/>
-            <w:r>
-              <w:rPr>
-                <w:rFonts w:ascii="Calibri" w:hAnsi="Calibri" w:eastAsia="Calibri"/>
-                <w:b w:val="0"/>
-                <w:i w:val="0"/>
-                <w:sz w:val="20"/>
-              </w:rPr>
-              <w:t>Custom button unavailable state</w:t>
+            <w:pPr>
+              <w:jc w:val="right"/>
+            </w:pPr>
+            <w:r>
+              <w:rPr>
+                <w:rFonts w:ascii="Calibri" w:hAnsi="Calibri" w:eastAsia="Calibri"/>
+                <w:b w:val="0"/>
+                <w:i w:val="0"/>
+                <w:color w:val="000000"/>
+                <w:sz w:val="20"/>
+              </w:rPr>
+              <w:t>0</w:t>
             </w:r>
           </w:p>
         </w:tc>
@@ -7641,15 +7976,18 @@
             <w:tcW w:type="dxa" w:w="3216"/>
           </w:tcPr>
           <w:p>
-            <w:r/>
-            <w:r>
-              <w:rPr>
-                <w:rFonts w:ascii="Calibri" w:hAnsi="Calibri" w:eastAsia="Calibri"/>
-                <w:b w:val="0"/>
-                <w:i w:val="0"/>
-                <w:sz w:val="20"/>
-              </w:rPr>
-              <w:t>Same packing as above. Bit set = button disabled / not available.</w:t>
+            <w:pPr>
+              <w:jc w:val="right"/>
+            </w:pPr>
+            <w:r>
+              <w:rPr>
+                <w:rFonts w:ascii="Calibri" w:hAnsi="Calibri" w:eastAsia="Calibri"/>
+                <w:b w:val="0"/>
+                <w:i w:val="0"/>
+                <w:color w:val="000000"/>
+                <w:sz w:val="20"/>
+              </w:rPr>
+              <w:t>1</w:t>
             </w:r>
           </w:p>
         </w:tc>
@@ -7658,117 +7996,2230 @@
         <w:tc>
           <w:tcPr>
             <w:tcW w:type="dxa" w:w="3216"/>
-            <w:shd w:fill="EEF3F8" w:val="clear"/>
-          </w:tcPr>
-          <w:p>
-            <w:r/>
-            <w:r>
-              <w:rPr>
-                <w:rFonts w:ascii="Consolas" w:hAnsi="Consolas" w:eastAsia="Consolas"/>
-                <w:b w:val="0"/>
-                <w:i w:val="0"/>
-                <w:color w:val="333333"/>
-                <w:sz w:val="18"/>
-              </w:rPr>
-              <w:t>dAnalogIndValue[i][a]</w:t>
+            <w:shd w:val="clear" w:fill="EEF3F8"/>
+          </w:tcPr>
+          <w:p>
+            <w:pPr>
+              <w:jc w:val="right"/>
+            </w:pPr>
+            <w:r>
+              <w:rPr>
+                <w:rFonts w:ascii="Calibri" w:hAnsi="Calibri" w:eastAsia="Calibri"/>
+                <w:b w:val="0"/>
+                <w:i w:val="0"/>
+                <w:color w:val="000000"/>
+                <w:sz w:val="20"/>
+              </w:rPr>
+              <w:t>1</w:t>
             </w:r>
           </w:p>
         </w:tc>
         <w:tc>
           <w:tcPr>
             <w:tcW w:type="dxa" w:w="3216"/>
-            <w:shd w:fill="EEF3F8" w:val="clear"/>
-          </w:tcPr>
-          <w:p>
-            <w:r/>
-            <w:r>
-              <w:rPr>
-                <w:rFonts w:ascii="Calibri" w:hAnsi="Calibri" w:eastAsia="Calibri"/>
-                <w:b w:val="0"/>
-                <w:i w:val="0"/>
-                <w:sz w:val="20"/>
-              </w:rPr>
-              <w:t>Custom analog indication</w:t>
+            <w:shd w:val="clear" w:fill="EEF3F8"/>
+          </w:tcPr>
+          <w:p>
+            <w:pPr>
+              <w:jc w:val="right"/>
+            </w:pPr>
+            <w:r>
+              <w:rPr>
+                <w:rFonts w:ascii="Calibri" w:hAnsi="Calibri" w:eastAsia="Calibri"/>
+                <w:b w:val="0"/>
+                <w:i w:val="0"/>
+                <w:color w:val="000000"/>
+                <w:sz w:val="20"/>
+              </w:rPr>
+              <w:t>1</w:t>
             </w:r>
           </w:p>
         </w:tc>
         <w:tc>
           <w:tcPr>
             <w:tcW w:type="dxa" w:w="3216"/>
-            <w:shd w:fill="EEF3F8" w:val="clear"/>
-          </w:tcPr>
-          <w:p>
-            <w:r/>
-            <w:r>
-              <w:rPr>
-                <w:rFonts w:ascii="Calibri" w:hAnsi="Calibri" w:eastAsia="Calibri"/>
-                <w:b w:val="0"/>
-                <w:i w:val="0"/>
-                <w:sz w:val="20"/>
-              </w:rPr>
-              <w:t xml:space="preserve">Thruster </w:t>
-            </w:r>
-            <w:r>
-              <w:rPr>
-                <w:rFonts w:ascii="Consolas" w:hAnsi="Consolas" w:eastAsia="Consolas"/>
-                <w:b w:val="0"/>
-                <w:i w:val="0"/>
-                <w:color w:val="333333"/>
-                <w:sz w:val="18"/>
-              </w:rPr>
-              <w:t>i</w:t>
-            </w:r>
-            <w:r>
-              <w:rPr>
-                <w:rFonts w:ascii="Calibri" w:hAnsi="Calibri" w:eastAsia="Calibri"/>
-                <w:b w:val="0"/>
-                <w:i w:val="0"/>
-                <w:sz w:val="20"/>
-              </w:rPr>
-              <w:t xml:space="preserve">, analog slot </w:t>
-            </w:r>
-            <w:r>
-              <w:rPr>
-                <w:rFonts w:ascii="Consolas" w:hAnsi="Consolas" w:eastAsia="Consolas"/>
-                <w:b w:val="0"/>
-                <w:i w:val="0"/>
-                <w:color w:val="333333"/>
-                <w:sz w:val="18"/>
-              </w:rPr>
-              <w:t>a</w:t>
-            </w:r>
-            <w:r>
-              <w:rPr>
-                <w:rFonts w:ascii="Calibri" w:hAnsi="Calibri" w:eastAsia="Calibri"/>
-                <w:b w:val="0"/>
-                <w:i w:val="0"/>
-                <w:sz w:val="20"/>
-              </w:rPr>
-              <w:t xml:space="preserve"> (</w:t>
-            </w:r>
-            <w:r>
-              <w:rPr>
-                <w:rFonts w:ascii="Consolas" w:hAnsi="Consolas" w:eastAsia="Consolas"/>
-                <w:b w:val="0"/>
-                <w:i w:val="0"/>
-                <w:color w:val="333333"/>
-                <w:sz w:val="18"/>
-              </w:rPr>
-              <w:t>0..9</w:t>
-            </w:r>
-            <w:r>
-              <w:rPr>
-                <w:rFonts w:ascii="Calibri" w:hAnsi="Calibri" w:eastAsia="Calibri"/>
-                <w:b w:val="0"/>
-                <w:i w:val="0"/>
-                <w:sz w:val="20"/>
-              </w:rPr>
-              <w:t>). Meaning/unit come from vessel GUI config.</w:t>
+            <w:shd w:val="clear" w:fill="EEF3F8"/>
+          </w:tcPr>
+          <w:p>
+            <w:pPr>
+              <w:jc w:val="right"/>
+            </w:pPr>
+            <w:r>
+              <w:rPr>
+                <w:rFonts w:ascii="Calibri" w:hAnsi="Calibri" w:eastAsia="Calibri"/>
+                <w:b w:val="0"/>
+                <w:i w:val="0"/>
+                <w:color w:val="000000"/>
+                <w:sz w:val="20"/>
+              </w:rPr>
+              <w:t>2</w:t>
+            </w:r>
+          </w:p>
+        </w:tc>
+      </w:tr>
+      <w:tr>
+        <w:tc>
+          <w:tcPr>
+            <w:tcW w:type="dxa" w:w="3216"/>
+          </w:tcPr>
+          <w:p>
+            <w:pPr>
+              <w:jc w:val="right"/>
+            </w:pPr>
+            <w:r>
+              <w:rPr>
+                <w:rFonts w:ascii="Calibri" w:hAnsi="Calibri" w:eastAsia="Calibri"/>
+                <w:b w:val="0"/>
+                <w:i w:val="0"/>
+                <w:color w:val="000000"/>
+                <w:sz w:val="20"/>
+              </w:rPr>
+              <w:t>2</w:t>
+            </w:r>
+          </w:p>
+        </w:tc>
+        <w:tc>
+          <w:tcPr>
+            <w:tcW w:type="dxa" w:w="3216"/>
+          </w:tcPr>
+          <w:p>
+            <w:pPr>
+              <w:jc w:val="right"/>
+            </w:pPr>
+            <w:r>
+              <w:rPr>
+                <w:rFonts w:ascii="Calibri" w:hAnsi="Calibri" w:eastAsia="Calibri"/>
+                <w:b w:val="0"/>
+                <w:i w:val="0"/>
+                <w:color w:val="000000"/>
+                <w:sz w:val="20"/>
+              </w:rPr>
+              <w:t>2</w:t>
+            </w:r>
+          </w:p>
+        </w:tc>
+        <w:tc>
+          <w:tcPr>
+            <w:tcW w:type="dxa" w:w="3216"/>
+          </w:tcPr>
+          <w:p>
+            <w:pPr>
+              <w:jc w:val="right"/>
+            </w:pPr>
+            <w:r>
+              <w:rPr>
+                <w:rFonts w:ascii="Calibri" w:hAnsi="Calibri" w:eastAsia="Calibri"/>
+                <w:b w:val="0"/>
+                <w:i w:val="0"/>
+                <w:color w:val="000000"/>
+                <w:sz w:val="20"/>
+              </w:rPr>
+              <w:t>4</w:t>
+            </w:r>
+          </w:p>
+        </w:tc>
+      </w:tr>
+      <w:tr>
+        <w:tc>
+          <w:tcPr>
+            <w:tcW w:type="dxa" w:w="3216"/>
+            <w:shd w:val="clear" w:fill="EEF3F8"/>
+          </w:tcPr>
+          <w:p>
+            <w:pPr>
+              <w:jc w:val="right"/>
+            </w:pPr>
+            <w:r>
+              <w:rPr>
+                <w:rFonts w:ascii="Calibri" w:hAnsi="Calibri" w:eastAsia="Calibri"/>
+                <w:b w:val="0"/>
+                <w:i w:val="0"/>
+                <w:color w:val="000000"/>
+                <w:sz w:val="20"/>
+              </w:rPr>
+              <w:t>3</w:t>
+            </w:r>
+          </w:p>
+        </w:tc>
+        <w:tc>
+          <w:tcPr>
+            <w:tcW w:type="dxa" w:w="3216"/>
+            <w:shd w:val="clear" w:fill="EEF3F8"/>
+          </w:tcPr>
+          <w:p>
+            <w:pPr>
+              <w:jc w:val="right"/>
+            </w:pPr>
+            <w:r>
+              <w:rPr>
+                <w:rFonts w:ascii="Calibri" w:hAnsi="Calibri" w:eastAsia="Calibri"/>
+                <w:b w:val="0"/>
+                <w:i w:val="0"/>
+                <w:color w:val="000000"/>
+                <w:sz w:val="20"/>
+              </w:rPr>
+              <w:t>3</w:t>
+            </w:r>
+          </w:p>
+        </w:tc>
+        <w:tc>
+          <w:tcPr>
+            <w:tcW w:type="dxa" w:w="3216"/>
+            <w:shd w:val="clear" w:fill="EEF3F8"/>
+          </w:tcPr>
+          <w:p>
+            <w:pPr>
+              <w:jc w:val="right"/>
+            </w:pPr>
+            <w:r>
+              <w:rPr>
+                <w:rFonts w:ascii="Calibri" w:hAnsi="Calibri" w:eastAsia="Calibri"/>
+                <w:b w:val="0"/>
+                <w:i w:val="0"/>
+                <w:color w:val="000000"/>
+                <w:sz w:val="20"/>
+              </w:rPr>
+              <w:t>8</w:t>
+            </w:r>
+          </w:p>
+        </w:tc>
+      </w:tr>
+      <w:tr>
+        <w:tc>
+          <w:tcPr>
+            <w:tcW w:type="dxa" w:w="3216"/>
+          </w:tcPr>
+          <w:p>
+            <w:pPr>
+              <w:jc w:val="right"/>
+            </w:pPr>
+            <w:r>
+              <w:rPr>
+                <w:rFonts w:ascii="Calibri" w:hAnsi="Calibri" w:eastAsia="Calibri"/>
+                <w:b w:val="0"/>
+                <w:i w:val="0"/>
+                <w:color w:val="000000"/>
+                <w:sz w:val="20"/>
+              </w:rPr>
+              <w:t>4</w:t>
+            </w:r>
+          </w:p>
+        </w:tc>
+        <w:tc>
+          <w:tcPr>
+            <w:tcW w:type="dxa" w:w="3216"/>
+          </w:tcPr>
+          <w:p>
+            <w:pPr>
+              <w:jc w:val="right"/>
+            </w:pPr>
+            <w:r>
+              <w:rPr>
+                <w:rFonts w:ascii="Calibri" w:hAnsi="Calibri" w:eastAsia="Calibri"/>
+                <w:b w:val="0"/>
+                <w:i w:val="0"/>
+                <w:color w:val="000000"/>
+                <w:sz w:val="20"/>
+              </w:rPr>
+              <w:t>4</w:t>
+            </w:r>
+          </w:p>
+        </w:tc>
+        <w:tc>
+          <w:tcPr>
+            <w:tcW w:type="dxa" w:w="3216"/>
+          </w:tcPr>
+          <w:p>
+            <w:pPr>
+              <w:jc w:val="right"/>
+            </w:pPr>
+            <w:r>
+              <w:rPr>
+                <w:rFonts w:ascii="Calibri" w:hAnsi="Calibri" w:eastAsia="Calibri"/>
+                <w:b w:val="0"/>
+                <w:i w:val="0"/>
+                <w:color w:val="000000"/>
+                <w:sz w:val="20"/>
+              </w:rPr>
+              <w:t>16</w:t>
+            </w:r>
+          </w:p>
+        </w:tc>
+      </w:tr>
+      <w:tr>
+        <w:tc>
+          <w:tcPr>
+            <w:tcW w:type="dxa" w:w="3216"/>
+            <w:shd w:val="clear" w:fill="EEF3F8"/>
+          </w:tcPr>
+          <w:p>
+            <w:pPr>
+              <w:jc w:val="right"/>
+            </w:pPr>
+            <w:r>
+              <w:rPr>
+                <w:rFonts w:ascii="Calibri" w:hAnsi="Calibri" w:eastAsia="Calibri"/>
+                <w:b w:val="0"/>
+                <w:i w:val="0"/>
+                <w:color w:val="000000"/>
+                <w:sz w:val="20"/>
+              </w:rPr>
+              <w:t>5</w:t>
+            </w:r>
+          </w:p>
+        </w:tc>
+        <w:tc>
+          <w:tcPr>
+            <w:tcW w:type="dxa" w:w="3216"/>
+            <w:shd w:val="clear" w:fill="EEF3F8"/>
+          </w:tcPr>
+          <w:p>
+            <w:pPr>
+              <w:jc w:val="right"/>
+            </w:pPr>
+            <w:r>
+              <w:rPr>
+                <w:rFonts w:ascii="Calibri" w:hAnsi="Calibri" w:eastAsia="Calibri"/>
+                <w:b w:val="0"/>
+                <w:i w:val="0"/>
+                <w:color w:val="000000"/>
+                <w:sz w:val="20"/>
+              </w:rPr>
+              <w:t>5</w:t>
+            </w:r>
+          </w:p>
+        </w:tc>
+        <w:tc>
+          <w:tcPr>
+            <w:tcW w:type="dxa" w:w="3216"/>
+            <w:shd w:val="clear" w:fill="EEF3F8"/>
+          </w:tcPr>
+          <w:p>
+            <w:pPr>
+              <w:jc w:val="right"/>
+            </w:pPr>
+            <w:r>
+              <w:rPr>
+                <w:rFonts w:ascii="Calibri" w:hAnsi="Calibri" w:eastAsia="Calibri"/>
+                <w:b w:val="0"/>
+                <w:i w:val="0"/>
+                <w:color w:val="000000"/>
+                <w:sz w:val="20"/>
+              </w:rPr>
+              <w:t>32</w:t>
+            </w:r>
+          </w:p>
+        </w:tc>
+      </w:tr>
+      <w:tr>
+        <w:tc>
+          <w:tcPr>
+            <w:tcW w:type="dxa" w:w="3216"/>
+          </w:tcPr>
+          <w:p>
+            <w:pPr>
+              <w:jc w:val="right"/>
+            </w:pPr>
+            <w:r>
+              <w:rPr>
+                <w:rFonts w:ascii="Calibri" w:hAnsi="Calibri" w:eastAsia="Calibri"/>
+                <w:b w:val="0"/>
+                <w:i w:val="0"/>
+                <w:color w:val="000000"/>
+                <w:sz w:val="20"/>
+              </w:rPr>
+              <w:t>6</w:t>
+            </w:r>
+          </w:p>
+        </w:tc>
+        <w:tc>
+          <w:tcPr>
+            <w:tcW w:type="dxa" w:w="3216"/>
+          </w:tcPr>
+          <w:p>
+            <w:pPr>
+              <w:jc w:val="right"/>
+            </w:pPr>
+            <w:r>
+              <w:rPr>
+                <w:rFonts w:ascii="Calibri" w:hAnsi="Calibri" w:eastAsia="Calibri"/>
+                <w:b w:val="0"/>
+                <w:i w:val="0"/>
+                <w:color w:val="000000"/>
+                <w:sz w:val="20"/>
+              </w:rPr>
+              <w:t>6</w:t>
+            </w:r>
+          </w:p>
+        </w:tc>
+        <w:tc>
+          <w:tcPr>
+            <w:tcW w:type="dxa" w:w="3216"/>
+          </w:tcPr>
+          <w:p>
+            <w:pPr>
+              <w:jc w:val="right"/>
+            </w:pPr>
+            <w:r>
+              <w:rPr>
+                <w:rFonts w:ascii="Calibri" w:hAnsi="Calibri" w:eastAsia="Calibri"/>
+                <w:b w:val="0"/>
+                <w:i w:val="0"/>
+                <w:color w:val="000000"/>
+                <w:sz w:val="20"/>
+              </w:rPr>
+              <w:t>64</w:t>
+            </w:r>
+          </w:p>
+        </w:tc>
+      </w:tr>
+      <w:tr>
+        <w:tc>
+          <w:tcPr>
+            <w:tcW w:type="dxa" w:w="3216"/>
+            <w:shd w:val="clear" w:fill="EEF3F8"/>
+          </w:tcPr>
+          <w:p>
+            <w:pPr>
+              <w:jc w:val="right"/>
+            </w:pPr>
+            <w:r>
+              <w:rPr>
+                <w:rFonts w:ascii="Calibri" w:hAnsi="Calibri" w:eastAsia="Calibri"/>
+                <w:b w:val="0"/>
+                <w:i w:val="0"/>
+                <w:color w:val="000000"/>
+                <w:sz w:val="20"/>
+              </w:rPr>
+              <w:t>7</w:t>
+            </w:r>
+          </w:p>
+        </w:tc>
+        <w:tc>
+          <w:tcPr>
+            <w:tcW w:type="dxa" w:w="3216"/>
+            <w:shd w:val="clear" w:fill="EEF3F8"/>
+          </w:tcPr>
+          <w:p>
+            <w:pPr>
+              <w:jc w:val="right"/>
+            </w:pPr>
+            <w:r>
+              <w:rPr>
+                <w:rFonts w:ascii="Calibri" w:hAnsi="Calibri" w:eastAsia="Calibri"/>
+                <w:b w:val="0"/>
+                <w:i w:val="0"/>
+                <w:color w:val="000000"/>
+                <w:sz w:val="20"/>
+              </w:rPr>
+              <w:t>7</w:t>
+            </w:r>
+          </w:p>
+        </w:tc>
+        <w:tc>
+          <w:tcPr>
+            <w:tcW w:type="dxa" w:w="3216"/>
+            <w:shd w:val="clear" w:fill="EEF3F8"/>
+          </w:tcPr>
+          <w:p>
+            <w:pPr>
+              <w:jc w:val="right"/>
+            </w:pPr>
+            <w:r>
+              <w:rPr>
+                <w:rFonts w:ascii="Calibri" w:hAnsi="Calibri" w:eastAsia="Calibri"/>
+                <w:b w:val="0"/>
+                <w:i w:val="0"/>
+                <w:color w:val="000000"/>
+                <w:sz w:val="20"/>
+              </w:rPr>
+              <w:t>128</w:t>
+            </w:r>
+          </w:p>
+        </w:tc>
+      </w:tr>
+      <w:tr>
+        <w:tc>
+          <w:tcPr>
+            <w:tcW w:type="dxa" w:w="3216"/>
+          </w:tcPr>
+          <w:p>
+            <w:pPr>
+              <w:jc w:val="right"/>
+            </w:pPr>
+            <w:r>
+              <w:rPr>
+                <w:rFonts w:ascii="Calibri" w:hAnsi="Calibri" w:eastAsia="Calibri"/>
+                <w:b w:val="0"/>
+                <w:i w:val="0"/>
+                <w:color w:val="000000"/>
+                <w:sz w:val="20"/>
+              </w:rPr>
+              <w:t>8</w:t>
+            </w:r>
+          </w:p>
+        </w:tc>
+        <w:tc>
+          <w:tcPr>
+            <w:tcW w:type="dxa" w:w="3216"/>
+          </w:tcPr>
+          <w:p>
+            <w:pPr>
+              <w:jc w:val="right"/>
+            </w:pPr>
+            <w:r>
+              <w:rPr>
+                <w:rFonts w:ascii="Calibri" w:hAnsi="Calibri" w:eastAsia="Calibri"/>
+                <w:b w:val="0"/>
+                <w:i w:val="0"/>
+                <w:color w:val="000000"/>
+                <w:sz w:val="20"/>
+              </w:rPr>
+              <w:t>8</w:t>
+            </w:r>
+          </w:p>
+        </w:tc>
+        <w:tc>
+          <w:tcPr>
+            <w:tcW w:type="dxa" w:w="3216"/>
+          </w:tcPr>
+          <w:p>
+            <w:pPr>
+              <w:jc w:val="right"/>
+            </w:pPr>
+            <w:r>
+              <w:rPr>
+                <w:rFonts w:ascii="Calibri" w:hAnsi="Calibri" w:eastAsia="Calibri"/>
+                <w:b w:val="0"/>
+                <w:i w:val="0"/>
+                <w:color w:val="000000"/>
+                <w:sz w:val="20"/>
+              </w:rPr>
+              <w:t>256</w:t>
+            </w:r>
+          </w:p>
+        </w:tc>
+      </w:tr>
+      <w:tr>
+        <w:tc>
+          <w:tcPr>
+            <w:tcW w:type="dxa" w:w="3216"/>
+            <w:shd w:val="clear" w:fill="EEF3F8"/>
+          </w:tcPr>
+          <w:p>
+            <w:pPr>
+              <w:jc w:val="right"/>
+            </w:pPr>
+            <w:r>
+              <w:rPr>
+                <w:rFonts w:ascii="Calibri" w:hAnsi="Calibri" w:eastAsia="Calibri"/>
+                <w:b w:val="0"/>
+                <w:i w:val="0"/>
+                <w:color w:val="000000"/>
+                <w:sz w:val="20"/>
+              </w:rPr>
+              <w:t>9</w:t>
+            </w:r>
+          </w:p>
+        </w:tc>
+        <w:tc>
+          <w:tcPr>
+            <w:tcW w:type="dxa" w:w="3216"/>
+            <w:shd w:val="clear" w:fill="EEF3F8"/>
+          </w:tcPr>
+          <w:p>
+            <w:pPr>
+              <w:jc w:val="right"/>
+            </w:pPr>
+            <w:r>
+              <w:rPr>
+                <w:rFonts w:ascii="Calibri" w:hAnsi="Calibri" w:eastAsia="Calibri"/>
+                <w:b w:val="0"/>
+                <w:i w:val="0"/>
+                <w:color w:val="000000"/>
+                <w:sz w:val="20"/>
+              </w:rPr>
+              <w:t>9</w:t>
+            </w:r>
+          </w:p>
+        </w:tc>
+        <w:tc>
+          <w:tcPr>
+            <w:tcW w:type="dxa" w:w="3216"/>
+            <w:shd w:val="clear" w:fill="EEF3F8"/>
+          </w:tcPr>
+          <w:p>
+            <w:pPr>
+              <w:jc w:val="right"/>
+            </w:pPr>
+            <w:r>
+              <w:rPr>
+                <w:rFonts w:ascii="Calibri" w:hAnsi="Calibri" w:eastAsia="Calibri"/>
+                <w:b w:val="0"/>
+                <w:i w:val="0"/>
+                <w:color w:val="000000"/>
+                <w:sz w:val="20"/>
+              </w:rPr>
+              <w:t>512</w:t>
+            </w:r>
+          </w:p>
+        </w:tc>
+      </w:tr>
+      <w:tr>
+        <w:tc>
+          <w:tcPr>
+            <w:tcW w:type="dxa" w:w="3216"/>
+          </w:tcPr>
+          <w:p>
+            <w:pPr>
+              <w:jc w:val="right"/>
+            </w:pPr>
+            <w:r>
+              <w:rPr>
+                <w:rFonts w:ascii="Calibri" w:hAnsi="Calibri" w:eastAsia="Calibri"/>
+                <w:b w:val="0"/>
+                <w:i w:val="0"/>
+                <w:color w:val="000000"/>
+                <w:sz w:val="20"/>
+              </w:rPr>
+              <w:t>10</w:t>
+            </w:r>
+          </w:p>
+        </w:tc>
+        <w:tc>
+          <w:tcPr>
+            <w:tcW w:type="dxa" w:w="3216"/>
+          </w:tcPr>
+          <w:p>
+            <w:pPr>
+              <w:jc w:val="right"/>
+            </w:pPr>
+            <w:r>
+              <w:rPr>
+                <w:rFonts w:ascii="Calibri" w:hAnsi="Calibri" w:eastAsia="Calibri"/>
+                <w:b w:val="0"/>
+                <w:i w:val="0"/>
+                <w:color w:val="000000"/>
+                <w:sz w:val="20"/>
+              </w:rPr>
+              <w:t>10</w:t>
+            </w:r>
+          </w:p>
+        </w:tc>
+        <w:tc>
+          <w:tcPr>
+            <w:tcW w:type="dxa" w:w="3216"/>
+          </w:tcPr>
+          <w:p>
+            <w:pPr>
+              <w:jc w:val="right"/>
+            </w:pPr>
+            <w:r>
+              <w:rPr>
+                <w:rFonts w:ascii="Calibri" w:hAnsi="Calibri" w:eastAsia="Calibri"/>
+                <w:b w:val="0"/>
+                <w:i w:val="0"/>
+                <w:color w:val="000000"/>
+                <w:sz w:val="20"/>
+              </w:rPr>
+              <w:t>1024</w:t>
+            </w:r>
+          </w:p>
+        </w:tc>
+      </w:tr>
+      <w:tr>
+        <w:tc>
+          <w:tcPr>
+            <w:tcW w:type="dxa" w:w="3216"/>
+            <w:shd w:val="clear" w:fill="EEF3F8"/>
+          </w:tcPr>
+          <w:p>
+            <w:pPr>
+              <w:jc w:val="right"/>
+            </w:pPr>
+            <w:r>
+              <w:rPr>
+                <w:rFonts w:ascii="Calibri" w:hAnsi="Calibri" w:eastAsia="Calibri"/>
+                <w:b w:val="0"/>
+                <w:i w:val="0"/>
+                <w:color w:val="000000"/>
+                <w:sz w:val="20"/>
+              </w:rPr>
+              <w:t>11</w:t>
+            </w:r>
+          </w:p>
+        </w:tc>
+        <w:tc>
+          <w:tcPr>
+            <w:tcW w:type="dxa" w:w="3216"/>
+            <w:shd w:val="clear" w:fill="EEF3F8"/>
+          </w:tcPr>
+          <w:p>
+            <w:pPr>
+              <w:jc w:val="right"/>
+            </w:pPr>
+            <w:r>
+              <w:rPr>
+                <w:rFonts w:ascii="Calibri" w:hAnsi="Calibri" w:eastAsia="Calibri"/>
+                <w:b w:val="0"/>
+                <w:i w:val="0"/>
+                <w:color w:val="000000"/>
+                <w:sz w:val="20"/>
+              </w:rPr>
+              <w:t>11</w:t>
+            </w:r>
+          </w:p>
+        </w:tc>
+        <w:tc>
+          <w:tcPr>
+            <w:tcW w:type="dxa" w:w="3216"/>
+            <w:shd w:val="clear" w:fill="EEF3F8"/>
+          </w:tcPr>
+          <w:p>
+            <w:pPr>
+              <w:jc w:val="right"/>
+            </w:pPr>
+            <w:r>
+              <w:rPr>
+                <w:rFonts w:ascii="Calibri" w:hAnsi="Calibri" w:eastAsia="Calibri"/>
+                <w:b w:val="0"/>
+                <w:i w:val="0"/>
+                <w:color w:val="000000"/>
+                <w:sz w:val="20"/>
+              </w:rPr>
+              <w:t>2048</w:t>
+            </w:r>
+          </w:p>
+        </w:tc>
+      </w:tr>
+      <w:tr>
+        <w:tc>
+          <w:tcPr>
+            <w:tcW w:type="dxa" w:w="3216"/>
+          </w:tcPr>
+          <w:p>
+            <w:pPr>
+              <w:jc w:val="right"/>
+            </w:pPr>
+            <w:r>
+              <w:rPr>
+                <w:rFonts w:ascii="Calibri" w:hAnsi="Calibri" w:eastAsia="Calibri"/>
+                <w:b w:val="0"/>
+                <w:i w:val="0"/>
+                <w:color w:val="000000"/>
+                <w:sz w:val="20"/>
+              </w:rPr>
+              <w:t>12</w:t>
+            </w:r>
+          </w:p>
+        </w:tc>
+        <w:tc>
+          <w:tcPr>
+            <w:tcW w:type="dxa" w:w="3216"/>
+          </w:tcPr>
+          <w:p>
+            <w:pPr>
+              <w:jc w:val="right"/>
+            </w:pPr>
+            <w:r>
+              <w:rPr>
+                <w:rFonts w:ascii="Calibri" w:hAnsi="Calibri" w:eastAsia="Calibri"/>
+                <w:b w:val="0"/>
+                <w:i w:val="0"/>
+                <w:color w:val="000000"/>
+                <w:sz w:val="20"/>
+              </w:rPr>
+              <w:t>12</w:t>
+            </w:r>
+          </w:p>
+        </w:tc>
+        <w:tc>
+          <w:tcPr>
+            <w:tcW w:type="dxa" w:w="3216"/>
+          </w:tcPr>
+          <w:p>
+            <w:pPr>
+              <w:jc w:val="right"/>
+            </w:pPr>
+            <w:r>
+              <w:rPr>
+                <w:rFonts w:ascii="Calibri" w:hAnsi="Calibri" w:eastAsia="Calibri"/>
+                <w:b w:val="0"/>
+                <w:i w:val="0"/>
+                <w:color w:val="000000"/>
+                <w:sz w:val="20"/>
+              </w:rPr>
+              <w:t>4096</w:t>
+            </w:r>
+          </w:p>
+        </w:tc>
+      </w:tr>
+      <w:tr>
+        <w:tc>
+          <w:tcPr>
+            <w:tcW w:type="dxa" w:w="3216"/>
+            <w:shd w:val="clear" w:fill="EEF3F8"/>
+          </w:tcPr>
+          <w:p>
+            <w:pPr>
+              <w:jc w:val="right"/>
+            </w:pPr>
+            <w:r>
+              <w:rPr>
+                <w:rFonts w:ascii="Calibri" w:hAnsi="Calibri" w:eastAsia="Calibri"/>
+                <w:b w:val="0"/>
+                <w:i w:val="0"/>
+                <w:color w:val="000000"/>
+                <w:sz w:val="20"/>
+              </w:rPr>
+              <w:t>13</w:t>
+            </w:r>
+          </w:p>
+        </w:tc>
+        <w:tc>
+          <w:tcPr>
+            <w:tcW w:type="dxa" w:w="3216"/>
+            <w:shd w:val="clear" w:fill="EEF3F8"/>
+          </w:tcPr>
+          <w:p>
+            <w:pPr>
+              <w:jc w:val="right"/>
+            </w:pPr>
+            <w:r>
+              <w:rPr>
+                <w:rFonts w:ascii="Calibri" w:hAnsi="Calibri" w:eastAsia="Calibri"/>
+                <w:b w:val="0"/>
+                <w:i w:val="0"/>
+                <w:color w:val="000000"/>
+                <w:sz w:val="20"/>
+              </w:rPr>
+              <w:t>13</w:t>
+            </w:r>
+          </w:p>
+        </w:tc>
+        <w:tc>
+          <w:tcPr>
+            <w:tcW w:type="dxa" w:w="3216"/>
+            <w:shd w:val="clear" w:fill="EEF3F8"/>
+          </w:tcPr>
+          <w:p>
+            <w:pPr>
+              <w:jc w:val="right"/>
+            </w:pPr>
+            <w:r>
+              <w:rPr>
+                <w:rFonts w:ascii="Calibri" w:hAnsi="Calibri" w:eastAsia="Calibri"/>
+                <w:b w:val="0"/>
+                <w:i w:val="0"/>
+                <w:color w:val="000000"/>
+                <w:sz w:val="20"/>
+              </w:rPr>
+              <w:t>8192</w:t>
+            </w:r>
+          </w:p>
+        </w:tc>
+      </w:tr>
+      <w:tr>
+        <w:tc>
+          <w:tcPr>
+            <w:tcW w:type="dxa" w:w="3216"/>
+          </w:tcPr>
+          <w:p>
+            <w:pPr>
+              <w:jc w:val="right"/>
+            </w:pPr>
+            <w:r>
+              <w:rPr>
+                <w:rFonts w:ascii="Calibri" w:hAnsi="Calibri" w:eastAsia="Calibri"/>
+                <w:b w:val="0"/>
+                <w:i w:val="0"/>
+                <w:color w:val="000000"/>
+                <w:sz w:val="20"/>
+              </w:rPr>
+              <w:t>14</w:t>
+            </w:r>
+          </w:p>
+        </w:tc>
+        <w:tc>
+          <w:tcPr>
+            <w:tcW w:type="dxa" w:w="3216"/>
+          </w:tcPr>
+          <w:p>
+            <w:pPr>
+              <w:jc w:val="right"/>
+            </w:pPr>
+            <w:r>
+              <w:rPr>
+                <w:rFonts w:ascii="Calibri" w:hAnsi="Calibri" w:eastAsia="Calibri"/>
+                <w:b w:val="0"/>
+                <w:i w:val="0"/>
+                <w:color w:val="000000"/>
+                <w:sz w:val="20"/>
+              </w:rPr>
+              <w:t>14</w:t>
+            </w:r>
+          </w:p>
+        </w:tc>
+        <w:tc>
+          <w:tcPr>
+            <w:tcW w:type="dxa" w:w="3216"/>
+          </w:tcPr>
+          <w:p>
+            <w:pPr>
+              <w:jc w:val="right"/>
+            </w:pPr>
+            <w:r>
+              <w:rPr>
+                <w:rFonts w:ascii="Calibri" w:hAnsi="Calibri" w:eastAsia="Calibri"/>
+                <w:b w:val="0"/>
+                <w:i w:val="0"/>
+                <w:color w:val="000000"/>
+                <w:sz w:val="20"/>
+              </w:rPr>
+              <w:t>16384</w:t>
+            </w:r>
+          </w:p>
+        </w:tc>
+      </w:tr>
+      <w:tr>
+        <w:tc>
+          <w:tcPr>
+            <w:tcW w:type="dxa" w:w="3216"/>
+            <w:shd w:val="clear" w:fill="EEF3F8"/>
+          </w:tcPr>
+          <w:p>
+            <w:pPr>
+              <w:jc w:val="right"/>
+            </w:pPr>
+            <w:r>
+              <w:rPr>
+                <w:rFonts w:ascii="Calibri" w:hAnsi="Calibri" w:eastAsia="Calibri"/>
+                <w:b w:val="0"/>
+                <w:i w:val="0"/>
+                <w:color w:val="000000"/>
+                <w:sz w:val="20"/>
+              </w:rPr>
+              <w:t>15</w:t>
+            </w:r>
+          </w:p>
+        </w:tc>
+        <w:tc>
+          <w:tcPr>
+            <w:tcW w:type="dxa" w:w="3216"/>
+            <w:shd w:val="clear" w:fill="EEF3F8"/>
+          </w:tcPr>
+          <w:p>
+            <w:pPr>
+              <w:jc w:val="right"/>
+            </w:pPr>
+            <w:r>
+              <w:rPr>
+                <w:rFonts w:ascii="Calibri" w:hAnsi="Calibri" w:eastAsia="Calibri"/>
+                <w:b w:val="0"/>
+                <w:i w:val="0"/>
+                <w:color w:val="000000"/>
+                <w:sz w:val="20"/>
+              </w:rPr>
+              <w:t>15</w:t>
+            </w:r>
+          </w:p>
+        </w:tc>
+        <w:tc>
+          <w:tcPr>
+            <w:tcW w:type="dxa" w:w="3216"/>
+            <w:shd w:val="clear" w:fill="EEF3F8"/>
+          </w:tcPr>
+          <w:p>
+            <w:pPr>
+              <w:jc w:val="right"/>
+            </w:pPr>
+            <w:r>
+              <w:rPr>
+                <w:rFonts w:ascii="Calibri" w:hAnsi="Calibri" w:eastAsia="Calibri"/>
+                <w:b w:val="0"/>
+                <w:i w:val="0"/>
+                <w:color w:val="000000"/>
+                <w:sz w:val="20"/>
+              </w:rPr>
+              <w:t>32768</w:t>
+            </w:r>
+          </w:p>
+        </w:tc>
+      </w:tr>
+      <w:tr>
+        <w:tc>
+          <w:tcPr>
+            <w:tcW w:type="dxa" w:w="3216"/>
+          </w:tcPr>
+          <w:p>
+            <w:pPr>
+              <w:jc w:val="right"/>
+            </w:pPr>
+            <w:r>
+              <w:rPr>
+                <w:rFonts w:ascii="Calibri" w:hAnsi="Calibri" w:eastAsia="Calibri"/>
+                <w:b w:val="0"/>
+                <w:i w:val="0"/>
+                <w:color w:val="000000"/>
+                <w:sz w:val="20"/>
+              </w:rPr>
+              <w:t>16</w:t>
+            </w:r>
+          </w:p>
+        </w:tc>
+        <w:tc>
+          <w:tcPr>
+            <w:tcW w:type="dxa" w:w="3216"/>
+          </w:tcPr>
+          <w:p>
+            <w:pPr>
+              <w:jc w:val="right"/>
+            </w:pPr>
+            <w:r>
+              <w:rPr>
+                <w:rFonts w:ascii="Calibri" w:hAnsi="Calibri" w:eastAsia="Calibri"/>
+                <w:b w:val="0"/>
+                <w:i w:val="0"/>
+                <w:color w:val="000000"/>
+                <w:sz w:val="20"/>
+              </w:rPr>
+              <w:t>16</w:t>
+            </w:r>
+          </w:p>
+        </w:tc>
+        <w:tc>
+          <w:tcPr>
+            <w:tcW w:type="dxa" w:w="3216"/>
+          </w:tcPr>
+          <w:p>
+            <w:pPr>
+              <w:jc w:val="right"/>
+            </w:pPr>
+            <w:r>
+              <w:rPr>
+                <w:rFonts w:ascii="Calibri" w:hAnsi="Calibri" w:eastAsia="Calibri"/>
+                <w:b w:val="0"/>
+                <w:i w:val="0"/>
+                <w:color w:val="000000"/>
+                <w:sz w:val="20"/>
+              </w:rPr>
+              <w:t>65536</w:t>
+            </w:r>
+          </w:p>
+        </w:tc>
+      </w:tr>
+      <w:tr>
+        <w:tc>
+          <w:tcPr>
+            <w:tcW w:type="dxa" w:w="3216"/>
+            <w:shd w:val="clear" w:fill="EEF3F8"/>
+          </w:tcPr>
+          <w:p>
+            <w:pPr>
+              <w:jc w:val="right"/>
+            </w:pPr>
+            <w:r>
+              <w:rPr>
+                <w:rFonts w:ascii="Calibri" w:hAnsi="Calibri" w:eastAsia="Calibri"/>
+                <w:b w:val="0"/>
+                <w:i w:val="0"/>
+                <w:color w:val="000000"/>
+                <w:sz w:val="20"/>
+              </w:rPr>
+              <w:t>17</w:t>
+            </w:r>
+          </w:p>
+        </w:tc>
+        <w:tc>
+          <w:tcPr>
+            <w:tcW w:type="dxa" w:w="3216"/>
+            <w:shd w:val="clear" w:fill="EEF3F8"/>
+          </w:tcPr>
+          <w:p>
+            <w:pPr>
+              <w:jc w:val="right"/>
+            </w:pPr>
+            <w:r>
+              <w:rPr>
+                <w:rFonts w:ascii="Calibri" w:hAnsi="Calibri" w:eastAsia="Calibri"/>
+                <w:b w:val="0"/>
+                <w:i w:val="0"/>
+                <w:color w:val="000000"/>
+                <w:sz w:val="20"/>
+              </w:rPr>
+              <w:t>17</w:t>
+            </w:r>
+          </w:p>
+        </w:tc>
+        <w:tc>
+          <w:tcPr>
+            <w:tcW w:type="dxa" w:w="3216"/>
+            <w:shd w:val="clear" w:fill="EEF3F8"/>
+          </w:tcPr>
+          <w:p>
+            <w:pPr>
+              <w:jc w:val="right"/>
+            </w:pPr>
+            <w:r>
+              <w:rPr>
+                <w:rFonts w:ascii="Calibri" w:hAnsi="Calibri" w:eastAsia="Calibri"/>
+                <w:b w:val="0"/>
+                <w:i w:val="0"/>
+                <w:color w:val="000000"/>
+                <w:sz w:val="20"/>
+              </w:rPr>
+              <w:t>131072</w:t>
+            </w:r>
+          </w:p>
+        </w:tc>
+      </w:tr>
+      <w:tr>
+        <w:tc>
+          <w:tcPr>
+            <w:tcW w:type="dxa" w:w="3216"/>
+          </w:tcPr>
+          <w:p>
+            <w:pPr>
+              <w:jc w:val="right"/>
+            </w:pPr>
+            <w:r>
+              <w:rPr>
+                <w:rFonts w:ascii="Calibri" w:hAnsi="Calibri" w:eastAsia="Calibri"/>
+                <w:b w:val="0"/>
+                <w:i w:val="0"/>
+                <w:color w:val="000000"/>
+                <w:sz w:val="20"/>
+              </w:rPr>
+              <w:t>18</w:t>
+            </w:r>
+          </w:p>
+        </w:tc>
+        <w:tc>
+          <w:tcPr>
+            <w:tcW w:type="dxa" w:w="3216"/>
+          </w:tcPr>
+          <w:p>
+            <w:pPr>
+              <w:jc w:val="right"/>
+            </w:pPr>
+            <w:r>
+              <w:rPr>
+                <w:rFonts w:ascii="Calibri" w:hAnsi="Calibri" w:eastAsia="Calibri"/>
+                <w:b w:val="0"/>
+                <w:i w:val="0"/>
+                <w:color w:val="000000"/>
+                <w:sz w:val="20"/>
+              </w:rPr>
+              <w:t>18</w:t>
+            </w:r>
+          </w:p>
+        </w:tc>
+        <w:tc>
+          <w:tcPr>
+            <w:tcW w:type="dxa" w:w="3216"/>
+          </w:tcPr>
+          <w:p>
+            <w:pPr>
+              <w:jc w:val="right"/>
+            </w:pPr>
+            <w:r>
+              <w:rPr>
+                <w:rFonts w:ascii="Calibri" w:hAnsi="Calibri" w:eastAsia="Calibri"/>
+                <w:b w:val="0"/>
+                <w:i w:val="0"/>
+                <w:color w:val="000000"/>
+                <w:sz w:val="20"/>
+              </w:rPr>
+              <w:t>262144</w:t>
+            </w:r>
+          </w:p>
+        </w:tc>
+      </w:tr>
+      <w:tr>
+        <w:tc>
+          <w:tcPr>
+            <w:tcW w:type="dxa" w:w="3216"/>
+            <w:shd w:val="clear" w:fill="EEF3F8"/>
+          </w:tcPr>
+          <w:p>
+            <w:pPr>
+              <w:jc w:val="right"/>
+            </w:pPr>
+            <w:r>
+              <w:rPr>
+                <w:rFonts w:ascii="Calibri" w:hAnsi="Calibri" w:eastAsia="Calibri"/>
+                <w:b w:val="0"/>
+                <w:i w:val="0"/>
+                <w:color w:val="000000"/>
+                <w:sz w:val="20"/>
+              </w:rPr>
+              <w:t>19</w:t>
+            </w:r>
+          </w:p>
+        </w:tc>
+        <w:tc>
+          <w:tcPr>
+            <w:tcW w:type="dxa" w:w="3216"/>
+            <w:shd w:val="clear" w:fill="EEF3F8"/>
+          </w:tcPr>
+          <w:p>
+            <w:pPr>
+              <w:jc w:val="right"/>
+            </w:pPr>
+            <w:r>
+              <w:rPr>
+                <w:rFonts w:ascii="Calibri" w:hAnsi="Calibri" w:eastAsia="Calibri"/>
+                <w:b w:val="0"/>
+                <w:i w:val="0"/>
+                <w:color w:val="000000"/>
+                <w:sz w:val="20"/>
+              </w:rPr>
+              <w:t>19</w:t>
+            </w:r>
+          </w:p>
+        </w:tc>
+        <w:tc>
+          <w:tcPr>
+            <w:tcW w:type="dxa" w:w="3216"/>
+            <w:shd w:val="clear" w:fill="EEF3F8"/>
+          </w:tcPr>
+          <w:p>
+            <w:pPr>
+              <w:jc w:val="right"/>
+            </w:pPr>
+            <w:r>
+              <w:rPr>
+                <w:rFonts w:ascii="Calibri" w:hAnsi="Calibri" w:eastAsia="Calibri"/>
+                <w:b w:val="0"/>
+                <w:i w:val="0"/>
+                <w:color w:val="000000"/>
+                <w:sz w:val="20"/>
+              </w:rPr>
+              <w:t>524288</w:t>
+            </w:r>
+          </w:p>
+        </w:tc>
+      </w:tr>
+      <w:tr>
+        <w:tc>
+          <w:tcPr>
+            <w:tcW w:type="dxa" w:w="3216"/>
+          </w:tcPr>
+          <w:p>
+            <w:pPr>
+              <w:jc w:val="right"/>
+            </w:pPr>
+            <w:r>
+              <w:rPr>
+                <w:rFonts w:ascii="Calibri" w:hAnsi="Calibri" w:eastAsia="Calibri"/>
+                <w:b w:val="0"/>
+                <w:i w:val="0"/>
+                <w:color w:val="000000"/>
+                <w:sz w:val="20"/>
+              </w:rPr>
+              <w:t>20</w:t>
+            </w:r>
+          </w:p>
+        </w:tc>
+        <w:tc>
+          <w:tcPr>
+            <w:tcW w:type="dxa" w:w="3216"/>
+          </w:tcPr>
+          <w:p>
+            <w:pPr>
+              <w:jc w:val="right"/>
+            </w:pPr>
+            <w:r>
+              <w:rPr>
+                <w:rFonts w:ascii="Calibri" w:hAnsi="Calibri" w:eastAsia="Calibri"/>
+                <w:b w:val="0"/>
+                <w:i w:val="0"/>
+                <w:color w:val="000000"/>
+                <w:sz w:val="20"/>
+              </w:rPr>
+              <w:t>20</w:t>
+            </w:r>
+          </w:p>
+        </w:tc>
+        <w:tc>
+          <w:tcPr>
+            <w:tcW w:type="dxa" w:w="3216"/>
+          </w:tcPr>
+          <w:p>
+            <w:pPr>
+              <w:jc w:val="right"/>
+            </w:pPr>
+            <w:r>
+              <w:rPr>
+                <w:rFonts w:ascii="Calibri" w:hAnsi="Calibri" w:eastAsia="Calibri"/>
+                <w:b w:val="0"/>
+                <w:i w:val="0"/>
+                <w:color w:val="000000"/>
+                <w:sz w:val="20"/>
+              </w:rPr>
+              <w:t>1048576</w:t>
+            </w:r>
+          </w:p>
+        </w:tc>
+      </w:tr>
+      <w:tr>
+        <w:tc>
+          <w:tcPr>
+            <w:tcW w:type="dxa" w:w="3216"/>
+            <w:shd w:val="clear" w:fill="EEF3F8"/>
+          </w:tcPr>
+          <w:p>
+            <w:pPr>
+              <w:jc w:val="right"/>
+            </w:pPr>
+            <w:r>
+              <w:rPr>
+                <w:rFonts w:ascii="Calibri" w:hAnsi="Calibri" w:eastAsia="Calibri"/>
+                <w:b w:val="0"/>
+                <w:i w:val="0"/>
+                <w:color w:val="000000"/>
+                <w:sz w:val="20"/>
+              </w:rPr>
+              <w:t>21</w:t>
+            </w:r>
+          </w:p>
+        </w:tc>
+        <w:tc>
+          <w:tcPr>
+            <w:tcW w:type="dxa" w:w="3216"/>
+            <w:shd w:val="clear" w:fill="EEF3F8"/>
+          </w:tcPr>
+          <w:p>
+            <w:pPr>
+              <w:jc w:val="right"/>
+            </w:pPr>
+            <w:r>
+              <w:rPr>
+                <w:rFonts w:ascii="Calibri" w:hAnsi="Calibri" w:eastAsia="Calibri"/>
+                <w:b w:val="0"/>
+                <w:i w:val="0"/>
+                <w:color w:val="000000"/>
+                <w:sz w:val="20"/>
+              </w:rPr>
+              <w:t>21</w:t>
+            </w:r>
+          </w:p>
+        </w:tc>
+        <w:tc>
+          <w:tcPr>
+            <w:tcW w:type="dxa" w:w="3216"/>
+            <w:shd w:val="clear" w:fill="EEF3F8"/>
+          </w:tcPr>
+          <w:p>
+            <w:pPr>
+              <w:jc w:val="right"/>
+            </w:pPr>
+            <w:r>
+              <w:rPr>
+                <w:rFonts w:ascii="Calibri" w:hAnsi="Calibri" w:eastAsia="Calibri"/>
+                <w:b w:val="0"/>
+                <w:i w:val="0"/>
+                <w:color w:val="000000"/>
+                <w:sz w:val="20"/>
+              </w:rPr>
+              <w:t>2097152</w:t>
+            </w:r>
+          </w:p>
+        </w:tc>
+      </w:tr>
+      <w:tr>
+        <w:tc>
+          <w:tcPr>
+            <w:tcW w:type="dxa" w:w="3216"/>
+          </w:tcPr>
+          <w:p>
+            <w:pPr>
+              <w:jc w:val="right"/>
+            </w:pPr>
+            <w:r>
+              <w:rPr>
+                <w:rFonts w:ascii="Calibri" w:hAnsi="Calibri" w:eastAsia="Calibri"/>
+                <w:b w:val="0"/>
+                <w:i w:val="0"/>
+                <w:color w:val="000000"/>
+                <w:sz w:val="20"/>
+              </w:rPr>
+              <w:t>22</w:t>
+            </w:r>
+          </w:p>
+        </w:tc>
+        <w:tc>
+          <w:tcPr>
+            <w:tcW w:type="dxa" w:w="3216"/>
+          </w:tcPr>
+          <w:p>
+            <w:pPr>
+              <w:jc w:val="right"/>
+            </w:pPr>
+            <w:r>
+              <w:rPr>
+                <w:rFonts w:ascii="Calibri" w:hAnsi="Calibri" w:eastAsia="Calibri"/>
+                <w:b w:val="0"/>
+                <w:i w:val="0"/>
+                <w:color w:val="000000"/>
+                <w:sz w:val="20"/>
+              </w:rPr>
+              <w:t>22</w:t>
+            </w:r>
+          </w:p>
+        </w:tc>
+        <w:tc>
+          <w:tcPr>
+            <w:tcW w:type="dxa" w:w="3216"/>
+          </w:tcPr>
+          <w:p>
+            <w:pPr>
+              <w:jc w:val="right"/>
+            </w:pPr>
+            <w:r>
+              <w:rPr>
+                <w:rFonts w:ascii="Calibri" w:hAnsi="Calibri" w:eastAsia="Calibri"/>
+                <w:b w:val="0"/>
+                <w:i w:val="0"/>
+                <w:color w:val="000000"/>
+                <w:sz w:val="20"/>
+              </w:rPr>
+              <w:t>4194304</w:t>
+            </w:r>
+          </w:p>
+        </w:tc>
+      </w:tr>
+      <w:tr>
+        <w:tc>
+          <w:tcPr>
+            <w:tcW w:type="dxa" w:w="3216"/>
+            <w:shd w:val="clear" w:fill="EEF3F8"/>
+          </w:tcPr>
+          <w:p>
+            <w:pPr>
+              <w:jc w:val="right"/>
+            </w:pPr>
+            <w:r>
+              <w:rPr>
+                <w:rFonts w:ascii="Calibri" w:hAnsi="Calibri" w:eastAsia="Calibri"/>
+                <w:b w:val="0"/>
+                <w:i w:val="0"/>
+                <w:color w:val="000000"/>
+                <w:sz w:val="20"/>
+              </w:rPr>
+              <w:t>23</w:t>
+            </w:r>
+          </w:p>
+        </w:tc>
+        <w:tc>
+          <w:tcPr>
+            <w:tcW w:type="dxa" w:w="3216"/>
+            <w:shd w:val="clear" w:fill="EEF3F8"/>
+          </w:tcPr>
+          <w:p>
+            <w:pPr>
+              <w:jc w:val="right"/>
+            </w:pPr>
+            <w:r>
+              <w:rPr>
+                <w:rFonts w:ascii="Calibri" w:hAnsi="Calibri" w:eastAsia="Calibri"/>
+                <w:b w:val="0"/>
+                <w:i w:val="0"/>
+                <w:color w:val="000000"/>
+                <w:sz w:val="20"/>
+              </w:rPr>
+              <w:t>23</w:t>
+            </w:r>
+          </w:p>
+        </w:tc>
+        <w:tc>
+          <w:tcPr>
+            <w:tcW w:type="dxa" w:w="3216"/>
+            <w:shd w:val="clear" w:fill="EEF3F8"/>
+          </w:tcPr>
+          <w:p>
+            <w:pPr>
+              <w:jc w:val="right"/>
+            </w:pPr>
+            <w:r>
+              <w:rPr>
+                <w:rFonts w:ascii="Calibri" w:hAnsi="Calibri" w:eastAsia="Calibri"/>
+                <w:b w:val="0"/>
+                <w:i w:val="0"/>
+                <w:color w:val="000000"/>
+                <w:sz w:val="20"/>
+              </w:rPr>
+              <w:t>8388608</w:t>
+            </w:r>
+          </w:p>
+        </w:tc>
+      </w:tr>
+      <w:tr>
+        <w:tc>
+          <w:tcPr>
+            <w:tcW w:type="dxa" w:w="3216"/>
+          </w:tcPr>
+          <w:p>
+            <w:pPr>
+              <w:jc w:val="right"/>
+            </w:pPr>
+            <w:r>
+              <w:rPr>
+                <w:rFonts w:ascii="Calibri" w:hAnsi="Calibri" w:eastAsia="Calibri"/>
+                <w:b w:val="0"/>
+                <w:i w:val="0"/>
+                <w:color w:val="000000"/>
+                <w:sz w:val="20"/>
+              </w:rPr>
+              <w:t>24</w:t>
+            </w:r>
+          </w:p>
+        </w:tc>
+        <w:tc>
+          <w:tcPr>
+            <w:tcW w:type="dxa" w:w="3216"/>
+          </w:tcPr>
+          <w:p>
+            <w:pPr>
+              <w:jc w:val="right"/>
+            </w:pPr>
+            <w:r>
+              <w:rPr>
+                <w:rFonts w:ascii="Calibri" w:hAnsi="Calibri" w:eastAsia="Calibri"/>
+                <w:b w:val="0"/>
+                <w:i w:val="0"/>
+                <w:color w:val="000000"/>
+                <w:sz w:val="20"/>
+              </w:rPr>
+              <w:t>24</w:t>
+            </w:r>
+          </w:p>
+        </w:tc>
+        <w:tc>
+          <w:tcPr>
+            <w:tcW w:type="dxa" w:w="3216"/>
+          </w:tcPr>
+          <w:p>
+            <w:pPr>
+              <w:jc w:val="right"/>
+            </w:pPr>
+            <w:r>
+              <w:rPr>
+                <w:rFonts w:ascii="Calibri" w:hAnsi="Calibri" w:eastAsia="Calibri"/>
+                <w:b w:val="0"/>
+                <w:i w:val="0"/>
+                <w:color w:val="000000"/>
+                <w:sz w:val="20"/>
+              </w:rPr>
+              <w:t>16777216</w:t>
+            </w:r>
+          </w:p>
+        </w:tc>
+      </w:tr>
+      <w:tr>
+        <w:tc>
+          <w:tcPr>
+            <w:tcW w:type="dxa" w:w="3216"/>
+            <w:shd w:val="clear" w:fill="EEF3F8"/>
+          </w:tcPr>
+          <w:p>
+            <w:pPr>
+              <w:jc w:val="right"/>
+            </w:pPr>
+            <w:r>
+              <w:rPr>
+                <w:rFonts w:ascii="Calibri" w:hAnsi="Calibri" w:eastAsia="Calibri"/>
+                <w:b w:val="0"/>
+                <w:i w:val="0"/>
+                <w:color w:val="000000"/>
+                <w:sz w:val="20"/>
+              </w:rPr>
+              <w:t>25</w:t>
+            </w:r>
+          </w:p>
+        </w:tc>
+        <w:tc>
+          <w:tcPr>
+            <w:tcW w:type="dxa" w:w="3216"/>
+            <w:shd w:val="clear" w:fill="EEF3F8"/>
+          </w:tcPr>
+          <w:p>
+            <w:pPr>
+              <w:jc w:val="right"/>
+            </w:pPr>
+            <w:r>
+              <w:rPr>
+                <w:rFonts w:ascii="Calibri" w:hAnsi="Calibri" w:eastAsia="Calibri"/>
+                <w:b w:val="0"/>
+                <w:i w:val="0"/>
+                <w:color w:val="000000"/>
+                <w:sz w:val="20"/>
+              </w:rPr>
+              <w:t>25</w:t>
+            </w:r>
+          </w:p>
+        </w:tc>
+        <w:tc>
+          <w:tcPr>
+            <w:tcW w:type="dxa" w:w="3216"/>
+            <w:shd w:val="clear" w:fill="EEF3F8"/>
+          </w:tcPr>
+          <w:p>
+            <w:pPr>
+              <w:jc w:val="right"/>
+            </w:pPr>
+            <w:r>
+              <w:rPr>
+                <w:rFonts w:ascii="Calibri" w:hAnsi="Calibri" w:eastAsia="Calibri"/>
+                <w:b w:val="0"/>
+                <w:i w:val="0"/>
+                <w:color w:val="000000"/>
+                <w:sz w:val="20"/>
+              </w:rPr>
+              <w:t>33554432</w:t>
+            </w:r>
+          </w:p>
+        </w:tc>
+      </w:tr>
+      <w:tr>
+        <w:tc>
+          <w:tcPr>
+            <w:tcW w:type="dxa" w:w="3216"/>
+          </w:tcPr>
+          <w:p>
+            <w:pPr>
+              <w:jc w:val="right"/>
+            </w:pPr>
+            <w:r>
+              <w:rPr>
+                <w:rFonts w:ascii="Calibri" w:hAnsi="Calibri" w:eastAsia="Calibri"/>
+                <w:b w:val="0"/>
+                <w:i w:val="0"/>
+                <w:color w:val="000000"/>
+                <w:sz w:val="20"/>
+              </w:rPr>
+              <w:t>26</w:t>
+            </w:r>
+          </w:p>
+        </w:tc>
+        <w:tc>
+          <w:tcPr>
+            <w:tcW w:type="dxa" w:w="3216"/>
+          </w:tcPr>
+          <w:p>
+            <w:pPr>
+              <w:jc w:val="right"/>
+            </w:pPr>
+            <w:r>
+              <w:rPr>
+                <w:rFonts w:ascii="Calibri" w:hAnsi="Calibri" w:eastAsia="Calibri"/>
+                <w:b w:val="0"/>
+                <w:i w:val="0"/>
+                <w:color w:val="000000"/>
+                <w:sz w:val="20"/>
+              </w:rPr>
+              <w:t>26</w:t>
+            </w:r>
+          </w:p>
+        </w:tc>
+        <w:tc>
+          <w:tcPr>
+            <w:tcW w:type="dxa" w:w="3216"/>
+          </w:tcPr>
+          <w:p>
+            <w:pPr>
+              <w:jc w:val="right"/>
+            </w:pPr>
+            <w:r>
+              <w:rPr>
+                <w:rFonts w:ascii="Calibri" w:hAnsi="Calibri" w:eastAsia="Calibri"/>
+                <w:b w:val="0"/>
+                <w:i w:val="0"/>
+                <w:color w:val="000000"/>
+                <w:sz w:val="20"/>
+              </w:rPr>
+              <w:t>67108864</w:t>
+            </w:r>
+          </w:p>
+        </w:tc>
+      </w:tr>
+      <w:tr>
+        <w:tc>
+          <w:tcPr>
+            <w:tcW w:type="dxa" w:w="3216"/>
+            <w:shd w:val="clear" w:fill="EEF3F8"/>
+          </w:tcPr>
+          <w:p>
+            <w:pPr>
+              <w:jc w:val="right"/>
+            </w:pPr>
+            <w:r>
+              <w:rPr>
+                <w:rFonts w:ascii="Calibri" w:hAnsi="Calibri" w:eastAsia="Calibri"/>
+                <w:b w:val="0"/>
+                <w:i w:val="0"/>
+                <w:color w:val="000000"/>
+                <w:sz w:val="20"/>
+              </w:rPr>
+              <w:t>27</w:t>
+            </w:r>
+          </w:p>
+        </w:tc>
+        <w:tc>
+          <w:tcPr>
+            <w:tcW w:type="dxa" w:w="3216"/>
+            <w:shd w:val="clear" w:fill="EEF3F8"/>
+          </w:tcPr>
+          <w:p>
+            <w:pPr>
+              <w:jc w:val="right"/>
+            </w:pPr>
+            <w:r>
+              <w:rPr>
+                <w:rFonts w:ascii="Calibri" w:hAnsi="Calibri" w:eastAsia="Calibri"/>
+                <w:b w:val="0"/>
+                <w:i w:val="0"/>
+                <w:color w:val="000000"/>
+                <w:sz w:val="20"/>
+              </w:rPr>
+              <w:t>27</w:t>
+            </w:r>
+          </w:p>
+        </w:tc>
+        <w:tc>
+          <w:tcPr>
+            <w:tcW w:type="dxa" w:w="3216"/>
+            <w:shd w:val="clear" w:fill="EEF3F8"/>
+          </w:tcPr>
+          <w:p>
+            <w:pPr>
+              <w:jc w:val="right"/>
+            </w:pPr>
+            <w:r>
+              <w:rPr>
+                <w:rFonts w:ascii="Calibri" w:hAnsi="Calibri" w:eastAsia="Calibri"/>
+                <w:b w:val="0"/>
+                <w:i w:val="0"/>
+                <w:color w:val="000000"/>
+                <w:sz w:val="20"/>
+              </w:rPr>
+              <w:t>134217728</w:t>
+            </w:r>
+          </w:p>
+        </w:tc>
+      </w:tr>
+      <w:tr>
+        <w:tc>
+          <w:tcPr>
+            <w:tcW w:type="dxa" w:w="3216"/>
+          </w:tcPr>
+          <w:p>
+            <w:pPr>
+              <w:jc w:val="right"/>
+            </w:pPr>
+            <w:r>
+              <w:rPr>
+                <w:rFonts w:ascii="Calibri" w:hAnsi="Calibri" w:eastAsia="Calibri"/>
+                <w:b w:val="0"/>
+                <w:i w:val="0"/>
+                <w:color w:val="000000"/>
+                <w:sz w:val="20"/>
+              </w:rPr>
+              <w:t>28</w:t>
+            </w:r>
+          </w:p>
+        </w:tc>
+        <w:tc>
+          <w:tcPr>
+            <w:tcW w:type="dxa" w:w="3216"/>
+          </w:tcPr>
+          <w:p>
+            <w:pPr>
+              <w:jc w:val="right"/>
+            </w:pPr>
+            <w:r>
+              <w:rPr>
+                <w:rFonts w:ascii="Calibri" w:hAnsi="Calibri" w:eastAsia="Calibri"/>
+                <w:b w:val="0"/>
+                <w:i w:val="0"/>
+                <w:color w:val="000000"/>
+                <w:sz w:val="20"/>
+              </w:rPr>
+              <w:t>28</w:t>
+            </w:r>
+          </w:p>
+        </w:tc>
+        <w:tc>
+          <w:tcPr>
+            <w:tcW w:type="dxa" w:w="3216"/>
+          </w:tcPr>
+          <w:p>
+            <w:pPr>
+              <w:jc w:val="right"/>
+            </w:pPr>
+            <w:r>
+              <w:rPr>
+                <w:rFonts w:ascii="Calibri" w:hAnsi="Calibri" w:eastAsia="Calibri"/>
+                <w:b w:val="0"/>
+                <w:i w:val="0"/>
+                <w:color w:val="000000"/>
+                <w:sz w:val="20"/>
+              </w:rPr>
+              <w:t>268435456</w:t>
+            </w:r>
+          </w:p>
+        </w:tc>
+      </w:tr>
+      <w:tr>
+        <w:tc>
+          <w:tcPr>
+            <w:tcW w:type="dxa" w:w="3216"/>
+            <w:shd w:val="clear" w:fill="EEF3F8"/>
+          </w:tcPr>
+          <w:p>
+            <w:pPr>
+              <w:jc w:val="right"/>
+            </w:pPr>
+            <w:r>
+              <w:rPr>
+                <w:rFonts w:ascii="Calibri" w:hAnsi="Calibri" w:eastAsia="Calibri"/>
+                <w:b w:val="0"/>
+                <w:i w:val="0"/>
+                <w:color w:val="000000"/>
+                <w:sz w:val="20"/>
+              </w:rPr>
+              <w:t>29</w:t>
+            </w:r>
+          </w:p>
+        </w:tc>
+        <w:tc>
+          <w:tcPr>
+            <w:tcW w:type="dxa" w:w="3216"/>
+            <w:shd w:val="clear" w:fill="EEF3F8"/>
+          </w:tcPr>
+          <w:p>
+            <w:pPr>
+              <w:jc w:val="right"/>
+            </w:pPr>
+            <w:r>
+              <w:rPr>
+                <w:rFonts w:ascii="Calibri" w:hAnsi="Calibri" w:eastAsia="Calibri"/>
+                <w:b w:val="0"/>
+                <w:i w:val="0"/>
+                <w:color w:val="000000"/>
+                <w:sz w:val="20"/>
+              </w:rPr>
+              <w:t>29</w:t>
+            </w:r>
+          </w:p>
+        </w:tc>
+        <w:tc>
+          <w:tcPr>
+            <w:tcW w:type="dxa" w:w="3216"/>
+            <w:shd w:val="clear" w:fill="EEF3F8"/>
+          </w:tcPr>
+          <w:p>
+            <w:pPr>
+              <w:jc w:val="right"/>
+            </w:pPr>
+            <w:r>
+              <w:rPr>
+                <w:rFonts w:ascii="Calibri" w:hAnsi="Calibri" w:eastAsia="Calibri"/>
+                <w:b w:val="0"/>
+                <w:i w:val="0"/>
+                <w:color w:val="000000"/>
+                <w:sz w:val="20"/>
+              </w:rPr>
+              <w:t>536870912</w:t>
+            </w:r>
+          </w:p>
+        </w:tc>
+      </w:tr>
+      <w:tr>
+        <w:tc>
+          <w:tcPr>
+            <w:tcW w:type="dxa" w:w="3216"/>
+          </w:tcPr>
+          <w:p>
+            <w:pPr>
+              <w:jc w:val="right"/>
+            </w:pPr>
+            <w:r>
+              <w:rPr>
+                <w:rFonts w:ascii="Calibri" w:hAnsi="Calibri" w:eastAsia="Calibri"/>
+                <w:b w:val="0"/>
+                <w:i w:val="0"/>
+                <w:color w:val="000000"/>
+                <w:sz w:val="20"/>
+              </w:rPr>
+              <w:t>30</w:t>
+            </w:r>
+          </w:p>
+        </w:tc>
+        <w:tc>
+          <w:tcPr>
+            <w:tcW w:type="dxa" w:w="3216"/>
+          </w:tcPr>
+          <w:p>
+            <w:pPr>
+              <w:jc w:val="right"/>
+            </w:pPr>
+            <w:r>
+              <w:rPr>
+                <w:rFonts w:ascii="Calibri" w:hAnsi="Calibri" w:eastAsia="Calibri"/>
+                <w:b w:val="0"/>
+                <w:i w:val="0"/>
+                <w:color w:val="000000"/>
+                <w:sz w:val="20"/>
+              </w:rPr>
+              <w:t>30</w:t>
+            </w:r>
+          </w:p>
+        </w:tc>
+        <w:tc>
+          <w:tcPr>
+            <w:tcW w:type="dxa" w:w="3216"/>
+          </w:tcPr>
+          <w:p>
+            <w:pPr>
+              <w:jc w:val="right"/>
+            </w:pPr>
+            <w:r>
+              <w:rPr>
+                <w:rFonts w:ascii="Calibri" w:hAnsi="Calibri" w:eastAsia="Calibri"/>
+                <w:b w:val="0"/>
+                <w:i w:val="0"/>
+                <w:color w:val="000000"/>
+                <w:sz w:val="20"/>
+              </w:rPr>
+              <w:t>1073741824</w:t>
+            </w:r>
+          </w:p>
+        </w:tc>
+      </w:tr>
+      <w:tr>
+        <w:tc>
+          <w:tcPr>
+            <w:tcW w:type="dxa" w:w="3216"/>
+            <w:shd w:val="clear" w:fill="EEF3F8"/>
+          </w:tcPr>
+          <w:p>
+            <w:pPr>
+              <w:jc w:val="right"/>
+            </w:pPr>
+            <w:r>
+              <w:rPr>
+                <w:rFonts w:ascii="Calibri" w:hAnsi="Calibri" w:eastAsia="Calibri"/>
+                <w:b w:val="0"/>
+                <w:i w:val="0"/>
+                <w:color w:val="000000"/>
+                <w:sz w:val="20"/>
+              </w:rPr>
+              <w:t>31</w:t>
+            </w:r>
+          </w:p>
+        </w:tc>
+        <w:tc>
+          <w:tcPr>
+            <w:tcW w:type="dxa" w:w="3216"/>
+            <w:shd w:val="clear" w:fill="EEF3F8"/>
+          </w:tcPr>
+          <w:p>
+            <w:pPr>
+              <w:jc w:val="right"/>
+            </w:pPr>
+            <w:r>
+              <w:rPr>
+                <w:rFonts w:ascii="Calibri" w:hAnsi="Calibri" w:eastAsia="Calibri"/>
+                <w:b w:val="0"/>
+                <w:i w:val="0"/>
+                <w:color w:val="000000"/>
+                <w:sz w:val="20"/>
+              </w:rPr>
+              <w:t>31</w:t>
+            </w:r>
+          </w:p>
+        </w:tc>
+        <w:tc>
+          <w:tcPr>
+            <w:tcW w:type="dxa" w:w="3216"/>
+            <w:shd w:val="clear" w:fill="EEF3F8"/>
+          </w:tcPr>
+          <w:p>
+            <w:pPr>
+              <w:jc w:val="right"/>
+            </w:pPr>
+            <w:r>
+              <w:rPr>
+                <w:rFonts w:ascii="Calibri" w:hAnsi="Calibri" w:eastAsia="Calibri"/>
+                <w:b w:val="0"/>
+                <w:i w:val="0"/>
+                <w:color w:val="000000"/>
+                <w:sz w:val="20"/>
+              </w:rPr>
+              <w:t>2147483648</w:t>
             </w:r>
           </w:p>
         </w:tc>
       </w:tr>
     </w:tbl>
+    <w:p>
+      <w:pPr>
+        <w:pStyle w:val="Normal"/>
+      </w:pPr>
+      <w:r>
+        <w:rPr>
+          <w:rFonts w:ascii="Calibri" w:hAnsi="Calibri" w:eastAsia="Calibri"/>
+          <w:sz w:val="22"/>
+        </w:rPr>
+        <w:t xml:space="preserve">The payload stores this as a signed 32-bit </w:t>
+      </w:r>
+      <w:r>
+        <w:rPr>
+          <w:rFonts w:ascii="Consolas" w:hAnsi="Consolas" w:eastAsia="Consolas"/>
+          <w:sz w:val="20"/>
+        </w:rPr>
+        <w:t>long</w:t>
+      </w:r>
+      <w:r>
+        <w:rPr>
+          <w:rFonts w:ascii="Calibri" w:hAnsi="Calibri" w:eastAsia="Calibri"/>
+          <w:sz w:val="22"/>
+        </w:rPr>
+        <w:t>. If channel 31 is on, a signed display of the raw number is negative (</w:t>
+      </w:r>
+      <w:r>
+        <w:rPr>
+          <w:rFonts w:ascii="Consolas" w:hAnsi="Consolas" w:eastAsia="Consolas"/>
+          <w:sz w:val="20"/>
+        </w:rPr>
+        <w:t>-2147483648</w:t>
+      </w:r>
+      <w:r>
+        <w:rPr>
+          <w:rFonts w:ascii="Calibri" w:hAnsi="Calibri" w:eastAsia="Calibri"/>
+          <w:sz w:val="22"/>
+        </w:rPr>
+        <w:t xml:space="preserve"> when only bit 31 is set). Decode with unsigned 32-bit masking when possible: channel </w:t>
+      </w:r>
+      <w:r>
+        <w:rPr>
+          <w:rFonts w:ascii="Consolas" w:hAnsi="Consolas" w:eastAsia="Consolas"/>
+          <w:sz w:val="20"/>
+        </w:rPr>
+        <w:t>n</w:t>
+      </w:r>
+      <w:r>
+        <w:rPr>
+          <w:rFonts w:ascii="Calibri" w:hAnsi="Calibri" w:eastAsia="Calibri"/>
+          <w:sz w:val="22"/>
+        </w:rPr>
+        <w:t xml:space="preserve"> is on when </w:t>
+      </w:r>
+      <w:r>
+        <w:rPr>
+          <w:rFonts w:ascii="Consolas" w:hAnsi="Consolas" w:eastAsia="Consolas"/>
+          <w:sz w:val="20"/>
+        </w:rPr>
+        <w:t>(value &amp; bit_weight) != 0</w:t>
+      </w:r>
+      <w:r>
+        <w:rPr>
+          <w:rFonts w:ascii="Calibri" w:hAnsi="Calibri" w:eastAsia="Calibri"/>
+          <w:sz w:val="22"/>
+        </w:rPr>
+        <w:t>.</w:t>
+      </w:r>
+    </w:p>
+    <w:p>
+      <w:pPr>
+        <w:pStyle w:val="Normal"/>
+      </w:pPr>
+      <w:r>
+        <w:rPr>
+          <w:rFonts w:ascii="Calibri" w:hAnsi="Calibri" w:eastAsia="Calibri"/>
+          <w:sz w:val="22"/>
+        </w:rPr>
+        <w:t xml:space="preserve">To calculate an expected value, add the bit weights of the lamps that are currently on for that thruster. Unused or unconfigured channels stay </w:t>
+      </w:r>
+      <w:r>
+        <w:rPr>
+          <w:rFonts w:ascii="Consolas" w:hAnsi="Consolas" w:eastAsia="Consolas"/>
+          <w:sz w:val="20"/>
+        </w:rPr>
+        <w:t>0</w:t>
+      </w:r>
+      <w:r>
+        <w:rPr>
+          <w:rFonts w:ascii="Calibri" w:hAnsi="Calibri" w:eastAsia="Calibri"/>
+          <w:sz w:val="22"/>
+        </w:rPr>
+        <w:t xml:space="preserve">. Lamp names are not in the payload; map channel </w:t>
+      </w:r>
+      <w:r>
+        <w:rPr>
+          <w:rFonts w:ascii="Consolas" w:hAnsi="Consolas" w:eastAsia="Consolas"/>
+          <w:sz w:val="20"/>
+        </w:rPr>
+        <w:t>n</w:t>
+      </w:r>
+      <w:r>
+        <w:rPr>
+          <w:rFonts w:ascii="Calibri" w:hAnsi="Calibri" w:eastAsia="Calibri"/>
+          <w:sz w:val="22"/>
+        </w:rPr>
+        <w:t xml:space="preserve"> for thruster </w:t>
+      </w:r>
+      <w:r>
+        <w:rPr>
+          <w:rFonts w:ascii="Consolas" w:hAnsi="Consolas" w:eastAsia="Consolas"/>
+          <w:sz w:val="20"/>
+        </w:rPr>
+        <w:t>i</w:t>
+      </w:r>
+      <w:r>
+        <w:rPr>
+          <w:rFonts w:ascii="Calibri" w:hAnsi="Calibri" w:eastAsia="Calibri"/>
+          <w:sz w:val="22"/>
+        </w:rPr>
+        <w:t xml:space="preserve"> from that vessel's </w:t>
+      </w:r>
+      <w:r>
+        <w:rPr>
+          <w:rFonts w:ascii="Consolas" w:hAnsi="Consolas" w:eastAsia="Consolas"/>
+          <w:sz w:val="20"/>
+        </w:rPr>
+        <w:t>TCSView.ini</w:t>
+      </w:r>
+      <w:r>
+        <w:rPr>
+          <w:rFonts w:ascii="Calibri" w:hAnsi="Calibri" w:eastAsia="Calibri"/>
+          <w:sz w:val="22"/>
+        </w:rPr>
+        <w:t xml:space="preserve"> / TCS GUI config.</w:t>
+      </w:r>
+    </w:p>
+    <w:p>
+      <w:pPr>
+        <w:pStyle w:val="Normal"/>
+      </w:pPr>
+      <w:r>
+        <w:rPr>
+          <w:rFonts w:ascii="Calibri" w:hAnsi="Calibri" w:eastAsia="Calibri"/>
+          <w:sz w:val="22"/>
+        </w:rPr>
+        <w:t>Examples:</w:t>
+      </w:r>
+    </w:p>
+    <w:p>
+      <w:pPr>
+        <w:pStyle w:val="ListBullet"/>
+      </w:pPr>
+      <w:r>
+        <w:rPr>
+          <w:rFonts w:ascii="Calibri" w:hAnsi="Calibri" w:eastAsia="Calibri"/>
+          <w:sz w:val="22"/>
+        </w:rPr>
+        <w:t xml:space="preserve">No lamps on -&gt; </w:t>
+      </w:r>
+      <w:r>
+        <w:rPr>
+          <w:rFonts w:ascii="Consolas" w:hAnsi="Consolas" w:eastAsia="Consolas"/>
+          <w:sz w:val="20"/>
+        </w:rPr>
+        <w:t>0</w:t>
+      </w:r>
+    </w:p>
+    <w:p>
+      <w:pPr>
+        <w:pStyle w:val="ListBullet"/>
+      </w:pPr>
+      <w:r>
+        <w:rPr>
+          <w:rFonts w:ascii="Calibri" w:hAnsi="Calibri" w:eastAsia="Calibri"/>
+          <w:sz w:val="22"/>
+        </w:rPr>
+        <w:t xml:space="preserve">Only channel 0 on -&gt; </w:t>
+      </w:r>
+      <w:r>
+        <w:rPr>
+          <w:rFonts w:ascii="Consolas" w:hAnsi="Consolas" w:eastAsia="Consolas"/>
+          <w:sz w:val="20"/>
+        </w:rPr>
+        <w:t>1</w:t>
+      </w:r>
+    </w:p>
+    <w:p>
+      <w:pPr>
+        <w:pStyle w:val="ListBullet"/>
+      </w:pPr>
+      <w:r>
+        <w:rPr>
+          <w:rFonts w:ascii="Calibri" w:hAnsi="Calibri" w:eastAsia="Calibri"/>
+          <w:sz w:val="22"/>
+        </w:rPr>
+        <w:t xml:space="preserve">Channels 0 and 2 on -&gt; </w:t>
+      </w:r>
+      <w:r>
+        <w:rPr>
+          <w:rFonts w:ascii="Consolas" w:hAnsi="Consolas" w:eastAsia="Consolas"/>
+          <w:sz w:val="20"/>
+        </w:rPr>
+        <w:t>1 + 4 = 5</w:t>
+      </w:r>
+    </w:p>
+    <w:p>
+      <w:pPr>
+        <w:pStyle w:val="ListBullet"/>
+      </w:pPr>
+      <w:r>
+        <w:rPr>
+          <w:rFonts w:ascii="Calibri" w:hAnsi="Calibri" w:eastAsia="Calibri"/>
+          <w:sz w:val="22"/>
+        </w:rPr>
+        <w:t xml:space="preserve">Channels 0, 1, and 4 on -&gt; </w:t>
+      </w:r>
+      <w:r>
+        <w:rPr>
+          <w:rFonts w:ascii="Consolas" w:hAnsi="Consolas" w:eastAsia="Consolas"/>
+          <w:sz w:val="20"/>
+        </w:rPr>
+        <w:t>1 + 2 + 16 = 19</w:t>
+      </w:r>
+    </w:p>
+    <w:p>
+      <w:pPr>
+        <w:pStyle w:val="ListBullet"/>
+      </w:pPr>
+      <w:r>
+        <w:rPr>
+          <w:rFonts w:ascii="Calibri" w:hAnsi="Calibri" w:eastAsia="Calibri"/>
+          <w:sz w:val="22"/>
+        </w:rPr>
+        <w:t xml:space="preserve">Only channel 31 on -&gt; unsigned </w:t>
+      </w:r>
+      <w:r>
+        <w:rPr>
+          <w:rFonts w:ascii="Consolas" w:hAnsi="Consolas" w:eastAsia="Consolas"/>
+          <w:sz w:val="20"/>
+        </w:rPr>
+        <w:t>2147483648</w:t>
+      </w:r>
+      <w:r>
+        <w:rPr>
+          <w:rFonts w:ascii="Calibri" w:hAnsi="Calibri" w:eastAsia="Calibri"/>
+          <w:sz w:val="22"/>
+        </w:rPr>
+        <w:t xml:space="preserve">, signed </w:t>
+      </w:r>
+      <w:r>
+        <w:rPr>
+          <w:rFonts w:ascii="Consolas" w:hAnsi="Consolas" w:eastAsia="Consolas"/>
+          <w:sz w:val="20"/>
+        </w:rPr>
+        <w:t>-2147483648</w:t>
+      </w:r>
+    </w:p>
     <w:p/>
     <w:p>
       <w:r>
@@ -9317,6 +11768,1388 @@
       </w:tr>
     </w:tbl>
     <w:p/>
+    <w:p>
+      <w:pPr>
+        <w:pStyle w:val="Heading3"/>
+      </w:pPr>
+      <w:r>
+        <w:rPr>
+          <w:rFonts w:ascii="Calibri" w:hAnsi="Calibri" w:eastAsia="Calibri"/>
+          <w:b/>
+          <w:sz w:val="26"/>
+        </w:rPr>
+        <w:t>Digital indicator bits (`lIndicators[i]`)</w:t>
+      </w:r>
+    </w:p>
+    <w:p>
+      <w:pPr>
+        <w:pStyle w:val="Normal"/>
+      </w:pPr>
+      <w:r>
+        <w:rPr>
+          <w:rFonts w:ascii="Calibri" w:hAnsi="Calibri" w:eastAsia="Calibri"/>
+          <w:sz w:val="22"/>
+        </w:rPr>
+      </w:r>
+    </w:p>
+    <w:tbl>
+      <w:tblPr>
+        <w:tblStyle w:val="TableGrid"/>
+        <w:tblW w:type="auto" w:w="0"/>
+        <w:tblLook w:firstColumn="1" w:firstRow="1" w:lastColumn="0" w:lastRow="0" w:noHBand="0" w:noVBand="1" w:val="04A0"/>
+      </w:tblPr>
+      <w:tblGrid>
+        <w:gridCol w:w="4824"/>
+        <w:gridCol w:w="4824"/>
+      </w:tblGrid>
+      <w:tr>
+        <w:tc>
+          <w:tcPr>
+            <w:tcW w:type="dxa" w:w="4824"/>
+            <w:shd w:fill="1F4E79" w:val="clear"/>
+          </w:tcPr>
+          <w:p>
+            <w:pPr>
+              <w:jc w:val="right"/>
+            </w:pPr>
+            <w:r>
+              <w:rPr>
+                <w:rFonts w:ascii="Calibri" w:hAnsi="Calibri" w:eastAsia="Calibri"/>
+                <w:b/>
+                <w:i w:val="0"/>
+                <w:color w:val="FFFFFF"/>
+                <w:sz w:val="20"/>
+              </w:rPr>
+              <w:t>Value</w:t>
+            </w:r>
+          </w:p>
+        </w:tc>
+        <w:tc>
+          <w:tcPr>
+            <w:tcW w:type="dxa" w:w="4824"/>
+            <w:shd w:fill="1F4E79" w:val="clear"/>
+          </w:tcPr>
+          <w:p>
+            <w:r>
+              <w:rPr>
+                <w:rFonts w:ascii="Calibri" w:hAnsi="Calibri" w:eastAsia="Calibri"/>
+                <w:b/>
+                <w:i w:val="0"/>
+                <w:color w:val="FFFFFF"/>
+                <w:sz w:val="20"/>
+              </w:rPr>
+              <w:t>Meaning</w:t>
+            </w:r>
+          </w:p>
+        </w:tc>
+      </w:tr>
+      <w:tr>
+        <w:tc>
+          <w:tcPr>
+            <w:tcW w:type="dxa" w:w="4824"/>
+          </w:tcPr>
+          <w:p>
+            <w:pPr>
+              <w:jc w:val="right"/>
+            </w:pPr>
+            <w:r>
+              <w:rPr>
+                <w:rFonts w:ascii="Calibri" w:hAnsi="Calibri" w:eastAsia="Calibri"/>
+                <w:b w:val="0"/>
+                <w:i w:val="0"/>
+                <w:color w:val="000000"/>
+                <w:sz w:val="20"/>
+              </w:rPr>
+              <w:t>1</w:t>
+            </w:r>
+          </w:p>
+        </w:tc>
+        <w:tc>
+          <w:tcPr>
+            <w:tcW w:type="dxa" w:w="4824"/>
+          </w:tcPr>
+          <w:p>
+            <w:r>
+              <w:rPr>
+                <w:rFonts w:ascii="Calibri" w:hAnsi="Calibri" w:eastAsia="Calibri"/>
+                <w:b w:val="0"/>
+                <w:i w:val="0"/>
+                <w:color w:val="000000"/>
+                <w:sz w:val="20"/>
+              </w:rPr>
+              <w:t>Channel 0 on</w:t>
+            </w:r>
+          </w:p>
+        </w:tc>
+      </w:tr>
+      <w:tr>
+        <w:tc>
+          <w:tcPr>
+            <w:tcW w:type="dxa" w:w="4824"/>
+            <w:shd w:val="clear" w:fill="EEF3F8"/>
+          </w:tcPr>
+          <w:p>
+            <w:pPr>
+              <w:jc w:val="right"/>
+            </w:pPr>
+            <w:r>
+              <w:rPr>
+                <w:rFonts w:ascii="Calibri" w:hAnsi="Calibri" w:eastAsia="Calibri"/>
+                <w:b w:val="0"/>
+                <w:i w:val="0"/>
+                <w:color w:val="000000"/>
+                <w:sz w:val="20"/>
+              </w:rPr>
+              <w:t>2</w:t>
+            </w:r>
+          </w:p>
+        </w:tc>
+        <w:tc>
+          <w:tcPr>
+            <w:tcW w:type="dxa" w:w="4824"/>
+            <w:shd w:val="clear" w:fill="EEF3F8"/>
+          </w:tcPr>
+          <w:p>
+            <w:r>
+              <w:rPr>
+                <w:rFonts w:ascii="Calibri" w:hAnsi="Calibri" w:eastAsia="Calibri"/>
+                <w:b w:val="0"/>
+                <w:i w:val="0"/>
+                <w:color w:val="000000"/>
+                <w:sz w:val="20"/>
+              </w:rPr>
+              <w:t>Channel 1 on</w:t>
+            </w:r>
+          </w:p>
+        </w:tc>
+      </w:tr>
+      <w:tr>
+        <w:tc>
+          <w:tcPr>
+            <w:tcW w:type="dxa" w:w="4824"/>
+          </w:tcPr>
+          <w:p>
+            <w:pPr>
+              <w:jc w:val="right"/>
+            </w:pPr>
+            <w:r>
+              <w:rPr>
+                <w:rFonts w:ascii="Calibri" w:hAnsi="Calibri" w:eastAsia="Calibri"/>
+                <w:b w:val="0"/>
+                <w:i w:val="0"/>
+                <w:color w:val="000000"/>
+                <w:sz w:val="20"/>
+              </w:rPr>
+              <w:t>4</w:t>
+            </w:r>
+          </w:p>
+        </w:tc>
+        <w:tc>
+          <w:tcPr>
+            <w:tcW w:type="dxa" w:w="4824"/>
+          </w:tcPr>
+          <w:p>
+            <w:r>
+              <w:rPr>
+                <w:rFonts w:ascii="Calibri" w:hAnsi="Calibri" w:eastAsia="Calibri"/>
+                <w:b w:val="0"/>
+                <w:i w:val="0"/>
+                <w:color w:val="000000"/>
+                <w:sz w:val="20"/>
+              </w:rPr>
+              <w:t>Channel 2 on</w:t>
+            </w:r>
+          </w:p>
+        </w:tc>
+      </w:tr>
+      <w:tr>
+        <w:tc>
+          <w:tcPr>
+            <w:tcW w:type="dxa" w:w="4824"/>
+            <w:shd w:val="clear" w:fill="EEF3F8"/>
+          </w:tcPr>
+          <w:p>
+            <w:pPr>
+              <w:jc w:val="right"/>
+            </w:pPr>
+            <w:r>
+              <w:rPr>
+                <w:rFonts w:ascii="Calibri" w:hAnsi="Calibri" w:eastAsia="Calibri"/>
+                <w:b w:val="0"/>
+                <w:i w:val="0"/>
+                <w:color w:val="000000"/>
+                <w:sz w:val="20"/>
+              </w:rPr>
+              <w:t>8</w:t>
+            </w:r>
+          </w:p>
+        </w:tc>
+        <w:tc>
+          <w:tcPr>
+            <w:tcW w:type="dxa" w:w="4824"/>
+            <w:shd w:val="clear" w:fill="EEF3F8"/>
+          </w:tcPr>
+          <w:p>
+            <w:r>
+              <w:rPr>
+                <w:rFonts w:ascii="Calibri" w:hAnsi="Calibri" w:eastAsia="Calibri"/>
+                <w:b w:val="0"/>
+                <w:i w:val="0"/>
+                <w:color w:val="000000"/>
+                <w:sz w:val="20"/>
+              </w:rPr>
+              <w:t>Channel 3 on</w:t>
+            </w:r>
+          </w:p>
+        </w:tc>
+      </w:tr>
+      <w:tr>
+        <w:tc>
+          <w:tcPr>
+            <w:tcW w:type="dxa" w:w="4824"/>
+          </w:tcPr>
+          <w:p>
+            <w:pPr>
+              <w:jc w:val="right"/>
+            </w:pPr>
+            <w:r>
+              <w:rPr>
+                <w:rFonts w:ascii="Calibri" w:hAnsi="Calibri" w:eastAsia="Calibri"/>
+                <w:b w:val="0"/>
+                <w:i w:val="0"/>
+                <w:color w:val="000000"/>
+                <w:sz w:val="20"/>
+              </w:rPr>
+              <w:t>16</w:t>
+            </w:r>
+          </w:p>
+        </w:tc>
+        <w:tc>
+          <w:tcPr>
+            <w:tcW w:type="dxa" w:w="4824"/>
+          </w:tcPr>
+          <w:p>
+            <w:r>
+              <w:rPr>
+                <w:rFonts w:ascii="Calibri" w:hAnsi="Calibri" w:eastAsia="Calibri"/>
+                <w:b w:val="0"/>
+                <w:i w:val="0"/>
+                <w:color w:val="000000"/>
+                <w:sz w:val="20"/>
+              </w:rPr>
+              <w:t>Channel 4 on</w:t>
+            </w:r>
+          </w:p>
+        </w:tc>
+      </w:tr>
+      <w:tr>
+        <w:tc>
+          <w:tcPr>
+            <w:tcW w:type="dxa" w:w="4824"/>
+            <w:shd w:val="clear" w:fill="EEF3F8"/>
+          </w:tcPr>
+          <w:p>
+            <w:pPr>
+              <w:jc w:val="right"/>
+            </w:pPr>
+            <w:r>
+              <w:rPr>
+                <w:rFonts w:ascii="Calibri" w:hAnsi="Calibri" w:eastAsia="Calibri"/>
+                <w:b w:val="0"/>
+                <w:i w:val="0"/>
+                <w:color w:val="000000"/>
+                <w:sz w:val="20"/>
+              </w:rPr>
+              <w:t>32</w:t>
+            </w:r>
+          </w:p>
+        </w:tc>
+        <w:tc>
+          <w:tcPr>
+            <w:tcW w:type="dxa" w:w="4824"/>
+            <w:shd w:val="clear" w:fill="EEF3F8"/>
+          </w:tcPr>
+          <w:p>
+            <w:r>
+              <w:rPr>
+                <w:rFonts w:ascii="Calibri" w:hAnsi="Calibri" w:eastAsia="Calibri"/>
+                <w:b w:val="0"/>
+                <w:i w:val="0"/>
+                <w:color w:val="000000"/>
+                <w:sz w:val="20"/>
+              </w:rPr>
+              <w:t>Channel 5 on</w:t>
+            </w:r>
+          </w:p>
+        </w:tc>
+      </w:tr>
+      <w:tr>
+        <w:tc>
+          <w:tcPr>
+            <w:tcW w:type="dxa" w:w="4824"/>
+          </w:tcPr>
+          <w:p>
+            <w:pPr>
+              <w:jc w:val="right"/>
+            </w:pPr>
+            <w:r>
+              <w:rPr>
+                <w:rFonts w:ascii="Calibri" w:hAnsi="Calibri" w:eastAsia="Calibri"/>
+                <w:b w:val="0"/>
+                <w:i w:val="0"/>
+                <w:color w:val="000000"/>
+                <w:sz w:val="20"/>
+              </w:rPr>
+              <w:t>64</w:t>
+            </w:r>
+          </w:p>
+        </w:tc>
+        <w:tc>
+          <w:tcPr>
+            <w:tcW w:type="dxa" w:w="4824"/>
+          </w:tcPr>
+          <w:p>
+            <w:r>
+              <w:rPr>
+                <w:rFonts w:ascii="Calibri" w:hAnsi="Calibri" w:eastAsia="Calibri"/>
+                <w:b w:val="0"/>
+                <w:i w:val="0"/>
+                <w:color w:val="000000"/>
+                <w:sz w:val="20"/>
+              </w:rPr>
+              <w:t>Channel 6 on</w:t>
+            </w:r>
+          </w:p>
+        </w:tc>
+      </w:tr>
+      <w:tr>
+        <w:tc>
+          <w:tcPr>
+            <w:tcW w:type="dxa" w:w="4824"/>
+            <w:shd w:val="clear" w:fill="EEF3F8"/>
+          </w:tcPr>
+          <w:p>
+            <w:pPr>
+              <w:jc w:val="right"/>
+            </w:pPr>
+            <w:r>
+              <w:rPr>
+                <w:rFonts w:ascii="Calibri" w:hAnsi="Calibri" w:eastAsia="Calibri"/>
+                <w:b w:val="0"/>
+                <w:i w:val="0"/>
+                <w:color w:val="000000"/>
+                <w:sz w:val="20"/>
+              </w:rPr>
+              <w:t>128</w:t>
+            </w:r>
+          </w:p>
+        </w:tc>
+        <w:tc>
+          <w:tcPr>
+            <w:tcW w:type="dxa" w:w="4824"/>
+            <w:shd w:val="clear" w:fill="EEF3F8"/>
+          </w:tcPr>
+          <w:p>
+            <w:r>
+              <w:rPr>
+                <w:rFonts w:ascii="Calibri" w:hAnsi="Calibri" w:eastAsia="Calibri"/>
+                <w:b w:val="0"/>
+                <w:i w:val="0"/>
+                <w:color w:val="000000"/>
+                <w:sz w:val="20"/>
+              </w:rPr>
+              <w:t>Channel 7 on</w:t>
+            </w:r>
+          </w:p>
+        </w:tc>
+      </w:tr>
+      <w:tr>
+        <w:tc>
+          <w:tcPr>
+            <w:tcW w:type="dxa" w:w="4824"/>
+          </w:tcPr>
+          <w:p>
+            <w:pPr>
+              <w:jc w:val="right"/>
+            </w:pPr>
+            <w:r>
+              <w:rPr>
+                <w:rFonts w:ascii="Calibri" w:hAnsi="Calibri" w:eastAsia="Calibri"/>
+                <w:b w:val="0"/>
+                <w:i w:val="0"/>
+                <w:color w:val="000000"/>
+                <w:sz w:val="20"/>
+              </w:rPr>
+              <w:t>256</w:t>
+            </w:r>
+          </w:p>
+        </w:tc>
+        <w:tc>
+          <w:tcPr>
+            <w:tcW w:type="dxa" w:w="4824"/>
+          </w:tcPr>
+          <w:p>
+            <w:r>
+              <w:rPr>
+                <w:rFonts w:ascii="Calibri" w:hAnsi="Calibri" w:eastAsia="Calibri"/>
+                <w:b w:val="0"/>
+                <w:i w:val="0"/>
+                <w:color w:val="000000"/>
+                <w:sz w:val="20"/>
+              </w:rPr>
+              <w:t>Channel 8 on</w:t>
+            </w:r>
+          </w:p>
+        </w:tc>
+      </w:tr>
+      <w:tr>
+        <w:tc>
+          <w:tcPr>
+            <w:tcW w:type="dxa" w:w="4824"/>
+            <w:shd w:val="clear" w:fill="EEF3F8"/>
+          </w:tcPr>
+          <w:p>
+            <w:pPr>
+              <w:jc w:val="right"/>
+            </w:pPr>
+            <w:r>
+              <w:rPr>
+                <w:rFonts w:ascii="Calibri" w:hAnsi="Calibri" w:eastAsia="Calibri"/>
+                <w:b w:val="0"/>
+                <w:i w:val="0"/>
+                <w:color w:val="000000"/>
+                <w:sz w:val="20"/>
+              </w:rPr>
+              <w:t>512</w:t>
+            </w:r>
+          </w:p>
+        </w:tc>
+        <w:tc>
+          <w:tcPr>
+            <w:tcW w:type="dxa" w:w="4824"/>
+            <w:shd w:val="clear" w:fill="EEF3F8"/>
+          </w:tcPr>
+          <w:p>
+            <w:r>
+              <w:rPr>
+                <w:rFonts w:ascii="Calibri" w:hAnsi="Calibri" w:eastAsia="Calibri"/>
+                <w:b w:val="0"/>
+                <w:i w:val="0"/>
+                <w:color w:val="000000"/>
+                <w:sz w:val="20"/>
+              </w:rPr>
+              <w:t>Channel 9 on</w:t>
+            </w:r>
+          </w:p>
+        </w:tc>
+      </w:tr>
+      <w:tr>
+        <w:tc>
+          <w:tcPr>
+            <w:tcW w:type="dxa" w:w="4824"/>
+          </w:tcPr>
+          <w:p>
+            <w:pPr>
+              <w:jc w:val="right"/>
+            </w:pPr>
+            <w:r>
+              <w:rPr>
+                <w:rFonts w:ascii="Calibri" w:hAnsi="Calibri" w:eastAsia="Calibri"/>
+                <w:b w:val="0"/>
+                <w:i w:val="0"/>
+                <w:color w:val="000000"/>
+                <w:sz w:val="20"/>
+              </w:rPr>
+              <w:t>1024</w:t>
+            </w:r>
+          </w:p>
+        </w:tc>
+        <w:tc>
+          <w:tcPr>
+            <w:tcW w:type="dxa" w:w="4824"/>
+          </w:tcPr>
+          <w:p>
+            <w:r>
+              <w:rPr>
+                <w:rFonts w:ascii="Calibri" w:hAnsi="Calibri" w:eastAsia="Calibri"/>
+                <w:b w:val="0"/>
+                <w:i w:val="0"/>
+                <w:color w:val="000000"/>
+                <w:sz w:val="20"/>
+              </w:rPr>
+              <w:t>Channel 10 on</w:t>
+            </w:r>
+          </w:p>
+        </w:tc>
+      </w:tr>
+      <w:tr>
+        <w:tc>
+          <w:tcPr>
+            <w:tcW w:type="dxa" w:w="4824"/>
+            <w:shd w:val="clear" w:fill="EEF3F8"/>
+          </w:tcPr>
+          <w:p>
+            <w:pPr>
+              <w:jc w:val="right"/>
+            </w:pPr>
+            <w:r>
+              <w:rPr>
+                <w:rFonts w:ascii="Calibri" w:hAnsi="Calibri" w:eastAsia="Calibri"/>
+                <w:b w:val="0"/>
+                <w:i w:val="0"/>
+                <w:color w:val="000000"/>
+                <w:sz w:val="20"/>
+              </w:rPr>
+              <w:t>2048</w:t>
+            </w:r>
+          </w:p>
+        </w:tc>
+        <w:tc>
+          <w:tcPr>
+            <w:tcW w:type="dxa" w:w="4824"/>
+            <w:shd w:val="clear" w:fill="EEF3F8"/>
+          </w:tcPr>
+          <w:p>
+            <w:r>
+              <w:rPr>
+                <w:rFonts w:ascii="Calibri" w:hAnsi="Calibri" w:eastAsia="Calibri"/>
+                <w:b w:val="0"/>
+                <w:i w:val="0"/>
+                <w:color w:val="000000"/>
+                <w:sz w:val="20"/>
+              </w:rPr>
+              <w:t>Channel 11 on</w:t>
+            </w:r>
+          </w:p>
+        </w:tc>
+      </w:tr>
+      <w:tr>
+        <w:tc>
+          <w:tcPr>
+            <w:tcW w:type="dxa" w:w="4824"/>
+          </w:tcPr>
+          <w:p>
+            <w:pPr>
+              <w:jc w:val="right"/>
+            </w:pPr>
+            <w:r>
+              <w:rPr>
+                <w:rFonts w:ascii="Calibri" w:hAnsi="Calibri" w:eastAsia="Calibri"/>
+                <w:b w:val="0"/>
+                <w:i w:val="0"/>
+                <w:color w:val="000000"/>
+                <w:sz w:val="20"/>
+              </w:rPr>
+              <w:t>4096</w:t>
+            </w:r>
+          </w:p>
+        </w:tc>
+        <w:tc>
+          <w:tcPr>
+            <w:tcW w:type="dxa" w:w="4824"/>
+          </w:tcPr>
+          <w:p>
+            <w:r>
+              <w:rPr>
+                <w:rFonts w:ascii="Calibri" w:hAnsi="Calibri" w:eastAsia="Calibri"/>
+                <w:b w:val="0"/>
+                <w:i w:val="0"/>
+                <w:color w:val="000000"/>
+                <w:sz w:val="20"/>
+              </w:rPr>
+              <w:t>Channel 12 on</w:t>
+            </w:r>
+          </w:p>
+        </w:tc>
+      </w:tr>
+      <w:tr>
+        <w:tc>
+          <w:tcPr>
+            <w:tcW w:type="dxa" w:w="4824"/>
+            <w:shd w:val="clear" w:fill="EEF3F8"/>
+          </w:tcPr>
+          <w:p>
+            <w:pPr>
+              <w:jc w:val="right"/>
+            </w:pPr>
+            <w:r>
+              <w:rPr>
+                <w:rFonts w:ascii="Calibri" w:hAnsi="Calibri" w:eastAsia="Calibri"/>
+                <w:b w:val="0"/>
+                <w:i w:val="0"/>
+                <w:color w:val="000000"/>
+                <w:sz w:val="20"/>
+              </w:rPr>
+              <w:t>8192</w:t>
+            </w:r>
+          </w:p>
+        </w:tc>
+        <w:tc>
+          <w:tcPr>
+            <w:tcW w:type="dxa" w:w="4824"/>
+            <w:shd w:val="clear" w:fill="EEF3F8"/>
+          </w:tcPr>
+          <w:p>
+            <w:r>
+              <w:rPr>
+                <w:rFonts w:ascii="Calibri" w:hAnsi="Calibri" w:eastAsia="Calibri"/>
+                <w:b w:val="0"/>
+                <w:i w:val="0"/>
+                <w:color w:val="000000"/>
+                <w:sz w:val="20"/>
+              </w:rPr>
+              <w:t>Channel 13 on</w:t>
+            </w:r>
+          </w:p>
+        </w:tc>
+      </w:tr>
+      <w:tr>
+        <w:tc>
+          <w:tcPr>
+            <w:tcW w:type="dxa" w:w="4824"/>
+          </w:tcPr>
+          <w:p>
+            <w:pPr>
+              <w:jc w:val="right"/>
+            </w:pPr>
+            <w:r>
+              <w:rPr>
+                <w:rFonts w:ascii="Calibri" w:hAnsi="Calibri" w:eastAsia="Calibri"/>
+                <w:b w:val="0"/>
+                <w:i w:val="0"/>
+                <w:color w:val="000000"/>
+                <w:sz w:val="20"/>
+              </w:rPr>
+              <w:t>16384</w:t>
+            </w:r>
+          </w:p>
+        </w:tc>
+        <w:tc>
+          <w:tcPr>
+            <w:tcW w:type="dxa" w:w="4824"/>
+          </w:tcPr>
+          <w:p>
+            <w:r>
+              <w:rPr>
+                <w:rFonts w:ascii="Calibri" w:hAnsi="Calibri" w:eastAsia="Calibri"/>
+                <w:b w:val="0"/>
+                <w:i w:val="0"/>
+                <w:color w:val="000000"/>
+                <w:sz w:val="20"/>
+              </w:rPr>
+              <w:t>Channel 14 on</w:t>
+            </w:r>
+          </w:p>
+        </w:tc>
+      </w:tr>
+      <w:tr>
+        <w:tc>
+          <w:tcPr>
+            <w:tcW w:type="dxa" w:w="4824"/>
+            <w:shd w:val="clear" w:fill="EEF3F8"/>
+          </w:tcPr>
+          <w:p>
+            <w:pPr>
+              <w:jc w:val="right"/>
+            </w:pPr>
+            <w:r>
+              <w:rPr>
+                <w:rFonts w:ascii="Calibri" w:hAnsi="Calibri" w:eastAsia="Calibri"/>
+                <w:b w:val="0"/>
+                <w:i w:val="0"/>
+                <w:color w:val="000000"/>
+                <w:sz w:val="20"/>
+              </w:rPr>
+              <w:t>32768</w:t>
+            </w:r>
+          </w:p>
+        </w:tc>
+        <w:tc>
+          <w:tcPr>
+            <w:tcW w:type="dxa" w:w="4824"/>
+            <w:shd w:val="clear" w:fill="EEF3F8"/>
+          </w:tcPr>
+          <w:p>
+            <w:r>
+              <w:rPr>
+                <w:rFonts w:ascii="Calibri" w:hAnsi="Calibri" w:eastAsia="Calibri"/>
+                <w:b w:val="0"/>
+                <w:i w:val="0"/>
+                <w:color w:val="000000"/>
+                <w:sz w:val="20"/>
+              </w:rPr>
+              <w:t>Channel 15 on</w:t>
+            </w:r>
+          </w:p>
+        </w:tc>
+      </w:tr>
+      <w:tr>
+        <w:tc>
+          <w:tcPr>
+            <w:tcW w:type="dxa" w:w="4824"/>
+          </w:tcPr>
+          <w:p>
+            <w:pPr>
+              <w:jc w:val="right"/>
+            </w:pPr>
+            <w:r>
+              <w:rPr>
+                <w:rFonts w:ascii="Calibri" w:hAnsi="Calibri" w:eastAsia="Calibri"/>
+                <w:b w:val="0"/>
+                <w:i w:val="0"/>
+                <w:color w:val="000000"/>
+                <w:sz w:val="20"/>
+              </w:rPr>
+              <w:t>65536</w:t>
+            </w:r>
+          </w:p>
+        </w:tc>
+        <w:tc>
+          <w:tcPr>
+            <w:tcW w:type="dxa" w:w="4824"/>
+          </w:tcPr>
+          <w:p>
+            <w:r>
+              <w:rPr>
+                <w:rFonts w:ascii="Calibri" w:hAnsi="Calibri" w:eastAsia="Calibri"/>
+                <w:b w:val="0"/>
+                <w:i w:val="0"/>
+                <w:color w:val="000000"/>
+                <w:sz w:val="20"/>
+              </w:rPr>
+              <w:t>Channel 16 on</w:t>
+            </w:r>
+          </w:p>
+        </w:tc>
+      </w:tr>
+      <w:tr>
+        <w:tc>
+          <w:tcPr>
+            <w:tcW w:type="dxa" w:w="4824"/>
+            <w:shd w:val="clear" w:fill="EEF3F8"/>
+          </w:tcPr>
+          <w:p>
+            <w:pPr>
+              <w:jc w:val="right"/>
+            </w:pPr>
+            <w:r>
+              <w:rPr>
+                <w:rFonts w:ascii="Calibri" w:hAnsi="Calibri" w:eastAsia="Calibri"/>
+                <w:b w:val="0"/>
+                <w:i w:val="0"/>
+                <w:color w:val="000000"/>
+                <w:sz w:val="20"/>
+              </w:rPr>
+              <w:t>131072</w:t>
+            </w:r>
+          </w:p>
+        </w:tc>
+        <w:tc>
+          <w:tcPr>
+            <w:tcW w:type="dxa" w:w="4824"/>
+            <w:shd w:val="clear" w:fill="EEF3F8"/>
+          </w:tcPr>
+          <w:p>
+            <w:r>
+              <w:rPr>
+                <w:rFonts w:ascii="Calibri" w:hAnsi="Calibri" w:eastAsia="Calibri"/>
+                <w:b w:val="0"/>
+                <w:i w:val="0"/>
+                <w:color w:val="000000"/>
+                <w:sz w:val="20"/>
+              </w:rPr>
+              <w:t>Channel 17 on</w:t>
+            </w:r>
+          </w:p>
+        </w:tc>
+      </w:tr>
+      <w:tr>
+        <w:tc>
+          <w:tcPr>
+            <w:tcW w:type="dxa" w:w="4824"/>
+          </w:tcPr>
+          <w:p>
+            <w:pPr>
+              <w:jc w:val="right"/>
+            </w:pPr>
+            <w:r>
+              <w:rPr>
+                <w:rFonts w:ascii="Calibri" w:hAnsi="Calibri" w:eastAsia="Calibri"/>
+                <w:b w:val="0"/>
+                <w:i w:val="0"/>
+                <w:color w:val="000000"/>
+                <w:sz w:val="20"/>
+              </w:rPr>
+              <w:t>262144</w:t>
+            </w:r>
+          </w:p>
+        </w:tc>
+        <w:tc>
+          <w:tcPr>
+            <w:tcW w:type="dxa" w:w="4824"/>
+          </w:tcPr>
+          <w:p>
+            <w:r>
+              <w:rPr>
+                <w:rFonts w:ascii="Calibri" w:hAnsi="Calibri" w:eastAsia="Calibri"/>
+                <w:b w:val="0"/>
+                <w:i w:val="0"/>
+                <w:color w:val="000000"/>
+                <w:sz w:val="20"/>
+              </w:rPr>
+              <w:t>Channel 18 on</w:t>
+            </w:r>
+          </w:p>
+        </w:tc>
+      </w:tr>
+      <w:tr>
+        <w:tc>
+          <w:tcPr>
+            <w:tcW w:type="dxa" w:w="4824"/>
+            <w:shd w:val="clear" w:fill="EEF3F8"/>
+          </w:tcPr>
+          <w:p>
+            <w:pPr>
+              <w:jc w:val="right"/>
+            </w:pPr>
+            <w:r>
+              <w:rPr>
+                <w:rFonts w:ascii="Calibri" w:hAnsi="Calibri" w:eastAsia="Calibri"/>
+                <w:b w:val="0"/>
+                <w:i w:val="0"/>
+                <w:color w:val="000000"/>
+                <w:sz w:val="20"/>
+              </w:rPr>
+              <w:t>524288</w:t>
+            </w:r>
+          </w:p>
+        </w:tc>
+        <w:tc>
+          <w:tcPr>
+            <w:tcW w:type="dxa" w:w="4824"/>
+            <w:shd w:val="clear" w:fill="EEF3F8"/>
+          </w:tcPr>
+          <w:p>
+            <w:r>
+              <w:rPr>
+                <w:rFonts w:ascii="Calibri" w:hAnsi="Calibri" w:eastAsia="Calibri"/>
+                <w:b w:val="0"/>
+                <w:i w:val="0"/>
+                <w:color w:val="000000"/>
+                <w:sz w:val="20"/>
+              </w:rPr>
+              <w:t>Channel 19 on</w:t>
+            </w:r>
+          </w:p>
+        </w:tc>
+      </w:tr>
+      <w:tr>
+        <w:tc>
+          <w:tcPr>
+            <w:tcW w:type="dxa" w:w="4824"/>
+          </w:tcPr>
+          <w:p>
+            <w:pPr>
+              <w:jc w:val="right"/>
+            </w:pPr>
+            <w:r>
+              <w:rPr>
+                <w:rFonts w:ascii="Calibri" w:hAnsi="Calibri" w:eastAsia="Calibri"/>
+                <w:b w:val="0"/>
+                <w:i w:val="0"/>
+                <w:color w:val="000000"/>
+                <w:sz w:val="20"/>
+              </w:rPr>
+              <w:t>1048576</w:t>
+            </w:r>
+          </w:p>
+        </w:tc>
+        <w:tc>
+          <w:tcPr>
+            <w:tcW w:type="dxa" w:w="4824"/>
+          </w:tcPr>
+          <w:p>
+            <w:r>
+              <w:rPr>
+                <w:rFonts w:ascii="Calibri" w:hAnsi="Calibri" w:eastAsia="Calibri"/>
+                <w:b w:val="0"/>
+                <w:i w:val="0"/>
+                <w:color w:val="000000"/>
+                <w:sz w:val="20"/>
+              </w:rPr>
+              <w:t>Channel 20 on</w:t>
+            </w:r>
+          </w:p>
+        </w:tc>
+      </w:tr>
+      <w:tr>
+        <w:tc>
+          <w:tcPr>
+            <w:tcW w:type="dxa" w:w="4824"/>
+            <w:shd w:val="clear" w:fill="EEF3F8"/>
+          </w:tcPr>
+          <w:p>
+            <w:pPr>
+              <w:jc w:val="right"/>
+            </w:pPr>
+            <w:r>
+              <w:rPr>
+                <w:rFonts w:ascii="Calibri" w:hAnsi="Calibri" w:eastAsia="Calibri"/>
+                <w:b w:val="0"/>
+                <w:i w:val="0"/>
+                <w:color w:val="000000"/>
+                <w:sz w:val="20"/>
+              </w:rPr>
+              <w:t>2097152</w:t>
+            </w:r>
+          </w:p>
+        </w:tc>
+        <w:tc>
+          <w:tcPr>
+            <w:tcW w:type="dxa" w:w="4824"/>
+            <w:shd w:val="clear" w:fill="EEF3F8"/>
+          </w:tcPr>
+          <w:p>
+            <w:r>
+              <w:rPr>
+                <w:rFonts w:ascii="Calibri" w:hAnsi="Calibri" w:eastAsia="Calibri"/>
+                <w:b w:val="0"/>
+                <w:i w:val="0"/>
+                <w:color w:val="000000"/>
+                <w:sz w:val="20"/>
+              </w:rPr>
+              <w:t>Channel 21 on</w:t>
+            </w:r>
+          </w:p>
+        </w:tc>
+      </w:tr>
+      <w:tr>
+        <w:tc>
+          <w:tcPr>
+            <w:tcW w:type="dxa" w:w="4824"/>
+          </w:tcPr>
+          <w:p>
+            <w:pPr>
+              <w:jc w:val="right"/>
+            </w:pPr>
+            <w:r>
+              <w:rPr>
+                <w:rFonts w:ascii="Calibri" w:hAnsi="Calibri" w:eastAsia="Calibri"/>
+                <w:b w:val="0"/>
+                <w:i w:val="0"/>
+                <w:color w:val="000000"/>
+                <w:sz w:val="20"/>
+              </w:rPr>
+              <w:t>4194304</w:t>
+            </w:r>
+          </w:p>
+        </w:tc>
+        <w:tc>
+          <w:tcPr>
+            <w:tcW w:type="dxa" w:w="4824"/>
+          </w:tcPr>
+          <w:p>
+            <w:r>
+              <w:rPr>
+                <w:rFonts w:ascii="Calibri" w:hAnsi="Calibri" w:eastAsia="Calibri"/>
+                <w:b w:val="0"/>
+                <w:i w:val="0"/>
+                <w:color w:val="000000"/>
+                <w:sz w:val="20"/>
+              </w:rPr>
+              <w:t>Channel 22 on</w:t>
+            </w:r>
+          </w:p>
+        </w:tc>
+      </w:tr>
+      <w:tr>
+        <w:tc>
+          <w:tcPr>
+            <w:tcW w:type="dxa" w:w="4824"/>
+            <w:shd w:val="clear" w:fill="EEF3F8"/>
+          </w:tcPr>
+          <w:p>
+            <w:pPr>
+              <w:jc w:val="right"/>
+            </w:pPr>
+            <w:r>
+              <w:rPr>
+                <w:rFonts w:ascii="Calibri" w:hAnsi="Calibri" w:eastAsia="Calibri"/>
+                <w:b w:val="0"/>
+                <w:i w:val="0"/>
+                <w:color w:val="000000"/>
+                <w:sz w:val="20"/>
+              </w:rPr>
+              <w:t>8388608</w:t>
+            </w:r>
+          </w:p>
+        </w:tc>
+        <w:tc>
+          <w:tcPr>
+            <w:tcW w:type="dxa" w:w="4824"/>
+            <w:shd w:val="clear" w:fill="EEF3F8"/>
+          </w:tcPr>
+          <w:p>
+            <w:r>
+              <w:rPr>
+                <w:rFonts w:ascii="Calibri" w:hAnsi="Calibri" w:eastAsia="Calibri"/>
+                <w:b w:val="0"/>
+                <w:i w:val="0"/>
+                <w:color w:val="000000"/>
+                <w:sz w:val="20"/>
+              </w:rPr>
+              <w:t>Channel 23 on</w:t>
+            </w:r>
+          </w:p>
+        </w:tc>
+      </w:tr>
+      <w:tr>
+        <w:tc>
+          <w:tcPr>
+            <w:tcW w:type="dxa" w:w="4824"/>
+          </w:tcPr>
+          <w:p>
+            <w:pPr>
+              <w:jc w:val="right"/>
+            </w:pPr>
+            <w:r>
+              <w:rPr>
+                <w:rFonts w:ascii="Calibri" w:hAnsi="Calibri" w:eastAsia="Calibri"/>
+                <w:b w:val="0"/>
+                <w:i w:val="0"/>
+                <w:color w:val="000000"/>
+                <w:sz w:val="20"/>
+              </w:rPr>
+              <w:t>16777216</w:t>
+            </w:r>
+          </w:p>
+        </w:tc>
+        <w:tc>
+          <w:tcPr>
+            <w:tcW w:type="dxa" w:w="4824"/>
+          </w:tcPr>
+          <w:p>
+            <w:r>
+              <w:rPr>
+                <w:rFonts w:ascii="Calibri" w:hAnsi="Calibri" w:eastAsia="Calibri"/>
+                <w:b w:val="0"/>
+                <w:i w:val="0"/>
+                <w:color w:val="000000"/>
+                <w:sz w:val="20"/>
+              </w:rPr>
+              <w:t>Channel 24 on</w:t>
+            </w:r>
+          </w:p>
+        </w:tc>
+      </w:tr>
+      <w:tr>
+        <w:tc>
+          <w:tcPr>
+            <w:tcW w:type="dxa" w:w="4824"/>
+            <w:shd w:val="clear" w:fill="EEF3F8"/>
+          </w:tcPr>
+          <w:p>
+            <w:pPr>
+              <w:jc w:val="right"/>
+            </w:pPr>
+            <w:r>
+              <w:rPr>
+                <w:rFonts w:ascii="Calibri" w:hAnsi="Calibri" w:eastAsia="Calibri"/>
+                <w:b w:val="0"/>
+                <w:i w:val="0"/>
+                <w:color w:val="000000"/>
+                <w:sz w:val="20"/>
+              </w:rPr>
+              <w:t>33554432</w:t>
+            </w:r>
+          </w:p>
+        </w:tc>
+        <w:tc>
+          <w:tcPr>
+            <w:tcW w:type="dxa" w:w="4824"/>
+            <w:shd w:val="clear" w:fill="EEF3F8"/>
+          </w:tcPr>
+          <w:p>
+            <w:r>
+              <w:rPr>
+                <w:rFonts w:ascii="Calibri" w:hAnsi="Calibri" w:eastAsia="Calibri"/>
+                <w:b w:val="0"/>
+                <w:i w:val="0"/>
+                <w:color w:val="000000"/>
+                <w:sz w:val="20"/>
+              </w:rPr>
+              <w:t>Channel 25 on</w:t>
+            </w:r>
+          </w:p>
+        </w:tc>
+      </w:tr>
+      <w:tr>
+        <w:tc>
+          <w:tcPr>
+            <w:tcW w:type="dxa" w:w="4824"/>
+          </w:tcPr>
+          <w:p>
+            <w:pPr>
+              <w:jc w:val="right"/>
+            </w:pPr>
+            <w:r>
+              <w:rPr>
+                <w:rFonts w:ascii="Calibri" w:hAnsi="Calibri" w:eastAsia="Calibri"/>
+                <w:b w:val="0"/>
+                <w:i w:val="0"/>
+                <w:color w:val="000000"/>
+                <w:sz w:val="20"/>
+              </w:rPr>
+              <w:t>67108864</w:t>
+            </w:r>
+          </w:p>
+        </w:tc>
+        <w:tc>
+          <w:tcPr>
+            <w:tcW w:type="dxa" w:w="4824"/>
+          </w:tcPr>
+          <w:p>
+            <w:r>
+              <w:rPr>
+                <w:rFonts w:ascii="Calibri" w:hAnsi="Calibri" w:eastAsia="Calibri"/>
+                <w:b w:val="0"/>
+                <w:i w:val="0"/>
+                <w:color w:val="000000"/>
+                <w:sz w:val="20"/>
+              </w:rPr>
+              <w:t>Channel 26 on</w:t>
+            </w:r>
+          </w:p>
+        </w:tc>
+      </w:tr>
+      <w:tr>
+        <w:tc>
+          <w:tcPr>
+            <w:tcW w:type="dxa" w:w="4824"/>
+            <w:shd w:val="clear" w:fill="EEF3F8"/>
+          </w:tcPr>
+          <w:p>
+            <w:pPr>
+              <w:jc w:val="right"/>
+            </w:pPr>
+            <w:r>
+              <w:rPr>
+                <w:rFonts w:ascii="Calibri" w:hAnsi="Calibri" w:eastAsia="Calibri"/>
+                <w:b w:val="0"/>
+                <w:i w:val="0"/>
+                <w:color w:val="000000"/>
+                <w:sz w:val="20"/>
+              </w:rPr>
+              <w:t>134217728</w:t>
+            </w:r>
+          </w:p>
+        </w:tc>
+        <w:tc>
+          <w:tcPr>
+            <w:tcW w:type="dxa" w:w="4824"/>
+            <w:shd w:val="clear" w:fill="EEF3F8"/>
+          </w:tcPr>
+          <w:p>
+            <w:r>
+              <w:rPr>
+                <w:rFonts w:ascii="Calibri" w:hAnsi="Calibri" w:eastAsia="Calibri"/>
+                <w:b w:val="0"/>
+                <w:i w:val="0"/>
+                <w:color w:val="000000"/>
+                <w:sz w:val="20"/>
+              </w:rPr>
+              <w:t>Channel 27 on</w:t>
+            </w:r>
+          </w:p>
+        </w:tc>
+      </w:tr>
+      <w:tr>
+        <w:tc>
+          <w:tcPr>
+            <w:tcW w:type="dxa" w:w="4824"/>
+          </w:tcPr>
+          <w:p>
+            <w:pPr>
+              <w:jc w:val="right"/>
+            </w:pPr>
+            <w:r>
+              <w:rPr>
+                <w:rFonts w:ascii="Calibri" w:hAnsi="Calibri" w:eastAsia="Calibri"/>
+                <w:b w:val="0"/>
+                <w:i w:val="0"/>
+                <w:color w:val="000000"/>
+                <w:sz w:val="20"/>
+              </w:rPr>
+              <w:t>268435456</w:t>
+            </w:r>
+          </w:p>
+        </w:tc>
+        <w:tc>
+          <w:tcPr>
+            <w:tcW w:type="dxa" w:w="4824"/>
+          </w:tcPr>
+          <w:p>
+            <w:r>
+              <w:rPr>
+                <w:rFonts w:ascii="Calibri" w:hAnsi="Calibri" w:eastAsia="Calibri"/>
+                <w:b w:val="0"/>
+                <w:i w:val="0"/>
+                <w:color w:val="000000"/>
+                <w:sz w:val="20"/>
+              </w:rPr>
+              <w:t>Channel 28 on</w:t>
+            </w:r>
+          </w:p>
+        </w:tc>
+      </w:tr>
+      <w:tr>
+        <w:tc>
+          <w:tcPr>
+            <w:tcW w:type="dxa" w:w="4824"/>
+            <w:shd w:val="clear" w:fill="EEF3F8"/>
+          </w:tcPr>
+          <w:p>
+            <w:pPr>
+              <w:jc w:val="right"/>
+            </w:pPr>
+            <w:r>
+              <w:rPr>
+                <w:rFonts w:ascii="Calibri" w:hAnsi="Calibri" w:eastAsia="Calibri"/>
+                <w:b w:val="0"/>
+                <w:i w:val="0"/>
+                <w:color w:val="000000"/>
+                <w:sz w:val="20"/>
+              </w:rPr>
+              <w:t>536870912</w:t>
+            </w:r>
+          </w:p>
+        </w:tc>
+        <w:tc>
+          <w:tcPr>
+            <w:tcW w:type="dxa" w:w="4824"/>
+            <w:shd w:val="clear" w:fill="EEF3F8"/>
+          </w:tcPr>
+          <w:p>
+            <w:r>
+              <w:rPr>
+                <w:rFonts w:ascii="Calibri" w:hAnsi="Calibri" w:eastAsia="Calibri"/>
+                <w:b w:val="0"/>
+                <w:i w:val="0"/>
+                <w:color w:val="000000"/>
+                <w:sz w:val="20"/>
+              </w:rPr>
+              <w:t>Channel 29 on</w:t>
+            </w:r>
+          </w:p>
+        </w:tc>
+      </w:tr>
+      <w:tr>
+        <w:tc>
+          <w:tcPr>
+            <w:tcW w:type="dxa" w:w="4824"/>
+          </w:tcPr>
+          <w:p>
+            <w:pPr>
+              <w:jc w:val="right"/>
+            </w:pPr>
+            <w:r>
+              <w:rPr>
+                <w:rFonts w:ascii="Calibri" w:hAnsi="Calibri" w:eastAsia="Calibri"/>
+                <w:b w:val="0"/>
+                <w:i w:val="0"/>
+                <w:color w:val="000000"/>
+                <w:sz w:val="20"/>
+              </w:rPr>
+              <w:t>1073741824</w:t>
+            </w:r>
+          </w:p>
+        </w:tc>
+        <w:tc>
+          <w:tcPr>
+            <w:tcW w:type="dxa" w:w="4824"/>
+          </w:tcPr>
+          <w:p>
+            <w:r>
+              <w:rPr>
+                <w:rFonts w:ascii="Calibri" w:hAnsi="Calibri" w:eastAsia="Calibri"/>
+                <w:b w:val="0"/>
+                <w:i w:val="0"/>
+                <w:color w:val="000000"/>
+                <w:sz w:val="20"/>
+              </w:rPr>
+              <w:t>Channel 30 on</w:t>
+            </w:r>
+          </w:p>
+        </w:tc>
+      </w:tr>
+      <w:tr>
+        <w:tc>
+          <w:tcPr>
+            <w:tcW w:type="dxa" w:w="4824"/>
+            <w:shd w:val="clear" w:fill="EEF3F8"/>
+          </w:tcPr>
+          <w:p>
+            <w:pPr>
+              <w:jc w:val="right"/>
+            </w:pPr>
+            <w:r>
+              <w:rPr>
+                <w:rFonts w:ascii="Calibri" w:hAnsi="Calibri" w:eastAsia="Calibri"/>
+                <w:b w:val="0"/>
+                <w:i w:val="0"/>
+                <w:color w:val="000000"/>
+                <w:sz w:val="20"/>
+              </w:rPr>
+              <w:t>2147483648</w:t>
+            </w:r>
+          </w:p>
+        </w:tc>
+        <w:tc>
+          <w:tcPr>
+            <w:tcW w:type="dxa" w:w="4824"/>
+            <w:shd w:val="clear" w:fill="EEF3F8"/>
+          </w:tcPr>
+          <w:p>
+            <w:r>
+              <w:rPr>
+                <w:rFonts w:ascii="Calibri" w:hAnsi="Calibri" w:eastAsia="Calibri"/>
+                <w:b w:val="0"/>
+                <w:i w:val="0"/>
+                <w:color w:val="000000"/>
+                <w:sz w:val="20"/>
+              </w:rPr>
+              <w:t>Channel 31 on (signed display -2147483648)</w:t>
+            </w:r>
+          </w:p>
+        </w:tc>
+      </w:tr>
+    </w:tbl>
+    <w:p>
+      <w:pPr>
+        <w:pStyle w:val="Normal"/>
+      </w:pPr>
+      <w:r>
+        <w:rPr>
+          <w:rFonts w:ascii="Calibri" w:hAnsi="Calibri" w:eastAsia="Calibri"/>
+          <w:sz w:val="22"/>
+        </w:rPr>
+        <w:t xml:space="preserve">Values can combine. Lamp labels for each channel come from vessel </w:t>
+      </w:r>
+      <w:r>
+        <w:rPr>
+          <w:rFonts w:ascii="Consolas" w:hAnsi="Consolas" w:eastAsia="Consolas"/>
+          <w:sz w:val="20"/>
+        </w:rPr>
+        <w:t>TCSView.ini</w:t>
+      </w:r>
+      <w:r>
+        <w:rPr>
+          <w:rFonts w:ascii="Calibri" w:hAnsi="Calibri" w:eastAsia="Calibri"/>
+          <w:sz w:val="22"/>
+        </w:rPr>
+        <w:t>.</w:t>
+      </w:r>
+    </w:p>
     <w:sectPr>
       <w:pgSz w:w="12240" w:h="15840"/>
       <w:pgMar w:top="1152" w:right="1296" w:bottom="1152" w:left="1296" w:header="720" w:footer="720" w:gutter="0"/>

</xml_diff>

<commit_message>
Tie lIndicators bits to TCSView.ini IND#Setup notification lamps.
Document that lIndicators[i] is the NOTIFICATIONS panel on the TCS page, packed from IND1Setup..IND32Setup, and keep those lamps distinct from sThrusterRunning and custom buttons.

Co-authored-by: rodrigogismondi <rodrigogismondi@users.noreply.github.com>
</commit_message>
<xml_diff>
--- a/remas/TCS_STRUCT/Word Document/tcs-logger-mtos-current.docx
+++ b/remas/TCS_STRUCT/Word Document/tcs-logger-mtos-current.docx
@@ -7289,7 +7289,6 @@
         <w:rPr>
           <w:rFonts w:ascii="Calibri" w:hAnsi="Calibri" w:eastAsia="Calibri"/>
           <w:b w:val="0"/>
-          <w:i w:val="0"/>
           <w:sz w:val="22"/>
         </w:rPr>
         <w:t xml:space="preserve">These are project-specific. Labels come from vessel </w:t>
@@ -7298,8 +7297,6 @@
         <w:rPr>
           <w:rFonts w:ascii="Consolas" w:hAnsi="Consolas" w:eastAsia="Consolas"/>
           <w:b w:val="0"/>
-          <w:i w:val="0"/>
-          <w:color w:val="333333"/>
           <w:sz w:val="20"/>
         </w:rPr>
         <w:t>TCSView.ini</w:t>
@@ -7308,10 +7305,158 @@
         <w:rPr>
           <w:rFonts w:ascii="Calibri" w:hAnsi="Calibri" w:eastAsia="Calibri"/>
           <w:b w:val="0"/>
-          <w:i w:val="0"/>
           <w:sz w:val="22"/>
         </w:rPr>
         <w:t xml:space="preserve"> / GUI config, not from a global standard.</w:t>
+      </w:r>
+    </w:p>
+    <w:p>
+      <w:pPr>
+        <w:pStyle w:val="Normal"/>
+      </w:pPr>
+      <w:r>
+        <w:rPr>
+          <w:rFonts w:ascii="Consolas" w:hAnsi="Consolas" w:eastAsia="Consolas"/>
+          <w:b w:val="0"/>
+          <w:sz w:val="20"/>
+        </w:rPr>
+        <w:t>lIndicators[i]</w:t>
+      </w:r>
+      <w:r>
+        <w:rPr>
+          <w:rFonts w:ascii="Calibri" w:hAnsi="Calibri" w:eastAsia="Calibri"/>
+          <w:b w:val="0"/>
+          <w:sz w:val="22"/>
+        </w:rPr>
+        <w:t xml:space="preserve"> is the live on/off state of the NOTIFICATIONS lamps on the TCS page for thruster slot </w:t>
+      </w:r>
+      <w:r>
+        <w:rPr>
+          <w:rFonts w:ascii="Consolas" w:hAnsi="Consolas" w:eastAsia="Consolas"/>
+          <w:b w:val="0"/>
+          <w:sz w:val="20"/>
+        </w:rPr>
+        <w:t>i</w:t>
+      </w:r>
+      <w:r>
+        <w:rPr>
+          <w:rFonts w:ascii="Calibri" w:hAnsi="Calibri" w:eastAsia="Calibri"/>
+          <w:b w:val="0"/>
+          <w:sz w:val="22"/>
+        </w:rPr>
+        <w:t xml:space="preserve">. Those lamps are configured in </w:t>
+      </w:r>
+      <w:r>
+        <w:rPr>
+          <w:rFonts w:ascii="Consolas" w:hAnsi="Consolas" w:eastAsia="Consolas"/>
+          <w:b w:val="0"/>
+          <w:sz w:val="20"/>
+        </w:rPr>
+        <w:t>TCSView.ini</w:t>
+      </w:r>
+      <w:r>
+        <w:rPr>
+          <w:rFonts w:ascii="Calibri" w:hAnsi="Calibri" w:eastAsia="Calibri"/>
+          <w:b w:val="0"/>
+          <w:sz w:val="22"/>
+        </w:rPr>
+        <w:t xml:space="preserve"> as </w:t>
+      </w:r>
+      <w:r>
+        <w:rPr>
+          <w:rFonts w:ascii="Consolas" w:hAnsi="Consolas" w:eastAsia="Consolas"/>
+          <w:b w:val="0"/>
+          <w:sz w:val="20"/>
+        </w:rPr>
+        <w:t>IND#Setup</w:t>
+      </w:r>
+      <w:r>
+        <w:rPr>
+          <w:rFonts w:ascii="Calibri" w:hAnsi="Calibri" w:eastAsia="Calibri"/>
+          <w:b w:val="0"/>
+          <w:sz w:val="22"/>
+        </w:rPr>
+        <w:t xml:space="preserve"> (</w:t>
+      </w:r>
+      <w:r>
+        <w:rPr>
+          <w:rFonts w:ascii="Consolas" w:hAnsi="Consolas" w:eastAsia="Consolas"/>
+          <w:b w:val="0"/>
+          <w:sz w:val="20"/>
+        </w:rPr>
+        <w:t>IND1Setup</w:t>
+      </w:r>
+      <w:r>
+        <w:rPr>
+          <w:rFonts w:ascii="Calibri" w:hAnsi="Calibri" w:eastAsia="Calibri"/>
+          <w:b w:val="0"/>
+          <w:sz w:val="22"/>
+        </w:rPr>
+        <w:t xml:space="preserve"> ... </w:t>
+      </w:r>
+      <w:r>
+        <w:rPr>
+          <w:rFonts w:ascii="Consolas" w:hAnsi="Consolas" w:eastAsia="Consolas"/>
+          <w:b w:val="0"/>
+          <w:sz w:val="20"/>
+        </w:rPr>
+        <w:t>IND32Setup</w:t>
+      </w:r>
+      <w:r>
+        <w:rPr>
+          <w:rFonts w:ascii="Calibri" w:hAnsi="Calibri" w:eastAsia="Calibri"/>
+          <w:b w:val="0"/>
+          <w:sz w:val="22"/>
+        </w:rPr>
+        <w:t xml:space="preserve">). The payload carries only the lamp bits, not the text. Button widgets such as Start/Stop/Reset are </w:t>
+      </w:r>
+      <w:r>
+        <w:rPr>
+          <w:rFonts w:ascii="Consolas" w:hAnsi="Consolas" w:eastAsia="Consolas"/>
+          <w:b w:val="0"/>
+          <w:sz w:val="20"/>
+        </w:rPr>
+        <w:t>sButtonInd</w:t>
+      </w:r>
+      <w:r>
+        <w:rPr>
+          <w:rFonts w:ascii="Calibri" w:hAnsi="Calibri" w:eastAsia="Calibri"/>
+          <w:b w:val="0"/>
+          <w:sz w:val="22"/>
+        </w:rPr>
+        <w:t xml:space="preserve"> / </w:t>
+      </w:r>
+      <w:r>
+        <w:rPr>
+          <w:rFonts w:ascii="Consolas" w:hAnsi="Consolas" w:eastAsia="Consolas"/>
+          <w:b w:val="0"/>
+          <w:sz w:val="20"/>
+        </w:rPr>
+        <w:t>sButtonDisable</w:t>
+      </w:r>
+      <w:r>
+        <w:rPr>
+          <w:rFonts w:ascii="Calibri" w:hAnsi="Calibri" w:eastAsia="Calibri"/>
+          <w:b w:val="0"/>
+          <w:sz w:val="22"/>
+        </w:rPr>
+        <w:t xml:space="preserve">, not </w:t>
+      </w:r>
+      <w:r>
+        <w:rPr>
+          <w:rFonts w:ascii="Consolas" w:hAnsi="Consolas" w:eastAsia="Consolas"/>
+          <w:b w:val="0"/>
+          <w:sz w:val="20"/>
+        </w:rPr>
+        <w:t>lIndicators</w:t>
+      </w:r>
+      <w:r>
+        <w:rPr>
+          <w:rFonts w:ascii="Calibri" w:hAnsi="Calibri" w:eastAsia="Calibri"/>
+          <w:b w:val="0"/>
+          <w:sz w:val="22"/>
+        </w:rPr>
+        <w:t>.</w:t>
       </w:r>
     </w:p>
     <w:tbl>
@@ -7408,25 +7553,14 @@
             <w:tcW w:type="dxa" w:w="3216"/>
           </w:tcPr>
           <w:p>
-            <w:r/>
-            <w:r>
-              <w:rPr>
-                <w:rFonts w:ascii="Calibri" w:hAnsi="Calibri" w:eastAsia="Calibri"/>
-                <w:b w:val="0"/>
-                <w:i w:val="0"/>
-                <w:sz w:val="20"/>
-              </w:rPr>
-              <w:t xml:space="preserve">Custom digital lamps for thruster </w:t>
-            </w:r>
-            <w:r>
-              <w:rPr>
-                <w:rFonts w:ascii="Consolas" w:hAnsi="Consolas" w:eastAsia="Consolas"/>
-                <w:b w:val="0"/>
-                <w:i w:val="0"/>
-                <w:color w:val="333333"/>
-                <w:sz w:val="18"/>
-              </w:rPr>
-              <w:t>i</w:t>
+            <w:r>
+              <w:rPr>
+                <w:rFonts w:ascii="Calibri" w:hAnsi="Calibri" w:eastAsia="Calibri"/>
+                <w:b w:val="0"/>
+                <w:color w:val="000000"/>
+                <w:sz w:val="20"/>
+              </w:rPr>
+              <w:t>NOTIFICATIONS lamps for thruster i</w:t>
             </w:r>
           </w:p>
         </w:tc>
@@ -7439,11 +7573,10 @@
               <w:rPr>
                 <w:rFonts w:ascii="Calibri" w:hAnsi="Calibri" w:eastAsia="Calibri"/>
                 <w:b w:val="0"/>
-                <w:i w:val="0"/>
                 <w:color w:val="000000"/>
                 <w:sz w:val="20"/>
               </w:rPr>
-              <w:t>32-bit bitfield. Bit n = digital indicator channel n (0..31). Bit set = lamp on. Combined value is the sum of those bit weights. Lamp text is vessel-defined in TCSView.ini.</w:t>
+              <w:t>32-bit bitfield of IND#Setup lamps. IND1Setup = bit 0, IND2Setup = bit 1, ... IND32Setup = bit 31. Bit set = lamp on. Combined value is the sum of those bit weights. Lamp text comes from that IND#Setup entry.</w:t>
             </w:r>
           </w:p>
         </w:tc>
@@ -7768,6 +7901,7 @@
       <w:r>
         <w:rPr>
           <w:rFonts w:ascii="Calibri" w:hAnsi="Calibri" w:eastAsia="Calibri"/>
+          <w:b w:val="0"/>
           <w:sz w:val="22"/>
         </w:rPr>
         <w:t xml:space="preserve">For </w:t>
@@ -7775,6 +7909,7 @@
       <w:r>
         <w:rPr>
           <w:rFonts w:ascii="Consolas" w:hAnsi="Consolas" w:eastAsia="Consolas"/>
+          <w:b w:val="0"/>
           <w:sz w:val="20"/>
         </w:rPr>
         <w:t>lIndicators[i]</w:t>
@@ -7782,6 +7917,7 @@
       <w:r>
         <w:rPr>
           <w:rFonts w:ascii="Calibri" w:hAnsi="Calibri" w:eastAsia="Calibri"/>
+          <w:b w:val="0"/>
           <w:sz w:val="22"/>
         </w:rPr>
         <w:t xml:space="preserve">, each value is one 32-bit number for thruster slot </w:t>
@@ -7789,6 +7925,7 @@
       <w:r>
         <w:rPr>
           <w:rFonts w:ascii="Consolas" w:hAnsi="Consolas" w:eastAsia="Consolas"/>
+          <w:b w:val="0"/>
           <w:sz w:val="20"/>
         </w:rPr>
         <w:t>i</w:t>
@@ -7796,51 +7933,42 @@
       <w:r>
         <w:rPr>
           <w:rFonts w:ascii="Calibri" w:hAnsi="Calibri" w:eastAsia="Calibri"/>
+          <w:b w:val="0"/>
           <w:sz w:val="22"/>
         </w:rPr>
-        <w:t xml:space="preserve">. Channel </w:t>
+        <w:t xml:space="preserve">. </w:t>
       </w:r>
       <w:r>
         <w:rPr>
           <w:rFonts w:ascii="Consolas" w:hAnsi="Consolas" w:eastAsia="Consolas"/>
+          <w:b w:val="0"/>
           <w:sz w:val="20"/>
         </w:rPr>
-        <w:t>0</w:t>
+        <w:t>TCSView.ini</w:t>
       </w:r>
       <w:r>
         <w:rPr>
           <w:rFonts w:ascii="Calibri" w:hAnsi="Calibri" w:eastAsia="Calibri"/>
+          <w:b w:val="0"/>
           <w:sz w:val="22"/>
         </w:rPr>
-        <w:t xml:space="preserve"> = bit 0, channel </w:t>
+        <w:t xml:space="preserve"> keys are 1-based (</w:t>
       </w:r>
       <w:r>
         <w:rPr>
           <w:rFonts w:ascii="Consolas" w:hAnsi="Consolas" w:eastAsia="Consolas"/>
+          <w:b w:val="0"/>
           <w:sz w:val="20"/>
         </w:rPr>
-        <w:t>1</w:t>
+        <w:t>IND1Setup</w:t>
       </w:r>
       <w:r>
         <w:rPr>
           <w:rFonts w:ascii="Calibri" w:hAnsi="Calibri" w:eastAsia="Calibri"/>
+          <w:b w:val="0"/>
           <w:sz w:val="22"/>
         </w:rPr>
-        <w:t xml:space="preserve"> = bit 1, ... channel </w:t>
-      </w:r>
-      <w:r>
-        <w:rPr>
-          <w:rFonts w:ascii="Consolas" w:hAnsi="Consolas" w:eastAsia="Consolas"/>
-          <w:sz w:val="20"/>
-        </w:rPr>
-        <w:t>31</w:t>
-      </w:r>
-      <w:r>
-        <w:rPr>
-          <w:rFonts w:ascii="Calibri" w:hAnsi="Calibri" w:eastAsia="Calibri"/>
-          <w:sz w:val="22"/>
-        </w:rPr>
-        <w:t xml:space="preserve"> = bit 31:</w:t>
+        <w:t xml:space="preserve"> is channel 0 / bit 0):</w:t>
       </w:r>
     </w:p>
     <w:p>
@@ -7879,7 +8007,6 @@
               <w:rPr>
                 <w:rFonts w:ascii="Calibri" w:hAnsi="Calibri" w:eastAsia="Calibri"/>
                 <w:b/>
-                <w:i w:val="0"/>
                 <w:color w:val="FFFFFF"/>
                 <w:sz w:val="20"/>
               </w:rPr>
@@ -7900,11 +8027,10 @@
               <w:rPr>
                 <w:rFonts w:ascii="Calibri" w:hAnsi="Calibri" w:eastAsia="Calibri"/>
                 <w:b/>
-                <w:i w:val="0"/>
                 <w:color w:val="FFFFFF"/>
                 <w:sz w:val="20"/>
               </w:rPr>
-              <w:t>Bit</w:t>
+              <w:t>TCSView.ini key</w:t>
             </w:r>
           </w:p>
         </w:tc>
@@ -7921,7 +8047,6 @@
               <w:rPr>
                 <w:rFonts w:ascii="Calibri" w:hAnsi="Calibri" w:eastAsia="Calibri"/>
                 <w:b/>
-                <w:i w:val="0"/>
                 <w:color w:val="FFFFFF"/>
                 <w:sz w:val="20"/>
               </w:rPr>
@@ -7943,7 +8068,6 @@
               <w:rPr>
                 <w:rFonts w:ascii="Calibri" w:hAnsi="Calibri" w:eastAsia="Calibri"/>
                 <w:b w:val="0"/>
-                <w:i w:val="0"/>
                 <w:color w:val="000000"/>
                 <w:sz w:val="20"/>
               </w:rPr>
@@ -7963,11 +8087,10 @@
               <w:rPr>
                 <w:rFonts w:ascii="Calibri" w:hAnsi="Calibri" w:eastAsia="Calibri"/>
                 <w:b w:val="0"/>
-                <w:i w:val="0"/>
                 <w:color w:val="000000"/>
                 <w:sz w:val="20"/>
               </w:rPr>
-              <w:t>0</w:t>
+              <w:t>IND1Setup</w:t>
             </w:r>
           </w:p>
         </w:tc>
@@ -7983,7 +8106,6 @@
               <w:rPr>
                 <w:rFonts w:ascii="Calibri" w:hAnsi="Calibri" w:eastAsia="Calibri"/>
                 <w:b w:val="0"/>
-                <w:i w:val="0"/>
                 <w:color w:val="000000"/>
                 <w:sz w:val="20"/>
               </w:rPr>
@@ -8006,7 +8128,6 @@
               <w:rPr>
                 <w:rFonts w:ascii="Calibri" w:hAnsi="Calibri" w:eastAsia="Calibri"/>
                 <w:b w:val="0"/>
-                <w:i w:val="0"/>
                 <w:color w:val="000000"/>
                 <w:sz w:val="20"/>
               </w:rPr>
@@ -8027,11 +8148,10 @@
               <w:rPr>
                 <w:rFonts w:ascii="Calibri" w:hAnsi="Calibri" w:eastAsia="Calibri"/>
                 <w:b w:val="0"/>
-                <w:i w:val="0"/>
                 <w:color w:val="000000"/>
                 <w:sz w:val="20"/>
               </w:rPr>
-              <w:t>1</w:t>
+              <w:t>IND2Setup</w:t>
             </w:r>
           </w:p>
         </w:tc>
@@ -8048,7 +8168,6 @@
               <w:rPr>
                 <w:rFonts w:ascii="Calibri" w:hAnsi="Calibri" w:eastAsia="Calibri"/>
                 <w:b w:val="0"/>
-                <w:i w:val="0"/>
                 <w:color w:val="000000"/>
                 <w:sz w:val="20"/>
               </w:rPr>
@@ -8070,7 +8189,6 @@
               <w:rPr>
                 <w:rFonts w:ascii="Calibri" w:hAnsi="Calibri" w:eastAsia="Calibri"/>
                 <w:b w:val="0"/>
-                <w:i w:val="0"/>
                 <w:color w:val="000000"/>
                 <w:sz w:val="20"/>
               </w:rPr>
@@ -8090,11 +8208,10 @@
               <w:rPr>
                 <w:rFonts w:ascii="Calibri" w:hAnsi="Calibri" w:eastAsia="Calibri"/>
                 <w:b w:val="0"/>
-                <w:i w:val="0"/>
                 <w:color w:val="000000"/>
                 <w:sz w:val="20"/>
               </w:rPr>
-              <w:t>2</w:t>
+              <w:t>IND3Setup</w:t>
             </w:r>
           </w:p>
         </w:tc>
@@ -8110,7 +8227,6 @@
               <w:rPr>
                 <w:rFonts w:ascii="Calibri" w:hAnsi="Calibri" w:eastAsia="Calibri"/>
                 <w:b w:val="0"/>
-                <w:i w:val="0"/>
                 <w:color w:val="000000"/>
                 <w:sz w:val="20"/>
               </w:rPr>
@@ -8133,7 +8249,6 @@
               <w:rPr>
                 <w:rFonts w:ascii="Calibri" w:hAnsi="Calibri" w:eastAsia="Calibri"/>
                 <w:b w:val="0"/>
-                <w:i w:val="0"/>
                 <w:color w:val="000000"/>
                 <w:sz w:val="20"/>
               </w:rPr>
@@ -8154,11 +8269,10 @@
               <w:rPr>
                 <w:rFonts w:ascii="Calibri" w:hAnsi="Calibri" w:eastAsia="Calibri"/>
                 <w:b w:val="0"/>
-                <w:i w:val="0"/>
                 <w:color w:val="000000"/>
                 <w:sz w:val="20"/>
               </w:rPr>
-              <w:t>3</w:t>
+              <w:t>IND4Setup</w:t>
             </w:r>
           </w:p>
         </w:tc>
@@ -8175,7 +8289,6 @@
               <w:rPr>
                 <w:rFonts w:ascii="Calibri" w:hAnsi="Calibri" w:eastAsia="Calibri"/>
                 <w:b w:val="0"/>
-                <w:i w:val="0"/>
                 <w:color w:val="000000"/>
                 <w:sz w:val="20"/>
               </w:rPr>
@@ -8197,7 +8310,6 @@
               <w:rPr>
                 <w:rFonts w:ascii="Calibri" w:hAnsi="Calibri" w:eastAsia="Calibri"/>
                 <w:b w:val="0"/>
-                <w:i w:val="0"/>
                 <w:color w:val="000000"/>
                 <w:sz w:val="20"/>
               </w:rPr>
@@ -8217,11 +8329,10 @@
               <w:rPr>
                 <w:rFonts w:ascii="Calibri" w:hAnsi="Calibri" w:eastAsia="Calibri"/>
                 <w:b w:val="0"/>
-                <w:i w:val="0"/>
                 <w:color w:val="000000"/>
                 <w:sz w:val="20"/>
               </w:rPr>
-              <w:t>4</w:t>
+              <w:t>IND5Setup</w:t>
             </w:r>
           </w:p>
         </w:tc>
@@ -8237,7 +8348,6 @@
               <w:rPr>
                 <w:rFonts w:ascii="Calibri" w:hAnsi="Calibri" w:eastAsia="Calibri"/>
                 <w:b w:val="0"/>
-                <w:i w:val="0"/>
                 <w:color w:val="000000"/>
                 <w:sz w:val="20"/>
               </w:rPr>
@@ -8260,7 +8370,6 @@
               <w:rPr>
                 <w:rFonts w:ascii="Calibri" w:hAnsi="Calibri" w:eastAsia="Calibri"/>
                 <w:b w:val="0"/>
-                <w:i w:val="0"/>
                 <w:color w:val="000000"/>
                 <w:sz w:val="20"/>
               </w:rPr>
@@ -8281,11 +8390,10 @@
               <w:rPr>
                 <w:rFonts w:ascii="Calibri" w:hAnsi="Calibri" w:eastAsia="Calibri"/>
                 <w:b w:val="0"/>
-                <w:i w:val="0"/>
                 <w:color w:val="000000"/>
                 <w:sz w:val="20"/>
               </w:rPr>
-              <w:t>5</w:t>
+              <w:t>IND6Setup</w:t>
             </w:r>
           </w:p>
         </w:tc>
@@ -8302,7 +8410,6 @@
               <w:rPr>
                 <w:rFonts w:ascii="Calibri" w:hAnsi="Calibri" w:eastAsia="Calibri"/>
                 <w:b w:val="0"/>
-                <w:i w:val="0"/>
                 <w:color w:val="000000"/>
                 <w:sz w:val="20"/>
               </w:rPr>
@@ -8324,7 +8431,6 @@
               <w:rPr>
                 <w:rFonts w:ascii="Calibri" w:hAnsi="Calibri" w:eastAsia="Calibri"/>
                 <w:b w:val="0"/>
-                <w:i w:val="0"/>
                 <w:color w:val="000000"/>
                 <w:sz w:val="20"/>
               </w:rPr>
@@ -8344,11 +8450,10 @@
               <w:rPr>
                 <w:rFonts w:ascii="Calibri" w:hAnsi="Calibri" w:eastAsia="Calibri"/>
                 <w:b w:val="0"/>
-                <w:i w:val="0"/>
                 <w:color w:val="000000"/>
                 <w:sz w:val="20"/>
               </w:rPr>
-              <w:t>6</w:t>
+              <w:t>IND7Setup</w:t>
             </w:r>
           </w:p>
         </w:tc>
@@ -8364,7 +8469,6 @@
               <w:rPr>
                 <w:rFonts w:ascii="Calibri" w:hAnsi="Calibri" w:eastAsia="Calibri"/>
                 <w:b w:val="0"/>
-                <w:i w:val="0"/>
                 <w:color w:val="000000"/>
                 <w:sz w:val="20"/>
               </w:rPr>
@@ -8387,7 +8491,6 @@
               <w:rPr>
                 <w:rFonts w:ascii="Calibri" w:hAnsi="Calibri" w:eastAsia="Calibri"/>
                 <w:b w:val="0"/>
-                <w:i w:val="0"/>
                 <w:color w:val="000000"/>
                 <w:sz w:val="20"/>
               </w:rPr>
@@ -8408,11 +8511,10 @@
               <w:rPr>
                 <w:rFonts w:ascii="Calibri" w:hAnsi="Calibri" w:eastAsia="Calibri"/>
                 <w:b w:val="0"/>
-                <w:i w:val="0"/>
                 <w:color w:val="000000"/>
                 <w:sz w:val="20"/>
               </w:rPr>
-              <w:t>7</w:t>
+              <w:t>IND8Setup</w:t>
             </w:r>
           </w:p>
         </w:tc>
@@ -8429,7 +8531,6 @@
               <w:rPr>
                 <w:rFonts w:ascii="Calibri" w:hAnsi="Calibri" w:eastAsia="Calibri"/>
                 <w:b w:val="0"/>
-                <w:i w:val="0"/>
                 <w:color w:val="000000"/>
                 <w:sz w:val="20"/>
               </w:rPr>
@@ -8451,7 +8552,6 @@
               <w:rPr>
                 <w:rFonts w:ascii="Calibri" w:hAnsi="Calibri" w:eastAsia="Calibri"/>
                 <w:b w:val="0"/>
-                <w:i w:val="0"/>
                 <w:color w:val="000000"/>
                 <w:sz w:val="20"/>
               </w:rPr>
@@ -8471,11 +8571,10 @@
               <w:rPr>
                 <w:rFonts w:ascii="Calibri" w:hAnsi="Calibri" w:eastAsia="Calibri"/>
                 <w:b w:val="0"/>
-                <w:i w:val="0"/>
                 <w:color w:val="000000"/>
                 <w:sz w:val="20"/>
               </w:rPr>
-              <w:t>8</w:t>
+              <w:t>IND9Setup</w:t>
             </w:r>
           </w:p>
         </w:tc>
@@ -8491,7 +8590,6 @@
               <w:rPr>
                 <w:rFonts w:ascii="Calibri" w:hAnsi="Calibri" w:eastAsia="Calibri"/>
                 <w:b w:val="0"/>
-                <w:i w:val="0"/>
                 <w:color w:val="000000"/>
                 <w:sz w:val="20"/>
               </w:rPr>
@@ -8514,7 +8612,6 @@
               <w:rPr>
                 <w:rFonts w:ascii="Calibri" w:hAnsi="Calibri" w:eastAsia="Calibri"/>
                 <w:b w:val="0"/>
-                <w:i w:val="0"/>
                 <w:color w:val="000000"/>
                 <w:sz w:val="20"/>
               </w:rPr>
@@ -8535,11 +8632,10 @@
               <w:rPr>
                 <w:rFonts w:ascii="Calibri" w:hAnsi="Calibri" w:eastAsia="Calibri"/>
                 <w:b w:val="0"/>
-                <w:i w:val="0"/>
                 <w:color w:val="000000"/>
                 <w:sz w:val="20"/>
               </w:rPr>
-              <w:t>9</w:t>
+              <w:t>IND10Setup</w:t>
             </w:r>
           </w:p>
         </w:tc>
@@ -8556,7 +8652,6 @@
               <w:rPr>
                 <w:rFonts w:ascii="Calibri" w:hAnsi="Calibri" w:eastAsia="Calibri"/>
                 <w:b w:val="0"/>
-                <w:i w:val="0"/>
                 <w:color w:val="000000"/>
                 <w:sz w:val="20"/>
               </w:rPr>
@@ -8578,7 +8673,6 @@
               <w:rPr>
                 <w:rFonts w:ascii="Calibri" w:hAnsi="Calibri" w:eastAsia="Calibri"/>
                 <w:b w:val="0"/>
-                <w:i w:val="0"/>
                 <w:color w:val="000000"/>
                 <w:sz w:val="20"/>
               </w:rPr>
@@ -8598,11 +8692,10 @@
               <w:rPr>
                 <w:rFonts w:ascii="Calibri" w:hAnsi="Calibri" w:eastAsia="Calibri"/>
                 <w:b w:val="0"/>
-                <w:i w:val="0"/>
                 <w:color w:val="000000"/>
                 <w:sz w:val="20"/>
               </w:rPr>
-              <w:t>10</w:t>
+              <w:t>IND11Setup</w:t>
             </w:r>
           </w:p>
         </w:tc>
@@ -8618,7 +8711,6 @@
               <w:rPr>
                 <w:rFonts w:ascii="Calibri" w:hAnsi="Calibri" w:eastAsia="Calibri"/>
                 <w:b w:val="0"/>
-                <w:i w:val="0"/>
                 <w:color w:val="000000"/>
                 <w:sz w:val="20"/>
               </w:rPr>
@@ -8641,7 +8733,6 @@
               <w:rPr>
                 <w:rFonts w:ascii="Calibri" w:hAnsi="Calibri" w:eastAsia="Calibri"/>
                 <w:b w:val="0"/>
-                <w:i w:val="0"/>
                 <w:color w:val="000000"/>
                 <w:sz w:val="20"/>
               </w:rPr>
@@ -8662,11 +8753,10 @@
               <w:rPr>
                 <w:rFonts w:ascii="Calibri" w:hAnsi="Calibri" w:eastAsia="Calibri"/>
                 <w:b w:val="0"/>
-                <w:i w:val="0"/>
                 <w:color w:val="000000"/>
                 <w:sz w:val="20"/>
               </w:rPr>
-              <w:t>11</w:t>
+              <w:t>IND12Setup</w:t>
             </w:r>
           </w:p>
         </w:tc>
@@ -8683,7 +8773,6 @@
               <w:rPr>
                 <w:rFonts w:ascii="Calibri" w:hAnsi="Calibri" w:eastAsia="Calibri"/>
                 <w:b w:val="0"/>
-                <w:i w:val="0"/>
                 <w:color w:val="000000"/>
                 <w:sz w:val="20"/>
               </w:rPr>
@@ -8705,7 +8794,6 @@
               <w:rPr>
                 <w:rFonts w:ascii="Calibri" w:hAnsi="Calibri" w:eastAsia="Calibri"/>
                 <w:b w:val="0"/>
-                <w:i w:val="0"/>
                 <w:color w:val="000000"/>
                 <w:sz w:val="20"/>
               </w:rPr>
@@ -8725,11 +8813,10 @@
               <w:rPr>
                 <w:rFonts w:ascii="Calibri" w:hAnsi="Calibri" w:eastAsia="Calibri"/>
                 <w:b w:val="0"/>
-                <w:i w:val="0"/>
                 <w:color w:val="000000"/>
                 <w:sz w:val="20"/>
               </w:rPr>
-              <w:t>12</w:t>
+              <w:t>IND13Setup</w:t>
             </w:r>
           </w:p>
         </w:tc>
@@ -8745,7 +8832,6 @@
               <w:rPr>
                 <w:rFonts w:ascii="Calibri" w:hAnsi="Calibri" w:eastAsia="Calibri"/>
                 <w:b w:val="0"/>
-                <w:i w:val="0"/>
                 <w:color w:val="000000"/>
                 <w:sz w:val="20"/>
               </w:rPr>
@@ -8768,7 +8854,6 @@
               <w:rPr>
                 <w:rFonts w:ascii="Calibri" w:hAnsi="Calibri" w:eastAsia="Calibri"/>
                 <w:b w:val="0"/>
-                <w:i w:val="0"/>
                 <w:color w:val="000000"/>
                 <w:sz w:val="20"/>
               </w:rPr>
@@ -8789,11 +8874,10 @@
               <w:rPr>
                 <w:rFonts w:ascii="Calibri" w:hAnsi="Calibri" w:eastAsia="Calibri"/>
                 <w:b w:val="0"/>
-                <w:i w:val="0"/>
                 <w:color w:val="000000"/>
                 <w:sz w:val="20"/>
               </w:rPr>
-              <w:t>13</w:t>
+              <w:t>IND14Setup</w:t>
             </w:r>
           </w:p>
         </w:tc>
@@ -8810,7 +8894,6 @@
               <w:rPr>
                 <w:rFonts w:ascii="Calibri" w:hAnsi="Calibri" w:eastAsia="Calibri"/>
                 <w:b w:val="0"/>
-                <w:i w:val="0"/>
                 <w:color w:val="000000"/>
                 <w:sz w:val="20"/>
               </w:rPr>
@@ -8832,7 +8915,6 @@
               <w:rPr>
                 <w:rFonts w:ascii="Calibri" w:hAnsi="Calibri" w:eastAsia="Calibri"/>
                 <w:b w:val="0"/>
-                <w:i w:val="0"/>
                 <w:color w:val="000000"/>
                 <w:sz w:val="20"/>
               </w:rPr>
@@ -8852,11 +8934,10 @@
               <w:rPr>
                 <w:rFonts w:ascii="Calibri" w:hAnsi="Calibri" w:eastAsia="Calibri"/>
                 <w:b w:val="0"/>
-                <w:i w:val="0"/>
                 <w:color w:val="000000"/>
                 <w:sz w:val="20"/>
               </w:rPr>
-              <w:t>14</w:t>
+              <w:t>IND15Setup</w:t>
             </w:r>
           </w:p>
         </w:tc>
@@ -8872,7 +8953,6 @@
               <w:rPr>
                 <w:rFonts w:ascii="Calibri" w:hAnsi="Calibri" w:eastAsia="Calibri"/>
                 <w:b w:val="0"/>
-                <w:i w:val="0"/>
                 <w:color w:val="000000"/>
                 <w:sz w:val="20"/>
               </w:rPr>
@@ -8895,7 +8975,6 @@
               <w:rPr>
                 <w:rFonts w:ascii="Calibri" w:hAnsi="Calibri" w:eastAsia="Calibri"/>
                 <w:b w:val="0"/>
-                <w:i w:val="0"/>
                 <w:color w:val="000000"/>
                 <w:sz w:val="20"/>
               </w:rPr>
@@ -8916,11 +8995,10 @@
               <w:rPr>
                 <w:rFonts w:ascii="Calibri" w:hAnsi="Calibri" w:eastAsia="Calibri"/>
                 <w:b w:val="0"/>
-                <w:i w:val="0"/>
                 <w:color w:val="000000"/>
                 <w:sz w:val="20"/>
               </w:rPr>
-              <w:t>15</w:t>
+              <w:t>IND16Setup</w:t>
             </w:r>
           </w:p>
         </w:tc>
@@ -8937,7 +9015,6 @@
               <w:rPr>
                 <w:rFonts w:ascii="Calibri" w:hAnsi="Calibri" w:eastAsia="Calibri"/>
                 <w:b w:val="0"/>
-                <w:i w:val="0"/>
                 <w:color w:val="000000"/>
                 <w:sz w:val="20"/>
               </w:rPr>
@@ -8959,7 +9036,6 @@
               <w:rPr>
                 <w:rFonts w:ascii="Calibri" w:hAnsi="Calibri" w:eastAsia="Calibri"/>
                 <w:b w:val="0"/>
-                <w:i w:val="0"/>
                 <w:color w:val="000000"/>
                 <w:sz w:val="20"/>
               </w:rPr>
@@ -8979,11 +9055,10 @@
               <w:rPr>
                 <w:rFonts w:ascii="Calibri" w:hAnsi="Calibri" w:eastAsia="Calibri"/>
                 <w:b w:val="0"/>
-                <w:i w:val="0"/>
                 <w:color w:val="000000"/>
                 <w:sz w:val="20"/>
               </w:rPr>
-              <w:t>16</w:t>
+              <w:t>IND17Setup</w:t>
             </w:r>
           </w:p>
         </w:tc>
@@ -8999,7 +9074,6 @@
               <w:rPr>
                 <w:rFonts w:ascii="Calibri" w:hAnsi="Calibri" w:eastAsia="Calibri"/>
                 <w:b w:val="0"/>
-                <w:i w:val="0"/>
                 <w:color w:val="000000"/>
                 <w:sz w:val="20"/>
               </w:rPr>
@@ -9022,7 +9096,6 @@
               <w:rPr>
                 <w:rFonts w:ascii="Calibri" w:hAnsi="Calibri" w:eastAsia="Calibri"/>
                 <w:b w:val="0"/>
-                <w:i w:val="0"/>
                 <w:color w:val="000000"/>
                 <w:sz w:val="20"/>
               </w:rPr>
@@ -9043,11 +9116,10 @@
               <w:rPr>
                 <w:rFonts w:ascii="Calibri" w:hAnsi="Calibri" w:eastAsia="Calibri"/>
                 <w:b w:val="0"/>
-                <w:i w:val="0"/>
                 <w:color w:val="000000"/>
                 <w:sz w:val="20"/>
               </w:rPr>
-              <w:t>17</w:t>
+              <w:t>IND18Setup</w:t>
             </w:r>
           </w:p>
         </w:tc>
@@ -9064,7 +9136,6 @@
               <w:rPr>
                 <w:rFonts w:ascii="Calibri" w:hAnsi="Calibri" w:eastAsia="Calibri"/>
                 <w:b w:val="0"/>
-                <w:i w:val="0"/>
                 <w:color w:val="000000"/>
                 <w:sz w:val="20"/>
               </w:rPr>
@@ -9086,7 +9157,6 @@
               <w:rPr>
                 <w:rFonts w:ascii="Calibri" w:hAnsi="Calibri" w:eastAsia="Calibri"/>
                 <w:b w:val="0"/>
-                <w:i w:val="0"/>
                 <w:color w:val="000000"/>
                 <w:sz w:val="20"/>
               </w:rPr>
@@ -9106,11 +9176,10 @@
               <w:rPr>
                 <w:rFonts w:ascii="Calibri" w:hAnsi="Calibri" w:eastAsia="Calibri"/>
                 <w:b w:val="0"/>
-                <w:i w:val="0"/>
                 <w:color w:val="000000"/>
                 <w:sz w:val="20"/>
               </w:rPr>
-              <w:t>18</w:t>
+              <w:t>IND19Setup</w:t>
             </w:r>
           </w:p>
         </w:tc>
@@ -9126,7 +9195,6 @@
               <w:rPr>
                 <w:rFonts w:ascii="Calibri" w:hAnsi="Calibri" w:eastAsia="Calibri"/>
                 <w:b w:val="0"/>
-                <w:i w:val="0"/>
                 <w:color w:val="000000"/>
                 <w:sz w:val="20"/>
               </w:rPr>
@@ -9149,7 +9217,6 @@
               <w:rPr>
                 <w:rFonts w:ascii="Calibri" w:hAnsi="Calibri" w:eastAsia="Calibri"/>
                 <w:b w:val="0"/>
-                <w:i w:val="0"/>
                 <w:color w:val="000000"/>
                 <w:sz w:val="20"/>
               </w:rPr>
@@ -9170,11 +9237,10 @@
               <w:rPr>
                 <w:rFonts w:ascii="Calibri" w:hAnsi="Calibri" w:eastAsia="Calibri"/>
                 <w:b w:val="0"/>
-                <w:i w:val="0"/>
                 <w:color w:val="000000"/>
                 <w:sz w:val="20"/>
               </w:rPr>
-              <w:t>19</w:t>
+              <w:t>IND20Setup</w:t>
             </w:r>
           </w:p>
         </w:tc>
@@ -9191,7 +9257,6 @@
               <w:rPr>
                 <w:rFonts w:ascii="Calibri" w:hAnsi="Calibri" w:eastAsia="Calibri"/>
                 <w:b w:val="0"/>
-                <w:i w:val="0"/>
                 <w:color w:val="000000"/>
                 <w:sz w:val="20"/>
               </w:rPr>
@@ -9213,7 +9278,6 @@
               <w:rPr>
                 <w:rFonts w:ascii="Calibri" w:hAnsi="Calibri" w:eastAsia="Calibri"/>
                 <w:b w:val="0"/>
-                <w:i w:val="0"/>
                 <w:color w:val="000000"/>
                 <w:sz w:val="20"/>
               </w:rPr>
@@ -9233,11 +9297,10 @@
               <w:rPr>
                 <w:rFonts w:ascii="Calibri" w:hAnsi="Calibri" w:eastAsia="Calibri"/>
                 <w:b w:val="0"/>
-                <w:i w:val="0"/>
                 <w:color w:val="000000"/>
                 <w:sz w:val="20"/>
               </w:rPr>
-              <w:t>20</w:t>
+              <w:t>IND21Setup</w:t>
             </w:r>
           </w:p>
         </w:tc>
@@ -9253,7 +9316,6 @@
               <w:rPr>
                 <w:rFonts w:ascii="Calibri" w:hAnsi="Calibri" w:eastAsia="Calibri"/>
                 <w:b w:val="0"/>
-                <w:i w:val="0"/>
                 <w:color w:val="000000"/>
                 <w:sz w:val="20"/>
               </w:rPr>
@@ -9276,7 +9338,6 @@
               <w:rPr>
                 <w:rFonts w:ascii="Calibri" w:hAnsi="Calibri" w:eastAsia="Calibri"/>
                 <w:b w:val="0"/>
-                <w:i w:val="0"/>
                 <w:color w:val="000000"/>
                 <w:sz w:val="20"/>
               </w:rPr>
@@ -9297,11 +9358,10 @@
               <w:rPr>
                 <w:rFonts w:ascii="Calibri" w:hAnsi="Calibri" w:eastAsia="Calibri"/>
                 <w:b w:val="0"/>
-                <w:i w:val="0"/>
                 <w:color w:val="000000"/>
                 <w:sz w:val="20"/>
               </w:rPr>
-              <w:t>21</w:t>
+              <w:t>IND22Setup</w:t>
             </w:r>
           </w:p>
         </w:tc>
@@ -9318,7 +9378,6 @@
               <w:rPr>
                 <w:rFonts w:ascii="Calibri" w:hAnsi="Calibri" w:eastAsia="Calibri"/>
                 <w:b w:val="0"/>
-                <w:i w:val="0"/>
                 <w:color w:val="000000"/>
                 <w:sz w:val="20"/>
               </w:rPr>
@@ -9340,7 +9399,6 @@
               <w:rPr>
                 <w:rFonts w:ascii="Calibri" w:hAnsi="Calibri" w:eastAsia="Calibri"/>
                 <w:b w:val="0"/>
-                <w:i w:val="0"/>
                 <w:color w:val="000000"/>
                 <w:sz w:val="20"/>
               </w:rPr>
@@ -9360,11 +9418,10 @@
               <w:rPr>
                 <w:rFonts w:ascii="Calibri" w:hAnsi="Calibri" w:eastAsia="Calibri"/>
                 <w:b w:val="0"/>
-                <w:i w:val="0"/>
                 <w:color w:val="000000"/>
                 <w:sz w:val="20"/>
               </w:rPr>
-              <w:t>22</w:t>
+              <w:t>IND23Setup</w:t>
             </w:r>
           </w:p>
         </w:tc>
@@ -9380,7 +9437,6 @@
               <w:rPr>
                 <w:rFonts w:ascii="Calibri" w:hAnsi="Calibri" w:eastAsia="Calibri"/>
                 <w:b w:val="0"/>
-                <w:i w:val="0"/>
                 <w:color w:val="000000"/>
                 <w:sz w:val="20"/>
               </w:rPr>
@@ -9403,7 +9459,6 @@
               <w:rPr>
                 <w:rFonts w:ascii="Calibri" w:hAnsi="Calibri" w:eastAsia="Calibri"/>
                 <w:b w:val="0"/>
-                <w:i w:val="0"/>
                 <w:color w:val="000000"/>
                 <w:sz w:val="20"/>
               </w:rPr>
@@ -9424,11 +9479,10 @@
               <w:rPr>
                 <w:rFonts w:ascii="Calibri" w:hAnsi="Calibri" w:eastAsia="Calibri"/>
                 <w:b w:val="0"/>
-                <w:i w:val="0"/>
                 <w:color w:val="000000"/>
                 <w:sz w:val="20"/>
               </w:rPr>
-              <w:t>23</w:t>
+              <w:t>IND24Setup</w:t>
             </w:r>
           </w:p>
         </w:tc>
@@ -9445,7 +9499,6 @@
               <w:rPr>
                 <w:rFonts w:ascii="Calibri" w:hAnsi="Calibri" w:eastAsia="Calibri"/>
                 <w:b w:val="0"/>
-                <w:i w:val="0"/>
                 <w:color w:val="000000"/>
                 <w:sz w:val="20"/>
               </w:rPr>
@@ -9467,7 +9520,6 @@
               <w:rPr>
                 <w:rFonts w:ascii="Calibri" w:hAnsi="Calibri" w:eastAsia="Calibri"/>
                 <w:b w:val="0"/>
-                <w:i w:val="0"/>
                 <w:color w:val="000000"/>
                 <w:sz w:val="20"/>
               </w:rPr>
@@ -9487,11 +9539,10 @@
               <w:rPr>
                 <w:rFonts w:ascii="Calibri" w:hAnsi="Calibri" w:eastAsia="Calibri"/>
                 <w:b w:val="0"/>
-                <w:i w:val="0"/>
                 <w:color w:val="000000"/>
                 <w:sz w:val="20"/>
               </w:rPr>
-              <w:t>24</w:t>
+              <w:t>IND25Setup</w:t>
             </w:r>
           </w:p>
         </w:tc>
@@ -9507,7 +9558,6 @@
               <w:rPr>
                 <w:rFonts w:ascii="Calibri" w:hAnsi="Calibri" w:eastAsia="Calibri"/>
                 <w:b w:val="0"/>
-                <w:i w:val="0"/>
                 <w:color w:val="000000"/>
                 <w:sz w:val="20"/>
               </w:rPr>
@@ -9530,7 +9580,6 @@
               <w:rPr>
                 <w:rFonts w:ascii="Calibri" w:hAnsi="Calibri" w:eastAsia="Calibri"/>
                 <w:b w:val="0"/>
-                <w:i w:val="0"/>
                 <w:color w:val="000000"/>
                 <w:sz w:val="20"/>
               </w:rPr>
@@ -9551,11 +9600,10 @@
               <w:rPr>
                 <w:rFonts w:ascii="Calibri" w:hAnsi="Calibri" w:eastAsia="Calibri"/>
                 <w:b w:val="0"/>
-                <w:i w:val="0"/>
                 <w:color w:val="000000"/>
                 <w:sz w:val="20"/>
               </w:rPr>
-              <w:t>25</w:t>
+              <w:t>IND26Setup</w:t>
             </w:r>
           </w:p>
         </w:tc>
@@ -9572,7 +9620,6 @@
               <w:rPr>
                 <w:rFonts w:ascii="Calibri" w:hAnsi="Calibri" w:eastAsia="Calibri"/>
                 <w:b w:val="0"/>
-                <w:i w:val="0"/>
                 <w:color w:val="000000"/>
                 <w:sz w:val="20"/>
               </w:rPr>
@@ -9594,7 +9641,6 @@
               <w:rPr>
                 <w:rFonts w:ascii="Calibri" w:hAnsi="Calibri" w:eastAsia="Calibri"/>
                 <w:b w:val="0"/>
-                <w:i w:val="0"/>
                 <w:color w:val="000000"/>
                 <w:sz w:val="20"/>
               </w:rPr>
@@ -9614,11 +9660,10 @@
               <w:rPr>
                 <w:rFonts w:ascii="Calibri" w:hAnsi="Calibri" w:eastAsia="Calibri"/>
                 <w:b w:val="0"/>
-                <w:i w:val="0"/>
                 <w:color w:val="000000"/>
                 <w:sz w:val="20"/>
               </w:rPr>
-              <w:t>26</w:t>
+              <w:t>IND27Setup</w:t>
             </w:r>
           </w:p>
         </w:tc>
@@ -9634,7 +9679,6 @@
               <w:rPr>
                 <w:rFonts w:ascii="Calibri" w:hAnsi="Calibri" w:eastAsia="Calibri"/>
                 <w:b w:val="0"/>
-                <w:i w:val="0"/>
                 <w:color w:val="000000"/>
                 <w:sz w:val="20"/>
               </w:rPr>
@@ -9657,7 +9701,6 @@
               <w:rPr>
                 <w:rFonts w:ascii="Calibri" w:hAnsi="Calibri" w:eastAsia="Calibri"/>
                 <w:b w:val="0"/>
-                <w:i w:val="0"/>
                 <w:color w:val="000000"/>
                 <w:sz w:val="20"/>
               </w:rPr>
@@ -9678,11 +9721,10 @@
               <w:rPr>
                 <w:rFonts w:ascii="Calibri" w:hAnsi="Calibri" w:eastAsia="Calibri"/>
                 <w:b w:val="0"/>
-                <w:i w:val="0"/>
                 <w:color w:val="000000"/>
                 <w:sz w:val="20"/>
               </w:rPr>
-              <w:t>27</w:t>
+              <w:t>IND28Setup</w:t>
             </w:r>
           </w:p>
         </w:tc>
@@ -9699,7 +9741,6 @@
               <w:rPr>
                 <w:rFonts w:ascii="Calibri" w:hAnsi="Calibri" w:eastAsia="Calibri"/>
                 <w:b w:val="0"/>
-                <w:i w:val="0"/>
                 <w:color w:val="000000"/>
                 <w:sz w:val="20"/>
               </w:rPr>
@@ -9721,7 +9762,6 @@
               <w:rPr>
                 <w:rFonts w:ascii="Calibri" w:hAnsi="Calibri" w:eastAsia="Calibri"/>
                 <w:b w:val="0"/>
-                <w:i w:val="0"/>
                 <w:color w:val="000000"/>
                 <w:sz w:val="20"/>
               </w:rPr>
@@ -9741,11 +9781,10 @@
               <w:rPr>
                 <w:rFonts w:ascii="Calibri" w:hAnsi="Calibri" w:eastAsia="Calibri"/>
                 <w:b w:val="0"/>
-                <w:i w:val="0"/>
                 <w:color w:val="000000"/>
                 <w:sz w:val="20"/>
               </w:rPr>
-              <w:t>28</w:t>
+              <w:t>IND29Setup</w:t>
             </w:r>
           </w:p>
         </w:tc>
@@ -9761,7 +9800,6 @@
               <w:rPr>
                 <w:rFonts w:ascii="Calibri" w:hAnsi="Calibri" w:eastAsia="Calibri"/>
                 <w:b w:val="0"/>
-                <w:i w:val="0"/>
                 <w:color w:val="000000"/>
                 <w:sz w:val="20"/>
               </w:rPr>
@@ -9784,7 +9822,6 @@
               <w:rPr>
                 <w:rFonts w:ascii="Calibri" w:hAnsi="Calibri" w:eastAsia="Calibri"/>
                 <w:b w:val="0"/>
-                <w:i w:val="0"/>
                 <w:color w:val="000000"/>
                 <w:sz w:val="20"/>
               </w:rPr>
@@ -9805,11 +9842,10 @@
               <w:rPr>
                 <w:rFonts w:ascii="Calibri" w:hAnsi="Calibri" w:eastAsia="Calibri"/>
                 <w:b w:val="0"/>
-                <w:i w:val="0"/>
                 <w:color w:val="000000"/>
                 <w:sz w:val="20"/>
               </w:rPr>
-              <w:t>29</w:t>
+              <w:t>IND30Setup</w:t>
             </w:r>
           </w:p>
         </w:tc>
@@ -9826,7 +9862,6 @@
               <w:rPr>
                 <w:rFonts w:ascii="Calibri" w:hAnsi="Calibri" w:eastAsia="Calibri"/>
                 <w:b w:val="0"/>
-                <w:i w:val="0"/>
                 <w:color w:val="000000"/>
                 <w:sz w:val="20"/>
               </w:rPr>
@@ -9848,7 +9883,6 @@
               <w:rPr>
                 <w:rFonts w:ascii="Calibri" w:hAnsi="Calibri" w:eastAsia="Calibri"/>
                 <w:b w:val="0"/>
-                <w:i w:val="0"/>
                 <w:color w:val="000000"/>
                 <w:sz w:val="20"/>
               </w:rPr>
@@ -9868,11 +9902,10 @@
               <w:rPr>
                 <w:rFonts w:ascii="Calibri" w:hAnsi="Calibri" w:eastAsia="Calibri"/>
                 <w:b w:val="0"/>
-                <w:i w:val="0"/>
                 <w:color w:val="000000"/>
                 <w:sz w:val="20"/>
               </w:rPr>
-              <w:t>30</w:t>
+              <w:t>IND31Setup</w:t>
             </w:r>
           </w:p>
         </w:tc>
@@ -9888,7 +9921,6 @@
               <w:rPr>
                 <w:rFonts w:ascii="Calibri" w:hAnsi="Calibri" w:eastAsia="Calibri"/>
                 <w:b w:val="0"/>
-                <w:i w:val="0"/>
                 <w:color w:val="000000"/>
                 <w:sz w:val="20"/>
               </w:rPr>
@@ -9911,7 +9943,6 @@
               <w:rPr>
                 <w:rFonts w:ascii="Calibri" w:hAnsi="Calibri" w:eastAsia="Calibri"/>
                 <w:b w:val="0"/>
-                <w:i w:val="0"/>
                 <w:color w:val="000000"/>
                 <w:sz w:val="20"/>
               </w:rPr>
@@ -9932,11 +9963,10 @@
               <w:rPr>
                 <w:rFonts w:ascii="Calibri" w:hAnsi="Calibri" w:eastAsia="Calibri"/>
                 <w:b w:val="0"/>
-                <w:i w:val="0"/>
                 <w:color w:val="000000"/>
                 <w:sz w:val="20"/>
               </w:rPr>
-              <w:t>31</w:t>
+              <w:t>IND32Setup</w:t>
             </w:r>
           </w:p>
         </w:tc>
@@ -9953,7 +9983,6 @@
               <w:rPr>
                 <w:rFonts w:ascii="Calibri" w:hAnsi="Calibri" w:eastAsia="Calibri"/>
                 <w:b w:val="0"/>
-                <w:i w:val="0"/>
                 <w:color w:val="000000"/>
                 <w:sz w:val="20"/>
               </w:rPr>
@@ -10038,13 +10067,31 @@
       <w:r>
         <w:rPr>
           <w:rFonts w:ascii="Calibri" w:hAnsi="Calibri" w:eastAsia="Calibri"/>
+          <w:b w:val="0"/>
           <w:sz w:val="22"/>
         </w:rPr>
-        <w:t xml:space="preserve">To calculate an expected value, add the bit weights of the lamps that are currently on for that thruster. Unused or unconfigured channels stay </w:t>
+        <w:t xml:space="preserve">To calculate an expected value, add the bit weights of the NOTIFICATIONS lamps that are currently on for that thruster. Unused or unconfigured </w:t>
       </w:r>
       <w:r>
         <w:rPr>
           <w:rFonts w:ascii="Consolas" w:hAnsi="Consolas" w:eastAsia="Consolas"/>
+          <w:b w:val="0"/>
+          <w:sz w:val="20"/>
+        </w:rPr>
+        <w:t>IND#Setup</w:t>
+      </w:r>
+      <w:r>
+        <w:rPr>
+          <w:rFonts w:ascii="Calibri" w:hAnsi="Calibri" w:eastAsia="Calibri"/>
+          <w:b w:val="0"/>
+          <w:sz w:val="22"/>
+        </w:rPr>
+        <w:t xml:space="preserve"> channels stay </w:t>
+      </w:r>
+      <w:r>
+        <w:rPr>
+          <w:rFonts w:ascii="Consolas" w:hAnsi="Consolas" w:eastAsia="Consolas"/>
+          <w:b w:val="0"/>
           <w:sz w:val="20"/>
         </w:rPr>
         <w:t>0</w:t>
@@ -10052,41 +10099,31 @@
       <w:r>
         <w:rPr>
           <w:rFonts w:ascii="Calibri" w:hAnsi="Calibri" w:eastAsia="Calibri"/>
+          <w:b w:val="0"/>
           <w:sz w:val="22"/>
         </w:rPr>
-        <w:t xml:space="preserve">. Lamp names are not in the payload; map channel </w:t>
+        <w:t xml:space="preserve">. Read the lamp text from that thruster's </w:t>
       </w:r>
       <w:r>
         <w:rPr>
           <w:rFonts w:ascii="Consolas" w:hAnsi="Consolas" w:eastAsia="Consolas"/>
+          <w:b w:val="0"/>
           <w:sz w:val="20"/>
         </w:rPr>
-        <w:t>n</w:t>
+        <w:t>IND#Setup</w:t>
       </w:r>
       <w:r>
         <w:rPr>
           <w:rFonts w:ascii="Calibri" w:hAnsi="Calibri" w:eastAsia="Calibri"/>
+          <w:b w:val="0"/>
           <w:sz w:val="22"/>
         </w:rPr>
-        <w:t xml:space="preserve"> for thruster </w:t>
+        <w:t xml:space="preserve"> entries in </w:t>
       </w:r>
       <w:r>
         <w:rPr>
           <w:rFonts w:ascii="Consolas" w:hAnsi="Consolas" w:eastAsia="Consolas"/>
-          <w:sz w:val="20"/>
-        </w:rPr>
-        <w:t>i</w:t>
-      </w:r>
-      <w:r>
-        <w:rPr>
-          <w:rFonts w:ascii="Calibri" w:hAnsi="Calibri" w:eastAsia="Calibri"/>
-          <w:sz w:val="22"/>
-        </w:rPr>
-        <w:t xml:space="preserve"> from that vessel's </w:t>
-      </w:r>
-      <w:r>
-        <w:rPr>
-          <w:rFonts w:ascii="Consolas" w:hAnsi="Consolas" w:eastAsia="Consolas"/>
+          <w:b w:val="0"/>
           <w:sz w:val="20"/>
         </w:rPr>
         <w:t>TCSView.ini</w:t>
@@ -10094,9 +10131,71 @@
       <w:r>
         <w:rPr>
           <w:rFonts w:ascii="Calibri" w:hAnsi="Calibri" w:eastAsia="Calibri"/>
+          <w:b w:val="0"/>
           <w:sz w:val="22"/>
         </w:rPr>
-        <w:t xml:space="preserve"> / TCS GUI config.</w:t>
+        <w:t>.</w:t>
+      </w:r>
+    </w:p>
+    <w:p>
+      <w:pPr>
+        <w:pStyle w:val="Normal"/>
+      </w:pPr>
+      <w:r>
+        <w:rPr>
+          <w:rFonts w:ascii="Calibri" w:hAnsi="Calibri" w:eastAsia="Calibri"/>
+          <w:b w:val="0"/>
+          <w:sz w:val="22"/>
+        </w:rPr>
+        <w:t xml:space="preserve">This is not the same datapoint as </w:t>
+      </w:r>
+      <w:r>
+        <w:rPr>
+          <w:rFonts w:ascii="Consolas" w:hAnsi="Consolas" w:eastAsia="Consolas"/>
+          <w:b w:val="0"/>
+          <w:sz w:val="20"/>
+        </w:rPr>
+        <w:t>sThrusterRunning</w:t>
+      </w:r>
+      <w:r>
+        <w:rPr>
+          <w:rFonts w:ascii="Calibri" w:hAnsi="Calibri" w:eastAsia="Calibri"/>
+          <w:b w:val="0"/>
+          <w:sz w:val="22"/>
+        </w:rPr>
+        <w:t xml:space="preserve">. A TCS page can show a "THRUSTER RUNNING" notification lamp via </w:t>
+      </w:r>
+      <w:r>
+        <w:rPr>
+          <w:rFonts w:ascii="Consolas" w:hAnsi="Consolas" w:eastAsia="Consolas"/>
+          <w:b w:val="0"/>
+          <w:sz w:val="20"/>
+        </w:rPr>
+        <w:t>IND#Setup</w:t>
+      </w:r>
+      <w:r>
+        <w:rPr>
+          <w:rFonts w:ascii="Calibri" w:hAnsi="Calibri" w:eastAsia="Calibri"/>
+          <w:b w:val="0"/>
+          <w:sz w:val="22"/>
+        </w:rPr>
+        <w:t xml:space="preserve"> while </w:t>
+      </w:r>
+      <w:r>
+        <w:rPr>
+          <w:rFonts w:ascii="Consolas" w:hAnsi="Consolas" w:eastAsia="Consolas"/>
+          <w:b w:val="0"/>
+          <w:sz w:val="20"/>
+        </w:rPr>
+        <w:t>sThrusterRunning</w:t>
+      </w:r>
+      <w:r>
+        <w:rPr>
+          <w:rFonts w:ascii="Calibri" w:hAnsi="Calibri" w:eastAsia="Calibri"/>
+          <w:b w:val="0"/>
+          <w:sz w:val="22"/>
+        </w:rPr>
+        <w:t xml:space="preserve"> is the standard per-thruster running bitfield.</w:t>
       </w:r>
     </w:p>
     <w:p>
@@ -10118,6 +10217,7 @@
       <w:r>
         <w:rPr>
           <w:rFonts w:ascii="Calibri" w:hAnsi="Calibri" w:eastAsia="Calibri"/>
+          <w:b w:val="0"/>
           <w:sz w:val="22"/>
         </w:rPr>
         <w:t xml:space="preserve">No lamps on -&gt; </w:t>
@@ -10125,6 +10225,7 @@
       <w:r>
         <w:rPr>
           <w:rFonts w:ascii="Consolas" w:hAnsi="Consolas" w:eastAsia="Consolas"/>
+          <w:b w:val="0"/>
           <w:sz w:val="20"/>
         </w:rPr>
         <w:t>0</w:t>
@@ -10137,13 +10238,31 @@
       <w:r>
         <w:rPr>
           <w:rFonts w:ascii="Calibri" w:hAnsi="Calibri" w:eastAsia="Calibri"/>
+          <w:b w:val="0"/>
           <w:sz w:val="22"/>
         </w:rPr>
-        <w:t xml:space="preserve">Only channel 0 on -&gt; </w:t>
+        <w:t xml:space="preserve">Only </w:t>
       </w:r>
       <w:r>
         <w:rPr>
           <w:rFonts w:ascii="Consolas" w:hAnsi="Consolas" w:eastAsia="Consolas"/>
+          <w:b w:val="0"/>
+          <w:sz w:val="20"/>
+        </w:rPr>
+        <w:t>IND1Setup</w:t>
+      </w:r>
+      <w:r>
+        <w:rPr>
+          <w:rFonts w:ascii="Calibri" w:hAnsi="Calibri" w:eastAsia="Calibri"/>
+          <w:b w:val="0"/>
+          <w:sz w:val="22"/>
+        </w:rPr>
+        <w:t xml:space="preserve"> on -&gt; </w:t>
+      </w:r>
+      <w:r>
+        <w:rPr>
+          <w:rFonts w:ascii="Consolas" w:hAnsi="Consolas" w:eastAsia="Consolas"/>
+          <w:b w:val="0"/>
           <w:sz w:val="20"/>
         </w:rPr>
         <w:t>1</w:t>
@@ -10155,14 +10274,40 @@
       </w:pPr>
       <w:r>
         <w:rPr>
+          <w:rFonts w:ascii="Consolas" w:hAnsi="Consolas" w:eastAsia="Consolas"/>
+          <w:b w:val="0"/>
+          <w:sz w:val="20"/>
+        </w:rPr>
+        <w:t>IND1Setup</w:t>
+      </w:r>
+      <w:r>
+        <w:rPr>
           <w:rFonts w:ascii="Calibri" w:hAnsi="Calibri" w:eastAsia="Calibri"/>
+          <w:b w:val="0"/>
           <w:sz w:val="22"/>
         </w:rPr>
-        <w:t xml:space="preserve">Channels 0 and 2 on -&gt; </w:t>
+        <w:t xml:space="preserve"> and </w:t>
       </w:r>
       <w:r>
         <w:rPr>
           <w:rFonts w:ascii="Consolas" w:hAnsi="Consolas" w:eastAsia="Consolas"/>
+          <w:b w:val="0"/>
+          <w:sz w:val="20"/>
+        </w:rPr>
+        <w:t>IND3Setup</w:t>
+      </w:r>
+      <w:r>
+        <w:rPr>
+          <w:rFonts w:ascii="Calibri" w:hAnsi="Calibri" w:eastAsia="Calibri"/>
+          <w:b w:val="0"/>
+          <w:sz w:val="22"/>
+        </w:rPr>
+        <w:t xml:space="preserve"> on -&gt; </w:t>
+      </w:r>
+      <w:r>
+        <w:rPr>
+          <w:rFonts w:ascii="Consolas" w:hAnsi="Consolas" w:eastAsia="Consolas"/>
+          <w:b w:val="0"/>
           <w:sz w:val="20"/>
         </w:rPr>
         <w:t>1 + 4 = 5</w:t>
@@ -10174,14 +10319,56 @@
       </w:pPr>
       <w:r>
         <w:rPr>
+          <w:rFonts w:ascii="Consolas" w:hAnsi="Consolas" w:eastAsia="Consolas"/>
+          <w:b w:val="0"/>
+          <w:sz w:val="20"/>
+        </w:rPr>
+        <w:t>IND1Setup</w:t>
+      </w:r>
+      <w:r>
+        <w:rPr>
           <w:rFonts w:ascii="Calibri" w:hAnsi="Calibri" w:eastAsia="Calibri"/>
+          <w:b w:val="0"/>
           <w:sz w:val="22"/>
         </w:rPr>
-        <w:t xml:space="preserve">Channels 0, 1, and 4 on -&gt; </w:t>
+        <w:t xml:space="preserve">, </w:t>
       </w:r>
       <w:r>
         <w:rPr>
           <w:rFonts w:ascii="Consolas" w:hAnsi="Consolas" w:eastAsia="Consolas"/>
+          <w:b w:val="0"/>
+          <w:sz w:val="20"/>
+        </w:rPr>
+        <w:t>IND2Setup</w:t>
+      </w:r>
+      <w:r>
+        <w:rPr>
+          <w:rFonts w:ascii="Calibri" w:hAnsi="Calibri" w:eastAsia="Calibri"/>
+          <w:b w:val="0"/>
+          <w:sz w:val="22"/>
+        </w:rPr>
+        <w:t xml:space="preserve">, and </w:t>
+      </w:r>
+      <w:r>
+        <w:rPr>
+          <w:rFonts w:ascii="Consolas" w:hAnsi="Consolas" w:eastAsia="Consolas"/>
+          <w:b w:val="0"/>
+          <w:sz w:val="20"/>
+        </w:rPr>
+        <w:t>IND5Setup</w:t>
+      </w:r>
+      <w:r>
+        <w:rPr>
+          <w:rFonts w:ascii="Calibri" w:hAnsi="Calibri" w:eastAsia="Calibri"/>
+          <w:b w:val="0"/>
+          <w:sz w:val="22"/>
+        </w:rPr>
+        <w:t xml:space="preserve"> on -&gt; </w:t>
+      </w:r>
+      <w:r>
+        <w:rPr>
+          <w:rFonts w:ascii="Consolas" w:hAnsi="Consolas" w:eastAsia="Consolas"/>
+          <w:b w:val="0"/>
           <w:sz w:val="20"/>
         </w:rPr>
         <w:t>1 + 2 + 16 = 19</w:t>
@@ -10194,13 +10381,31 @@
       <w:r>
         <w:rPr>
           <w:rFonts w:ascii="Calibri" w:hAnsi="Calibri" w:eastAsia="Calibri"/>
+          <w:b w:val="0"/>
           <w:sz w:val="22"/>
         </w:rPr>
-        <w:t xml:space="preserve">Only channel 31 on -&gt; unsigned </w:t>
+        <w:t xml:space="preserve">Only </w:t>
       </w:r>
       <w:r>
         <w:rPr>
           <w:rFonts w:ascii="Consolas" w:hAnsi="Consolas" w:eastAsia="Consolas"/>
+          <w:b w:val="0"/>
+          <w:sz w:val="20"/>
+        </w:rPr>
+        <w:t>IND32Setup</w:t>
+      </w:r>
+      <w:r>
+        <w:rPr>
+          <w:rFonts w:ascii="Calibri" w:hAnsi="Calibri" w:eastAsia="Calibri"/>
+          <w:b w:val="0"/>
+          <w:sz w:val="22"/>
+        </w:rPr>
+        <w:t xml:space="preserve"> on -&gt; unsigned </w:t>
+      </w:r>
+      <w:r>
+        <w:rPr>
+          <w:rFonts w:ascii="Consolas" w:hAnsi="Consolas" w:eastAsia="Consolas"/>
+          <w:b w:val="0"/>
           <w:sz w:val="20"/>
         </w:rPr>
         <w:t>2147483648</w:t>
@@ -10208,6 +10413,7 @@
       <w:r>
         <w:rPr>
           <w:rFonts w:ascii="Calibri" w:hAnsi="Calibri" w:eastAsia="Calibri"/>
+          <w:b w:val="0"/>
           <w:sz w:val="22"/>
         </w:rPr>
         <w:t xml:space="preserve">, signed </w:t>
@@ -10215,9 +10421,63 @@
       <w:r>
         <w:rPr>
           <w:rFonts w:ascii="Consolas" w:hAnsi="Consolas" w:eastAsia="Consolas"/>
+          <w:b w:val="0"/>
           <w:sz w:val="20"/>
         </w:rPr>
         <w:t>-2147483648</w:t>
+      </w:r>
+    </w:p>
+    <w:p>
+      <w:pPr>
+        <w:pStyle w:val="ListBullet"/>
+      </w:pPr>
+      <w:r>
+        <w:rPr>
+          <w:rFonts w:ascii="Calibri" w:hAnsi="Calibri" w:eastAsia="Calibri"/>
+          <w:b w:val="0"/>
+          <w:sz w:val="22"/>
+        </w:rPr>
+        <w:t xml:space="preserve">Example TCS page with </w:t>
+      </w:r>
+      <w:r>
+        <w:rPr>
+          <w:rFonts w:ascii="Consolas" w:hAnsi="Consolas" w:eastAsia="Consolas"/>
+          <w:b w:val="0"/>
+          <w:sz w:val="20"/>
+        </w:rPr>
+        <w:t>IND1Setup</w:t>
+      </w:r>
+      <w:r>
+        <w:rPr>
+          <w:rFonts w:ascii="Calibri" w:hAnsi="Calibri" w:eastAsia="Calibri"/>
+          <w:b w:val="0"/>
+          <w:sz w:val="22"/>
+        </w:rPr>
+        <w:t xml:space="preserve"> = THRUSTER RUNNING (on) and </w:t>
+      </w:r>
+      <w:r>
+        <w:rPr>
+          <w:rFonts w:ascii="Consolas" w:hAnsi="Consolas" w:eastAsia="Consolas"/>
+          <w:b w:val="0"/>
+          <w:sz w:val="20"/>
+        </w:rPr>
+        <w:t>IND2Setup</w:t>
+      </w:r>
+      <w:r>
+        <w:rPr>
+          <w:rFonts w:ascii="Calibri" w:hAnsi="Calibri" w:eastAsia="Calibri"/>
+          <w:b w:val="0"/>
+          <w:sz w:val="22"/>
+        </w:rPr>
+        <w:t xml:space="preserve"> = BACKUP IN COMMAND (off) -&gt; </w:t>
+      </w:r>
+      <w:r>
+        <w:rPr>
+          <w:rFonts w:ascii="Consolas" w:hAnsi="Consolas" w:eastAsia="Consolas"/>
+          <w:b w:val="0"/>
+          <w:sz w:val="20"/>
+        </w:rPr>
+        <w:t>1</w:t>
       </w:r>
     </w:p>
     <w:p/>
@@ -11788,6 +12048,51 @@
       <w:r>
         <w:rPr>
           <w:rFonts w:ascii="Calibri" w:hAnsi="Calibri" w:eastAsia="Calibri"/>
+          <w:b w:val="0"/>
+          <w:sz w:val="22"/>
+        </w:rPr>
+        <w:t xml:space="preserve">NOTIFICATIONS lamps from </w:t>
+      </w:r>
+      <w:r>
+        <w:rPr>
+          <w:rFonts w:ascii="Consolas" w:hAnsi="Consolas" w:eastAsia="Consolas"/>
+          <w:b w:val="0"/>
+          <w:sz w:val="20"/>
+        </w:rPr>
+        <w:t>TCSView.ini</w:t>
+      </w:r>
+      <w:r>
+        <w:rPr>
+          <w:rFonts w:ascii="Calibri" w:hAnsi="Calibri" w:eastAsia="Calibri"/>
+          <w:b w:val="0"/>
+          <w:sz w:val="22"/>
+        </w:rPr>
+        <w:t xml:space="preserve"> </w:t>
+      </w:r>
+      <w:r>
+        <w:rPr>
+          <w:rFonts w:ascii="Consolas" w:hAnsi="Consolas" w:eastAsia="Consolas"/>
+          <w:b w:val="0"/>
+          <w:sz w:val="20"/>
+        </w:rPr>
+        <w:t>IND#Setup</w:t>
+      </w:r>
+      <w:r>
+        <w:rPr>
+          <w:rFonts w:ascii="Calibri" w:hAnsi="Calibri" w:eastAsia="Calibri"/>
+          <w:b w:val="0"/>
+          <w:sz w:val="22"/>
+        </w:rPr>
+        <w:t>.</w:t>
+      </w:r>
+    </w:p>
+    <w:p>
+      <w:pPr>
+        <w:pStyle w:val="Normal"/>
+      </w:pPr>
+      <w:r>
+        <w:rPr>
+          <w:rFonts w:ascii="Calibri" w:hAnsi="Calibri" w:eastAsia="Calibri"/>
           <w:sz w:val="22"/>
         </w:rPr>
       </w:r>
@@ -11873,11 +12178,10 @@
               <w:rPr>
                 <w:rFonts w:ascii="Calibri" w:hAnsi="Calibri" w:eastAsia="Calibri"/>
                 <w:b w:val="0"/>
-                <w:i w:val="0"/>
                 <w:color w:val="000000"/>
                 <w:sz w:val="20"/>
               </w:rPr>
-              <w:t>Channel 0 on</w:t>
+              <w:t>IND1Setup on</w:t>
             </w:r>
           </w:p>
         </w:tc>
@@ -11914,11 +12218,10 @@
               <w:rPr>
                 <w:rFonts w:ascii="Calibri" w:hAnsi="Calibri" w:eastAsia="Calibri"/>
                 <w:b w:val="0"/>
-                <w:i w:val="0"/>
                 <w:color w:val="000000"/>
                 <w:sz w:val="20"/>
               </w:rPr>
-              <w:t>Channel 1 on</w:t>
+              <w:t>IND2Setup on</w:t>
             </w:r>
           </w:p>
         </w:tc>
@@ -11953,11 +12256,10 @@
               <w:rPr>
                 <w:rFonts w:ascii="Calibri" w:hAnsi="Calibri" w:eastAsia="Calibri"/>
                 <w:b w:val="0"/>
-                <w:i w:val="0"/>
                 <w:color w:val="000000"/>
                 <w:sz w:val="20"/>
               </w:rPr>
-              <w:t>Channel 2 on</w:t>
+              <w:t>IND3Setup on</w:t>
             </w:r>
           </w:p>
         </w:tc>
@@ -11994,11 +12296,10 @@
               <w:rPr>
                 <w:rFonts w:ascii="Calibri" w:hAnsi="Calibri" w:eastAsia="Calibri"/>
                 <w:b w:val="0"/>
-                <w:i w:val="0"/>
                 <w:color w:val="000000"/>
                 <w:sz w:val="20"/>
               </w:rPr>
-              <w:t>Channel 3 on</w:t>
+              <w:t>IND4Setup on</w:t>
             </w:r>
           </w:p>
         </w:tc>
@@ -12033,11 +12334,10 @@
               <w:rPr>
                 <w:rFonts w:ascii="Calibri" w:hAnsi="Calibri" w:eastAsia="Calibri"/>
                 <w:b w:val="0"/>
-                <w:i w:val="0"/>
                 <w:color w:val="000000"/>
                 <w:sz w:val="20"/>
               </w:rPr>
-              <w:t>Channel 4 on</w:t>
+              <w:t>IND5Setup on</w:t>
             </w:r>
           </w:p>
         </w:tc>
@@ -12074,11 +12374,10 @@
               <w:rPr>
                 <w:rFonts w:ascii="Calibri" w:hAnsi="Calibri" w:eastAsia="Calibri"/>
                 <w:b w:val="0"/>
-                <w:i w:val="0"/>
                 <w:color w:val="000000"/>
                 <w:sz w:val="20"/>
               </w:rPr>
-              <w:t>Channel 5 on</w:t>
+              <w:t>IND6Setup on</w:t>
             </w:r>
           </w:p>
         </w:tc>
@@ -12113,11 +12412,10 @@
               <w:rPr>
                 <w:rFonts w:ascii="Calibri" w:hAnsi="Calibri" w:eastAsia="Calibri"/>
                 <w:b w:val="0"/>
-                <w:i w:val="0"/>
                 <w:color w:val="000000"/>
                 <w:sz w:val="20"/>
               </w:rPr>
-              <w:t>Channel 6 on</w:t>
+              <w:t>IND7Setup on</w:t>
             </w:r>
           </w:p>
         </w:tc>
@@ -12154,11 +12452,10 @@
               <w:rPr>
                 <w:rFonts w:ascii="Calibri" w:hAnsi="Calibri" w:eastAsia="Calibri"/>
                 <w:b w:val="0"/>
-                <w:i w:val="0"/>
                 <w:color w:val="000000"/>
                 <w:sz w:val="20"/>
               </w:rPr>
-              <w:t>Channel 7 on</w:t>
+              <w:t>IND8Setup on</w:t>
             </w:r>
           </w:p>
         </w:tc>
@@ -12193,11 +12490,10 @@
               <w:rPr>
                 <w:rFonts w:ascii="Calibri" w:hAnsi="Calibri" w:eastAsia="Calibri"/>
                 <w:b w:val="0"/>
-                <w:i w:val="0"/>
                 <w:color w:val="000000"/>
                 <w:sz w:val="20"/>
               </w:rPr>
-              <w:t>Channel 8 on</w:t>
+              <w:t>IND9Setup on</w:t>
             </w:r>
           </w:p>
         </w:tc>
@@ -12234,11 +12530,10 @@
               <w:rPr>
                 <w:rFonts w:ascii="Calibri" w:hAnsi="Calibri" w:eastAsia="Calibri"/>
                 <w:b w:val="0"/>
-                <w:i w:val="0"/>
                 <w:color w:val="000000"/>
                 <w:sz w:val="20"/>
               </w:rPr>
-              <w:t>Channel 9 on</w:t>
+              <w:t>IND10Setup on</w:t>
             </w:r>
           </w:p>
         </w:tc>
@@ -12273,11 +12568,10 @@
               <w:rPr>
                 <w:rFonts w:ascii="Calibri" w:hAnsi="Calibri" w:eastAsia="Calibri"/>
                 <w:b w:val="0"/>
-                <w:i w:val="0"/>
                 <w:color w:val="000000"/>
                 <w:sz w:val="20"/>
               </w:rPr>
-              <w:t>Channel 10 on</w:t>
+              <w:t>IND11Setup on</w:t>
             </w:r>
           </w:p>
         </w:tc>
@@ -12314,11 +12608,10 @@
               <w:rPr>
                 <w:rFonts w:ascii="Calibri" w:hAnsi="Calibri" w:eastAsia="Calibri"/>
                 <w:b w:val="0"/>
-                <w:i w:val="0"/>
                 <w:color w:val="000000"/>
                 <w:sz w:val="20"/>
               </w:rPr>
-              <w:t>Channel 11 on</w:t>
+              <w:t>IND12Setup on</w:t>
             </w:r>
           </w:p>
         </w:tc>
@@ -12353,11 +12646,10 @@
               <w:rPr>
                 <w:rFonts w:ascii="Calibri" w:hAnsi="Calibri" w:eastAsia="Calibri"/>
                 <w:b w:val="0"/>
-                <w:i w:val="0"/>
                 <w:color w:val="000000"/>
                 <w:sz w:val="20"/>
               </w:rPr>
-              <w:t>Channel 12 on</w:t>
+              <w:t>IND13Setup on</w:t>
             </w:r>
           </w:p>
         </w:tc>
@@ -12394,11 +12686,10 @@
               <w:rPr>
                 <w:rFonts w:ascii="Calibri" w:hAnsi="Calibri" w:eastAsia="Calibri"/>
                 <w:b w:val="0"/>
-                <w:i w:val="0"/>
                 <w:color w:val="000000"/>
                 <w:sz w:val="20"/>
               </w:rPr>
-              <w:t>Channel 13 on</w:t>
+              <w:t>IND14Setup on</w:t>
             </w:r>
           </w:p>
         </w:tc>
@@ -12433,11 +12724,10 @@
               <w:rPr>
                 <w:rFonts w:ascii="Calibri" w:hAnsi="Calibri" w:eastAsia="Calibri"/>
                 <w:b w:val="0"/>
-                <w:i w:val="0"/>
                 <w:color w:val="000000"/>
                 <w:sz w:val="20"/>
               </w:rPr>
-              <w:t>Channel 14 on</w:t>
+              <w:t>IND15Setup on</w:t>
             </w:r>
           </w:p>
         </w:tc>
@@ -12474,11 +12764,10 @@
               <w:rPr>
                 <w:rFonts w:ascii="Calibri" w:hAnsi="Calibri" w:eastAsia="Calibri"/>
                 <w:b w:val="0"/>
-                <w:i w:val="0"/>
                 <w:color w:val="000000"/>
                 <w:sz w:val="20"/>
               </w:rPr>
-              <w:t>Channel 15 on</w:t>
+              <w:t>IND16Setup on</w:t>
             </w:r>
           </w:p>
         </w:tc>
@@ -12513,11 +12802,10 @@
               <w:rPr>
                 <w:rFonts w:ascii="Calibri" w:hAnsi="Calibri" w:eastAsia="Calibri"/>
                 <w:b w:val="0"/>
-                <w:i w:val="0"/>
                 <w:color w:val="000000"/>
                 <w:sz w:val="20"/>
               </w:rPr>
-              <w:t>Channel 16 on</w:t>
+              <w:t>IND17Setup on</w:t>
             </w:r>
           </w:p>
         </w:tc>
@@ -12554,11 +12842,10 @@
               <w:rPr>
                 <w:rFonts w:ascii="Calibri" w:hAnsi="Calibri" w:eastAsia="Calibri"/>
                 <w:b w:val="0"/>
-                <w:i w:val="0"/>
                 <w:color w:val="000000"/>
                 <w:sz w:val="20"/>
               </w:rPr>
-              <w:t>Channel 17 on</w:t>
+              <w:t>IND18Setup on</w:t>
             </w:r>
           </w:p>
         </w:tc>
@@ -12593,11 +12880,10 @@
               <w:rPr>
                 <w:rFonts w:ascii="Calibri" w:hAnsi="Calibri" w:eastAsia="Calibri"/>
                 <w:b w:val="0"/>
-                <w:i w:val="0"/>
                 <w:color w:val="000000"/>
                 <w:sz w:val="20"/>
               </w:rPr>
-              <w:t>Channel 18 on</w:t>
+              <w:t>IND19Setup on</w:t>
             </w:r>
           </w:p>
         </w:tc>
@@ -12634,11 +12920,10 @@
               <w:rPr>
                 <w:rFonts w:ascii="Calibri" w:hAnsi="Calibri" w:eastAsia="Calibri"/>
                 <w:b w:val="0"/>
-                <w:i w:val="0"/>
                 <w:color w:val="000000"/>
                 <w:sz w:val="20"/>
               </w:rPr>
-              <w:t>Channel 19 on</w:t>
+              <w:t>IND20Setup on</w:t>
             </w:r>
           </w:p>
         </w:tc>
@@ -12673,11 +12958,10 @@
               <w:rPr>
                 <w:rFonts w:ascii="Calibri" w:hAnsi="Calibri" w:eastAsia="Calibri"/>
                 <w:b w:val="0"/>
-                <w:i w:val="0"/>
                 <w:color w:val="000000"/>
                 <w:sz w:val="20"/>
               </w:rPr>
-              <w:t>Channel 20 on</w:t>
+              <w:t>IND21Setup on</w:t>
             </w:r>
           </w:p>
         </w:tc>
@@ -12714,11 +12998,10 @@
               <w:rPr>
                 <w:rFonts w:ascii="Calibri" w:hAnsi="Calibri" w:eastAsia="Calibri"/>
                 <w:b w:val="0"/>
-                <w:i w:val="0"/>
                 <w:color w:val="000000"/>
                 <w:sz w:val="20"/>
               </w:rPr>
-              <w:t>Channel 21 on</w:t>
+              <w:t>IND22Setup on</w:t>
             </w:r>
           </w:p>
         </w:tc>
@@ -12753,11 +13036,10 @@
               <w:rPr>
                 <w:rFonts w:ascii="Calibri" w:hAnsi="Calibri" w:eastAsia="Calibri"/>
                 <w:b w:val="0"/>
-                <w:i w:val="0"/>
                 <w:color w:val="000000"/>
                 <w:sz w:val="20"/>
               </w:rPr>
-              <w:t>Channel 22 on</w:t>
+              <w:t>IND23Setup on</w:t>
             </w:r>
           </w:p>
         </w:tc>
@@ -12794,11 +13076,10 @@
               <w:rPr>
                 <w:rFonts w:ascii="Calibri" w:hAnsi="Calibri" w:eastAsia="Calibri"/>
                 <w:b w:val="0"/>
-                <w:i w:val="0"/>
                 <w:color w:val="000000"/>
                 <w:sz w:val="20"/>
               </w:rPr>
-              <w:t>Channel 23 on</w:t>
+              <w:t>IND24Setup on</w:t>
             </w:r>
           </w:p>
         </w:tc>
@@ -12833,11 +13114,10 @@
               <w:rPr>
                 <w:rFonts w:ascii="Calibri" w:hAnsi="Calibri" w:eastAsia="Calibri"/>
                 <w:b w:val="0"/>
-                <w:i w:val="0"/>
                 <w:color w:val="000000"/>
                 <w:sz w:val="20"/>
               </w:rPr>
-              <w:t>Channel 24 on</w:t>
+              <w:t>IND25Setup on</w:t>
             </w:r>
           </w:p>
         </w:tc>
@@ -12874,11 +13154,10 @@
               <w:rPr>
                 <w:rFonts w:ascii="Calibri" w:hAnsi="Calibri" w:eastAsia="Calibri"/>
                 <w:b w:val="0"/>
-                <w:i w:val="0"/>
                 <w:color w:val="000000"/>
                 <w:sz w:val="20"/>
               </w:rPr>
-              <w:t>Channel 25 on</w:t>
+              <w:t>IND26Setup on</w:t>
             </w:r>
           </w:p>
         </w:tc>
@@ -12913,11 +13192,10 @@
               <w:rPr>
                 <w:rFonts w:ascii="Calibri" w:hAnsi="Calibri" w:eastAsia="Calibri"/>
                 <w:b w:val="0"/>
-                <w:i w:val="0"/>
                 <w:color w:val="000000"/>
                 <w:sz w:val="20"/>
               </w:rPr>
-              <w:t>Channel 26 on</w:t>
+              <w:t>IND27Setup on</w:t>
             </w:r>
           </w:p>
         </w:tc>
@@ -12954,11 +13232,10 @@
               <w:rPr>
                 <w:rFonts w:ascii="Calibri" w:hAnsi="Calibri" w:eastAsia="Calibri"/>
                 <w:b w:val="0"/>
-                <w:i w:val="0"/>
                 <w:color w:val="000000"/>
                 <w:sz w:val="20"/>
               </w:rPr>
-              <w:t>Channel 27 on</w:t>
+              <w:t>IND28Setup on</w:t>
             </w:r>
           </w:p>
         </w:tc>
@@ -12993,11 +13270,10 @@
               <w:rPr>
                 <w:rFonts w:ascii="Calibri" w:hAnsi="Calibri" w:eastAsia="Calibri"/>
                 <w:b w:val="0"/>
-                <w:i w:val="0"/>
                 <w:color w:val="000000"/>
                 <w:sz w:val="20"/>
               </w:rPr>
-              <w:t>Channel 28 on</w:t>
+              <w:t>IND29Setup on</w:t>
             </w:r>
           </w:p>
         </w:tc>
@@ -13034,11 +13310,10 @@
               <w:rPr>
                 <w:rFonts w:ascii="Calibri" w:hAnsi="Calibri" w:eastAsia="Calibri"/>
                 <w:b w:val="0"/>
-                <w:i w:val="0"/>
                 <w:color w:val="000000"/>
                 <w:sz w:val="20"/>
               </w:rPr>
-              <w:t>Channel 29 on</w:t>
+              <w:t>IND30Setup on</w:t>
             </w:r>
           </w:p>
         </w:tc>
@@ -13073,11 +13348,10 @@
               <w:rPr>
                 <w:rFonts w:ascii="Calibri" w:hAnsi="Calibri" w:eastAsia="Calibri"/>
                 <w:b w:val="0"/>
-                <w:i w:val="0"/>
                 <w:color w:val="000000"/>
                 <w:sz w:val="20"/>
               </w:rPr>
-              <w:t>Channel 30 on</w:t>
+              <w:t>IND31Setup on</w:t>
             </w:r>
           </w:p>
         </w:tc>
@@ -13114,11 +13388,10 @@
               <w:rPr>
                 <w:rFonts w:ascii="Calibri" w:hAnsi="Calibri" w:eastAsia="Calibri"/>
                 <w:b w:val="0"/>
-                <w:i w:val="0"/>
                 <w:color w:val="000000"/>
                 <w:sz w:val="20"/>
               </w:rPr>
-              <w:t>Channel 31 on (signed display -2147483648)</w:t>
+              <w:t>IND32Setup on (signed display -2147483648)</w:t>
             </w:r>
           </w:p>
         </w:tc>
@@ -13131,13 +13404,31 @@
       <w:r>
         <w:rPr>
           <w:rFonts w:ascii="Calibri" w:hAnsi="Calibri" w:eastAsia="Calibri"/>
+          <w:b w:val="0"/>
           <w:sz w:val="22"/>
         </w:rPr>
-        <w:t xml:space="preserve">Values can combine. Lamp labels for each channel come from vessel </w:t>
+        <w:t xml:space="preserve">Values can combine. Lamp labels for each </w:t>
       </w:r>
       <w:r>
         <w:rPr>
           <w:rFonts w:ascii="Consolas" w:hAnsi="Consolas" w:eastAsia="Consolas"/>
+          <w:b w:val="0"/>
+          <w:sz w:val="20"/>
+        </w:rPr>
+        <w:t>IND#Setup</w:t>
+      </w:r>
+      <w:r>
+        <w:rPr>
+          <w:rFonts w:ascii="Calibri" w:hAnsi="Calibri" w:eastAsia="Calibri"/>
+          <w:b w:val="0"/>
+          <w:sz w:val="22"/>
+        </w:rPr>
+        <w:t xml:space="preserve"> come from vessel </w:t>
+      </w:r>
+      <w:r>
+        <w:rPr>
+          <w:rFonts w:ascii="Consolas" w:hAnsi="Consolas" w:eastAsia="Consolas"/>
+          <w:b w:val="0"/>
           <w:sz w:val="20"/>
         </w:rPr>
         <w:t>TCSView.ini</w:t>
@@ -13145,6 +13436,7 @@
       <w:r>
         <w:rPr>
           <w:rFonts w:ascii="Calibri" w:hAnsi="Calibri" w:eastAsia="Calibri"/>
+          <w:b w:val="0"/>
           <w:sz w:val="22"/>
         </w:rPr>
         <w:t>.</w:t>

</xml_diff>

<commit_message>
Map sButtonInd bits to TCSView.ini BTN#Setup button LEDs.
Document the 5-bit packing per button group, the BTN1Setup..BTN120Setup key map, matching sButtonDisable bits, and the Word export.

Co-authored-by: rodrigogismondi <rodrigogismondi@users.noreply.github.com>
</commit_message>
<xml_diff>
--- a/remas/TCS_STRUCT/Word Document/tcs-logger-mtos-current.docx
+++ b/remas/TCS_STRUCT/Word Document/tcs-logger-mtos-current.docx
@@ -7408,7 +7408,28 @@
           <w:b w:val="0"/>
           <w:sz w:val="22"/>
         </w:rPr>
-        <w:t xml:space="preserve">). The payload carries only the lamp bits, not the text. Button widgets such as Start/Stop/Reset are </w:t>
+        <w:t>). The payload carries only the lamp bits, not the text.</w:t>
+      </w:r>
+    </w:p>
+    <w:p>
+      <w:pPr>
+        <w:pStyle w:val="Normal"/>
+      </w:pPr>
+      <w:r>
+        <w:rPr>
+          <w:rFonts w:ascii="Consolas" w:hAnsi="Consolas" w:eastAsia="Consolas"/>
+          <w:b w:val="0"/>
+          <w:sz w:val="20"/>
+        </w:rPr>
+        <w:t>sButtonInd[i][g]</w:t>
+      </w:r>
+      <w:r>
+        <w:rPr>
+          <w:rFonts w:ascii="Calibri" w:hAnsi="Calibri" w:eastAsia="Calibri"/>
+          <w:b w:val="0"/>
+          <w:sz w:val="22"/>
+        </w:rPr>
+        <w:t xml:space="preserve"> is the live LED state of the custom button groups on that same TCS page (Start / Stop / Reset and other project buttons). Those buttons are configured in </w:t>
       </w:r>
       <w:r>
         <w:rPr>
@@ -7416,7 +7437,7 @@
           <w:b w:val="0"/>
           <w:sz w:val="20"/>
         </w:rPr>
-        <w:t>sButtonInd</w:t>
+        <w:t>TCSView.ini</w:t>
       </w:r>
       <w:r>
         <w:rPr>
@@ -7424,7 +7445,7 @@
           <w:b w:val="0"/>
           <w:sz w:val="22"/>
         </w:rPr>
-        <w:t xml:space="preserve"> / </w:t>
+        <w:t xml:space="preserve"> as </w:t>
       </w:r>
       <w:r>
         <w:rPr>
@@ -7432,7 +7453,7 @@
           <w:b w:val="0"/>
           <w:sz w:val="20"/>
         </w:rPr>
-        <w:t>sButtonDisable</w:t>
+        <w:t>BTN#Setup</w:t>
       </w:r>
       <w:r>
         <w:rPr>
@@ -7440,7 +7461,7 @@
           <w:b w:val="0"/>
           <w:sz w:val="22"/>
         </w:rPr>
-        <w:t xml:space="preserve">, not </w:t>
+        <w:t xml:space="preserve"> (</w:t>
       </w:r>
       <w:r>
         <w:rPr>
@@ -7448,7 +7469,7 @@
           <w:b w:val="0"/>
           <w:sz w:val="20"/>
         </w:rPr>
-        <w:t>lIndicators</w:t>
+        <w:t>BTN1Setup</w:t>
       </w:r>
       <w:r>
         <w:rPr>
@@ -7456,7 +7477,39 @@
           <w:b w:val="0"/>
           <w:sz w:val="22"/>
         </w:rPr>
-        <w:t>.</w:t>
+        <w:t xml:space="preserve"> ... </w:t>
+      </w:r>
+      <w:r>
+        <w:rPr>
+          <w:rFonts w:ascii="Consolas" w:hAnsi="Consolas" w:eastAsia="Consolas"/>
+          <w:b w:val="0"/>
+          <w:sz w:val="20"/>
+        </w:rPr>
+        <w:t>BTN120Setup</w:t>
+      </w:r>
+      <w:r>
+        <w:rPr>
+          <w:rFonts w:ascii="Calibri" w:hAnsi="Calibri" w:eastAsia="Calibri"/>
+          <w:b w:val="0"/>
+          <w:sz w:val="22"/>
+        </w:rPr>
+        <w:t xml:space="preserve">). </w:t>
+      </w:r>
+      <w:r>
+        <w:rPr>
+          <w:rFonts w:ascii="Consolas" w:hAnsi="Consolas" w:eastAsia="Consolas"/>
+          <w:b w:val="0"/>
+          <w:sz w:val="20"/>
+        </w:rPr>
+        <w:t>sButtonDisable[i][g]</w:t>
+      </w:r>
+      <w:r>
+        <w:rPr>
+          <w:rFonts w:ascii="Calibri" w:hAnsi="Calibri" w:eastAsia="Calibri"/>
+          <w:b w:val="0"/>
+          <w:sz w:val="22"/>
+        </w:rPr>
+        <w:t xml:space="preserve"> uses the same packing: bit set means that button is disabled / not available. Standard command widgets such as Bridge / DP/JS / Autopilot / Manual are not this datapoint.</w:t>
       </w:r>
     </w:p>
     <w:tbl>
@@ -7607,15 +7660,14 @@
             <w:shd w:fill="EEF3F8" w:val="clear"/>
           </w:tcPr>
           <w:p>
-            <w:r/>
-            <w:r>
-              <w:rPr>
-                <w:rFonts w:ascii="Calibri" w:hAnsi="Calibri" w:eastAsia="Calibri"/>
-                <w:b w:val="0"/>
-                <w:i w:val="0"/>
-                <w:sz w:val="20"/>
-              </w:rPr>
-              <w:t>Custom button LED state</w:t>
+            <w:r>
+              <w:rPr>
+                <w:rFonts w:ascii="Calibri" w:hAnsi="Calibri" w:eastAsia="Calibri"/>
+                <w:b w:val="0"/>
+                <w:color w:val="000000"/>
+                <w:sz w:val="20"/>
+              </w:rPr>
+              <w:t>Custom button LED state for thruster i, group g</w:t>
             </w:r>
           </w:p>
         </w:tc>
@@ -7625,16 +7677,25 @@
             <w:shd w:fill="EEF3F8" w:val="clear"/>
           </w:tcPr>
           <w:p>
+            <w:r>
+              <w:rPr>
+                <w:rFonts w:ascii="Calibri" w:hAnsi="Calibri" w:eastAsia="Calibri"/>
+                <w:b w:val="0"/>
+                <w:color w:val="000000"/>
+                <w:sz w:val="20"/>
+              </w:rPr>
+              <w:t>5-bit field. Group g (0..23) holds five BTN#Setup buttons. Bit 0 = first button in the group, bit 4 = fifth. Bit set = LED on. Combined value is 0..31.</w:t>
+            </w:r>
+          </w:p>
+        </w:tc>
+      </w:tr>
+      <w:tr>
+        <w:tc>
+          <w:tcPr>
+            <w:tcW w:type="dxa" w:w="3216"/>
+          </w:tcPr>
+          <w:p>
             <w:r/>
-            <w:r>
-              <w:rPr>
-                <w:rFonts w:ascii="Calibri" w:hAnsi="Calibri" w:eastAsia="Calibri"/>
-                <w:b w:val="0"/>
-                <w:i w:val="0"/>
-                <w:sz w:val="20"/>
-              </w:rPr>
-              <w:t xml:space="preserve">Thruster </w:t>
-            </w:r>
             <w:r>
               <w:rPr>
                 <w:rFonts w:ascii="Consolas" w:hAnsi="Consolas" w:eastAsia="Consolas"/>
@@ -7643,78 +7704,10 @@
                 <w:color w:val="333333"/>
                 <w:sz w:val="18"/>
               </w:rPr>
-              <w:t>i</w:t>
-            </w:r>
-            <w:r>
-              <w:rPr>
-                <w:rFonts w:ascii="Calibri" w:hAnsi="Calibri" w:eastAsia="Calibri"/>
-                <w:b w:val="0"/>
-                <w:i w:val="0"/>
-                <w:sz w:val="20"/>
-              </w:rPr>
-              <w:t xml:space="preserve">, button group </w:t>
-            </w:r>
-            <w:r>
-              <w:rPr>
-                <w:rFonts w:ascii="Consolas" w:hAnsi="Consolas" w:eastAsia="Consolas"/>
-                <w:b w:val="0"/>
-                <w:i w:val="0"/>
-                <w:color w:val="333333"/>
-                <w:sz w:val="18"/>
-              </w:rPr>
-              <w:t>g</w:t>
-            </w:r>
-            <w:r>
-              <w:rPr>
-                <w:rFonts w:ascii="Calibri" w:hAnsi="Calibri" w:eastAsia="Calibri"/>
-                <w:b w:val="0"/>
-                <w:i w:val="0"/>
-                <w:sz w:val="20"/>
-              </w:rPr>
-              <w:t xml:space="preserve"> (</w:t>
-            </w:r>
-            <w:r>
-              <w:rPr>
-                <w:rFonts w:ascii="Consolas" w:hAnsi="Consolas" w:eastAsia="Consolas"/>
-                <w:b w:val="0"/>
-                <w:i w:val="0"/>
-                <w:color w:val="333333"/>
-                <w:sz w:val="18"/>
-              </w:rPr>
-              <w:t>0..23</w:t>
-            </w:r>
-            <w:r>
-              <w:rPr>
-                <w:rFonts w:ascii="Calibri" w:hAnsi="Calibri" w:eastAsia="Calibri"/>
-                <w:b w:val="0"/>
-                <w:i w:val="0"/>
-                <w:sz w:val="20"/>
-              </w:rPr>
-              <w:t xml:space="preserve">). Bits </w:t>
-            </w:r>
-            <w:r>
-              <w:rPr>
-                <w:rFonts w:ascii="Consolas" w:hAnsi="Consolas" w:eastAsia="Consolas"/>
-                <w:b w:val="0"/>
-                <w:i w:val="0"/>
-                <w:color w:val="333333"/>
-                <w:sz w:val="18"/>
-              </w:rPr>
-              <w:t>0..4</w:t>
-            </w:r>
-            <w:r>
-              <w:rPr>
-                <w:rFonts w:ascii="Calibri" w:hAnsi="Calibri" w:eastAsia="Calibri"/>
-                <w:b w:val="0"/>
-                <w:i w:val="0"/>
-                <w:sz w:val="20"/>
-              </w:rPr>
-              <w:t xml:space="preserve"> are the five buttons in that group. Bit set = indication on.</w:t>
-            </w:r>
-          </w:p>
-        </w:tc>
-      </w:tr>
-      <w:tr>
+              <w:t>sButtonDisable[i][g]</w:t>
+            </w:r>
+          </w:p>
+        </w:tc>
         <w:tc>
           <w:tcPr>
             <w:tcW w:type="dxa" w:w="3216"/>
@@ -7723,13 +7716,12 @@
             <w:r/>
             <w:r>
               <w:rPr>
-                <w:rFonts w:ascii="Consolas" w:hAnsi="Consolas" w:eastAsia="Consolas"/>
-                <w:b w:val="0"/>
-                <w:i w:val="0"/>
-                <w:color w:val="333333"/>
-                <w:sz w:val="18"/>
-              </w:rPr>
-              <w:t>sButtonDisable[i][g]</w:t>
+                <w:rFonts w:ascii="Calibri" w:hAnsi="Calibri" w:eastAsia="Calibri"/>
+                <w:b w:val="0"/>
+                <w:i w:val="0"/>
+                <w:sz w:val="20"/>
+              </w:rPr>
+              <w:t>Custom button unavailable state</w:t>
             </w:r>
           </w:p>
         </w:tc>
@@ -7738,32 +7730,14 @@
             <w:tcW w:type="dxa" w:w="3216"/>
           </w:tcPr>
           <w:p>
-            <w:r/>
-            <w:r>
-              <w:rPr>
-                <w:rFonts w:ascii="Calibri" w:hAnsi="Calibri" w:eastAsia="Calibri"/>
-                <w:b w:val="0"/>
-                <w:i w:val="0"/>
-                <w:sz w:val="20"/>
-              </w:rPr>
-              <w:t>Custom button unavailable state</w:t>
-            </w:r>
-          </w:p>
-        </w:tc>
-        <w:tc>
-          <w:tcPr>
-            <w:tcW w:type="dxa" w:w="3216"/>
-          </w:tcPr>
-          <w:p>
-            <w:r/>
-            <w:r>
-              <w:rPr>
-                <w:rFonts w:ascii="Calibri" w:hAnsi="Calibri" w:eastAsia="Calibri"/>
-                <w:b w:val="0"/>
-                <w:i w:val="0"/>
-                <w:sz w:val="20"/>
-              </w:rPr>
-              <w:t>Same packing as above. Bit set = button disabled / not available.</w:t>
+            <w:r>
+              <w:rPr>
+                <w:rFonts w:ascii="Calibri" w:hAnsi="Calibri" w:eastAsia="Calibri"/>
+                <w:b w:val="0"/>
+                <w:color w:val="000000"/>
+                <w:sz w:val="20"/>
+              </w:rPr>
+              <w:t>Same packing as sButtonInd[i][g]. Bit set = button disabled / not available.</w:t>
             </w:r>
           </w:p>
         </w:tc>
@@ -10482,6 +10456,2535 @@
     </w:p>
     <w:p/>
     <w:p>
+      <w:pPr>
+        <w:pStyle w:val="Normal"/>
+      </w:pPr>
+      <w:r>
+        <w:rPr>
+          <w:rFonts w:ascii="Calibri" w:hAnsi="Calibri" w:eastAsia="Calibri"/>
+          <w:b w:val="0"/>
+          <w:sz w:val="22"/>
+        </w:rPr>
+        <w:t xml:space="preserve">For </w:t>
+      </w:r>
+      <w:r>
+        <w:rPr>
+          <w:rFonts w:ascii="Consolas" w:hAnsi="Consolas" w:eastAsia="Consolas"/>
+          <w:b w:val="0"/>
+          <w:sz w:val="20"/>
+        </w:rPr>
+        <w:t>sButtonInd[i][g]</w:t>
+      </w:r>
+      <w:r>
+        <w:rPr>
+          <w:rFonts w:ascii="Calibri" w:hAnsi="Calibri" w:eastAsia="Calibri"/>
+          <w:b w:val="0"/>
+          <w:sz w:val="22"/>
+        </w:rPr>
+        <w:t xml:space="preserve">, each value is one 5-bit number for button group </w:t>
+      </w:r>
+      <w:r>
+        <w:rPr>
+          <w:rFonts w:ascii="Consolas" w:hAnsi="Consolas" w:eastAsia="Consolas"/>
+          <w:b w:val="0"/>
+          <w:sz w:val="20"/>
+        </w:rPr>
+        <w:t>g</w:t>
+      </w:r>
+      <w:r>
+        <w:rPr>
+          <w:rFonts w:ascii="Calibri" w:hAnsi="Calibri" w:eastAsia="Calibri"/>
+          <w:b w:val="0"/>
+          <w:sz w:val="22"/>
+        </w:rPr>
+        <w:t xml:space="preserve"> on thruster slot </w:t>
+      </w:r>
+      <w:r>
+        <w:rPr>
+          <w:rFonts w:ascii="Consolas" w:hAnsi="Consolas" w:eastAsia="Consolas"/>
+          <w:b w:val="0"/>
+          <w:sz w:val="20"/>
+        </w:rPr>
+        <w:t>i</w:t>
+      </w:r>
+      <w:r>
+        <w:rPr>
+          <w:rFonts w:ascii="Calibri" w:hAnsi="Calibri" w:eastAsia="Calibri"/>
+          <w:b w:val="0"/>
+          <w:sz w:val="22"/>
+        </w:rPr>
+        <w:t>. There are 24 groups (</w:t>
+      </w:r>
+      <w:r>
+        <w:rPr>
+          <w:rFonts w:ascii="Consolas" w:hAnsi="Consolas" w:eastAsia="Consolas"/>
+          <w:b w:val="0"/>
+          <w:sz w:val="20"/>
+        </w:rPr>
+        <w:t>g = 0..23</w:t>
+      </w:r>
+      <w:r>
+        <w:rPr>
+          <w:rFonts w:ascii="Calibri" w:hAnsi="Calibri" w:eastAsia="Calibri"/>
+          <w:b w:val="0"/>
+          <w:sz w:val="22"/>
+        </w:rPr>
+        <w:t xml:space="preserve">) and five buttons per group. </w:t>
+      </w:r>
+      <w:r>
+        <w:rPr>
+          <w:rFonts w:ascii="Consolas" w:hAnsi="Consolas" w:eastAsia="Consolas"/>
+          <w:b w:val="0"/>
+          <w:sz w:val="20"/>
+        </w:rPr>
+        <w:t>TCSView.ini</w:t>
+      </w:r>
+      <w:r>
+        <w:rPr>
+          <w:rFonts w:ascii="Calibri" w:hAnsi="Calibri" w:eastAsia="Calibri"/>
+          <w:b w:val="0"/>
+          <w:sz w:val="22"/>
+        </w:rPr>
+        <w:t xml:space="preserve"> keys are 1-based and run in group order: group </w:t>
+      </w:r>
+      <w:r>
+        <w:rPr>
+          <w:rFonts w:ascii="Consolas" w:hAnsi="Consolas" w:eastAsia="Consolas"/>
+          <w:b w:val="0"/>
+          <w:sz w:val="20"/>
+        </w:rPr>
+        <w:t>0</w:t>
+      </w:r>
+      <w:r>
+        <w:rPr>
+          <w:rFonts w:ascii="Calibri" w:hAnsi="Calibri" w:eastAsia="Calibri"/>
+          <w:b w:val="0"/>
+          <w:sz w:val="22"/>
+        </w:rPr>
+        <w:t xml:space="preserve"> is </w:t>
+      </w:r>
+      <w:r>
+        <w:rPr>
+          <w:rFonts w:ascii="Consolas" w:hAnsi="Consolas" w:eastAsia="Consolas"/>
+          <w:b w:val="0"/>
+          <w:sz w:val="20"/>
+        </w:rPr>
+        <w:t>BTN1Setup</w:t>
+      </w:r>
+      <w:r>
+        <w:rPr>
+          <w:rFonts w:ascii="Calibri" w:hAnsi="Calibri" w:eastAsia="Calibri"/>
+          <w:b w:val="0"/>
+          <w:sz w:val="22"/>
+        </w:rPr>
+        <w:t>..</w:t>
+      </w:r>
+      <w:r>
+        <w:rPr>
+          <w:rFonts w:ascii="Consolas" w:hAnsi="Consolas" w:eastAsia="Consolas"/>
+          <w:b w:val="0"/>
+          <w:sz w:val="20"/>
+        </w:rPr>
+        <w:t>BTN5Setup</w:t>
+      </w:r>
+      <w:r>
+        <w:rPr>
+          <w:rFonts w:ascii="Calibri" w:hAnsi="Calibri" w:eastAsia="Calibri"/>
+          <w:b w:val="0"/>
+          <w:sz w:val="22"/>
+        </w:rPr>
+        <w:t xml:space="preserve">, group </w:t>
+      </w:r>
+      <w:r>
+        <w:rPr>
+          <w:rFonts w:ascii="Consolas" w:hAnsi="Consolas" w:eastAsia="Consolas"/>
+          <w:b w:val="0"/>
+          <w:sz w:val="20"/>
+        </w:rPr>
+        <w:t>1</w:t>
+      </w:r>
+      <w:r>
+        <w:rPr>
+          <w:rFonts w:ascii="Calibri" w:hAnsi="Calibri" w:eastAsia="Calibri"/>
+          <w:b w:val="0"/>
+          <w:sz w:val="22"/>
+        </w:rPr>
+        <w:t xml:space="preserve"> is </w:t>
+      </w:r>
+      <w:r>
+        <w:rPr>
+          <w:rFonts w:ascii="Consolas" w:hAnsi="Consolas" w:eastAsia="Consolas"/>
+          <w:b w:val="0"/>
+          <w:sz w:val="20"/>
+        </w:rPr>
+        <w:t>BTN6Setup</w:t>
+      </w:r>
+      <w:r>
+        <w:rPr>
+          <w:rFonts w:ascii="Calibri" w:hAnsi="Calibri" w:eastAsia="Calibri"/>
+          <w:b w:val="0"/>
+          <w:sz w:val="22"/>
+        </w:rPr>
+        <w:t>..</w:t>
+      </w:r>
+      <w:r>
+        <w:rPr>
+          <w:rFonts w:ascii="Consolas" w:hAnsi="Consolas" w:eastAsia="Consolas"/>
+          <w:b w:val="0"/>
+          <w:sz w:val="20"/>
+        </w:rPr>
+        <w:t>BTN10Setup</w:t>
+      </w:r>
+      <w:r>
+        <w:rPr>
+          <w:rFonts w:ascii="Calibri" w:hAnsi="Calibri" w:eastAsia="Calibri"/>
+          <w:b w:val="0"/>
+          <w:sz w:val="22"/>
+        </w:rPr>
+        <w:t xml:space="preserve">, and so on through group </w:t>
+      </w:r>
+      <w:r>
+        <w:rPr>
+          <w:rFonts w:ascii="Consolas" w:hAnsi="Consolas" w:eastAsia="Consolas"/>
+          <w:b w:val="0"/>
+          <w:sz w:val="20"/>
+        </w:rPr>
+        <w:t>23</w:t>
+      </w:r>
+      <w:r>
+        <w:rPr>
+          <w:rFonts w:ascii="Calibri" w:hAnsi="Calibri" w:eastAsia="Calibri"/>
+          <w:b w:val="0"/>
+          <w:sz w:val="22"/>
+        </w:rPr>
+        <w:t xml:space="preserve"> = </w:t>
+      </w:r>
+      <w:r>
+        <w:rPr>
+          <w:rFonts w:ascii="Consolas" w:hAnsi="Consolas" w:eastAsia="Consolas"/>
+          <w:b w:val="0"/>
+          <w:sz w:val="20"/>
+        </w:rPr>
+        <w:t>BTN116Setup</w:t>
+      </w:r>
+      <w:r>
+        <w:rPr>
+          <w:rFonts w:ascii="Calibri" w:hAnsi="Calibri" w:eastAsia="Calibri"/>
+          <w:b w:val="0"/>
+          <w:sz w:val="22"/>
+        </w:rPr>
+        <w:t>..</w:t>
+      </w:r>
+      <w:r>
+        <w:rPr>
+          <w:rFonts w:ascii="Consolas" w:hAnsi="Consolas" w:eastAsia="Consolas"/>
+          <w:b w:val="0"/>
+          <w:sz w:val="20"/>
+        </w:rPr>
+        <w:t>BTN120Setup</w:t>
+      </w:r>
+      <w:r>
+        <w:rPr>
+          <w:rFonts w:ascii="Calibri" w:hAnsi="Calibri" w:eastAsia="Calibri"/>
+          <w:b w:val="0"/>
+          <w:sz w:val="22"/>
+        </w:rPr>
+        <w:t>.</w:t>
+      </w:r>
+    </w:p>
+    <w:p>
+      <w:pPr>
+        <w:pStyle w:val="Normal"/>
+      </w:pPr>
+      <w:r>
+        <w:rPr>
+          <w:rFonts w:ascii="Calibri" w:hAnsi="Calibri" w:eastAsia="Calibri"/>
+          <w:b w:val="0"/>
+          <w:sz w:val="22"/>
+        </w:rPr>
+        <w:t>Bit weights inside one group:</w:t>
+      </w:r>
+    </w:p>
+    <w:tbl>
+      <w:tblPr>
+        <w:tblStyle w:val="TableGrid"/>
+        <w:tblW w:type="auto" w:w="0"/>
+        <w:tblLook w:firstColumn="1" w:firstRow="1" w:lastColumn="0" w:lastRow="0" w:noHBand="0" w:noVBand="1" w:val="04A0"/>
+      </w:tblPr>
+      <w:tblGrid>
+        <w:gridCol w:w="2412"/>
+        <w:gridCol w:w="2412"/>
+        <w:gridCol w:w="2412"/>
+        <w:gridCol w:w="2412"/>
+      </w:tblGrid>
+      <w:tr>
+        <w:tc>
+          <w:tcPr>
+            <w:tcW w:type="dxa" w:w="2412"/>
+            <w:shd w:fill="1F4E79" w:val="clear"/>
+          </w:tcPr>
+          <w:p>
+            <w:r>
+              <w:rPr>
+                <w:rFonts w:ascii="Calibri" w:hAnsi="Calibri" w:eastAsia="Calibri"/>
+                <w:b/>
+                <w:color w:val="FFFFFF"/>
+                <w:sz w:val="20"/>
+              </w:rPr>
+              <w:t>Button in group</w:t>
+            </w:r>
+          </w:p>
+        </w:tc>
+        <w:tc>
+          <w:tcPr>
+            <w:tcW w:type="dxa" w:w="2412"/>
+            <w:shd w:fill="1F4E79" w:val="clear"/>
+          </w:tcPr>
+          <w:p>
+            <w:pPr>
+              <w:jc w:val="right"/>
+            </w:pPr>
+            <w:r>
+              <w:rPr>
+                <w:rFonts w:ascii="Calibri" w:hAnsi="Calibri" w:eastAsia="Calibri"/>
+                <w:b/>
+                <w:color w:val="FFFFFF"/>
+                <w:sz w:val="20"/>
+              </w:rPr>
+              <w:t>Bit</w:t>
+            </w:r>
+          </w:p>
+        </w:tc>
+        <w:tc>
+          <w:tcPr>
+            <w:tcW w:type="dxa" w:w="2412"/>
+            <w:shd w:fill="1F4E79" w:val="clear"/>
+          </w:tcPr>
+          <w:p>
+            <w:pPr>
+              <w:jc w:val="right"/>
+            </w:pPr>
+            <w:r>
+              <w:rPr>
+                <w:rFonts w:ascii="Calibri" w:hAnsi="Calibri" w:eastAsia="Calibri"/>
+                <w:b/>
+                <w:color w:val="FFFFFF"/>
+                <w:sz w:val="20"/>
+              </w:rPr>
+              <w:t>Bit weight</w:t>
+            </w:r>
+          </w:p>
+        </w:tc>
+        <w:tc>
+          <w:tcPr>
+            <w:tcW w:type="dxa" w:w="2412"/>
+            <w:shd w:fill="1F4E79" w:val="clear"/>
+          </w:tcPr>
+          <w:p>
+            <w:r>
+              <w:rPr>
+                <w:rFonts w:ascii="Calibri" w:hAnsi="Calibri" w:eastAsia="Calibri"/>
+                <w:b/>
+                <w:color w:val="FFFFFF"/>
+                <w:sz w:val="20"/>
+              </w:rPr>
+              <w:t>TCSView.ini key</w:t>
+            </w:r>
+          </w:p>
+        </w:tc>
+      </w:tr>
+      <w:tr>
+        <w:tc>
+          <w:tcPr>
+            <w:tcW w:type="dxa" w:w="2412"/>
+          </w:tcPr>
+          <w:p>
+            <w:r>
+              <w:rPr>
+                <w:rFonts w:ascii="Calibri" w:hAnsi="Calibri" w:eastAsia="Calibri"/>
+                <w:b w:val="0"/>
+                <w:color w:val="000000"/>
+                <w:sz w:val="20"/>
+              </w:rPr>
+              <w:t>1st</w:t>
+            </w:r>
+          </w:p>
+        </w:tc>
+        <w:tc>
+          <w:tcPr>
+            <w:tcW w:type="dxa" w:w="2412"/>
+          </w:tcPr>
+          <w:p>
+            <w:pPr>
+              <w:jc w:val="right"/>
+            </w:pPr>
+            <w:r>
+              <w:rPr>
+                <w:rFonts w:ascii="Calibri" w:hAnsi="Calibri" w:eastAsia="Calibri"/>
+                <w:b w:val="0"/>
+                <w:color w:val="000000"/>
+                <w:sz w:val="20"/>
+              </w:rPr>
+              <w:t>0</w:t>
+            </w:r>
+          </w:p>
+        </w:tc>
+        <w:tc>
+          <w:tcPr>
+            <w:tcW w:type="dxa" w:w="2412"/>
+          </w:tcPr>
+          <w:p>
+            <w:pPr>
+              <w:jc w:val="right"/>
+            </w:pPr>
+            <w:r>
+              <w:rPr>
+                <w:rFonts w:ascii="Calibri" w:hAnsi="Calibri" w:eastAsia="Calibri"/>
+                <w:b w:val="0"/>
+                <w:color w:val="000000"/>
+                <w:sz w:val="20"/>
+              </w:rPr>
+              <w:t>1</w:t>
+            </w:r>
+          </w:p>
+        </w:tc>
+        <w:tc>
+          <w:tcPr>
+            <w:tcW w:type="dxa" w:w="2412"/>
+          </w:tcPr>
+          <w:p>
+            <w:r>
+              <w:rPr>
+                <w:rFonts w:ascii="Calibri" w:hAnsi="Calibri" w:eastAsia="Calibri"/>
+                <w:b w:val="0"/>
+                <w:color w:val="000000"/>
+                <w:sz w:val="20"/>
+              </w:rPr>
+              <w:t>BTN{g*5+1}Setup</w:t>
+            </w:r>
+          </w:p>
+        </w:tc>
+      </w:tr>
+      <w:tr>
+        <w:tc>
+          <w:tcPr>
+            <w:tcW w:type="dxa" w:w="2412"/>
+            <w:shd w:val="clear" w:fill="EEF3F8"/>
+          </w:tcPr>
+          <w:p>
+            <w:r>
+              <w:rPr>
+                <w:rFonts w:ascii="Calibri" w:hAnsi="Calibri" w:eastAsia="Calibri"/>
+                <w:b w:val="0"/>
+                <w:color w:val="000000"/>
+                <w:sz w:val="20"/>
+              </w:rPr>
+              <w:t>2nd</w:t>
+            </w:r>
+          </w:p>
+        </w:tc>
+        <w:tc>
+          <w:tcPr>
+            <w:tcW w:type="dxa" w:w="2412"/>
+            <w:shd w:val="clear" w:fill="EEF3F8"/>
+          </w:tcPr>
+          <w:p>
+            <w:pPr>
+              <w:jc w:val="right"/>
+            </w:pPr>
+            <w:r>
+              <w:rPr>
+                <w:rFonts w:ascii="Calibri" w:hAnsi="Calibri" w:eastAsia="Calibri"/>
+                <w:b w:val="0"/>
+                <w:color w:val="000000"/>
+                <w:sz w:val="20"/>
+              </w:rPr>
+              <w:t>1</w:t>
+            </w:r>
+          </w:p>
+        </w:tc>
+        <w:tc>
+          <w:tcPr>
+            <w:tcW w:type="dxa" w:w="2412"/>
+            <w:shd w:val="clear" w:fill="EEF3F8"/>
+          </w:tcPr>
+          <w:p>
+            <w:pPr>
+              <w:jc w:val="right"/>
+            </w:pPr>
+            <w:r>
+              <w:rPr>
+                <w:rFonts w:ascii="Calibri" w:hAnsi="Calibri" w:eastAsia="Calibri"/>
+                <w:b w:val="0"/>
+                <w:color w:val="000000"/>
+                <w:sz w:val="20"/>
+              </w:rPr>
+              <w:t>2</w:t>
+            </w:r>
+          </w:p>
+        </w:tc>
+        <w:tc>
+          <w:tcPr>
+            <w:tcW w:type="dxa" w:w="2412"/>
+            <w:shd w:val="clear" w:fill="EEF3F8"/>
+          </w:tcPr>
+          <w:p>
+            <w:r>
+              <w:rPr>
+                <w:rFonts w:ascii="Calibri" w:hAnsi="Calibri" w:eastAsia="Calibri"/>
+                <w:b w:val="0"/>
+                <w:color w:val="000000"/>
+                <w:sz w:val="20"/>
+              </w:rPr>
+              <w:t>BTN{g*5+2}Setup</w:t>
+            </w:r>
+          </w:p>
+        </w:tc>
+      </w:tr>
+      <w:tr>
+        <w:tc>
+          <w:tcPr>
+            <w:tcW w:type="dxa" w:w="2412"/>
+          </w:tcPr>
+          <w:p>
+            <w:r>
+              <w:rPr>
+                <w:rFonts w:ascii="Calibri" w:hAnsi="Calibri" w:eastAsia="Calibri"/>
+                <w:b w:val="0"/>
+                <w:color w:val="000000"/>
+                <w:sz w:val="20"/>
+              </w:rPr>
+              <w:t>3rd</w:t>
+            </w:r>
+          </w:p>
+        </w:tc>
+        <w:tc>
+          <w:tcPr>
+            <w:tcW w:type="dxa" w:w="2412"/>
+          </w:tcPr>
+          <w:p>
+            <w:pPr>
+              <w:jc w:val="right"/>
+            </w:pPr>
+            <w:r>
+              <w:rPr>
+                <w:rFonts w:ascii="Calibri" w:hAnsi="Calibri" w:eastAsia="Calibri"/>
+                <w:b w:val="0"/>
+                <w:color w:val="000000"/>
+                <w:sz w:val="20"/>
+              </w:rPr>
+              <w:t>2</w:t>
+            </w:r>
+          </w:p>
+        </w:tc>
+        <w:tc>
+          <w:tcPr>
+            <w:tcW w:type="dxa" w:w="2412"/>
+          </w:tcPr>
+          <w:p>
+            <w:pPr>
+              <w:jc w:val="right"/>
+            </w:pPr>
+            <w:r>
+              <w:rPr>
+                <w:rFonts w:ascii="Calibri" w:hAnsi="Calibri" w:eastAsia="Calibri"/>
+                <w:b w:val="0"/>
+                <w:color w:val="000000"/>
+                <w:sz w:val="20"/>
+              </w:rPr>
+              <w:t>4</w:t>
+            </w:r>
+          </w:p>
+        </w:tc>
+        <w:tc>
+          <w:tcPr>
+            <w:tcW w:type="dxa" w:w="2412"/>
+          </w:tcPr>
+          <w:p>
+            <w:r>
+              <w:rPr>
+                <w:rFonts w:ascii="Calibri" w:hAnsi="Calibri" w:eastAsia="Calibri"/>
+                <w:b w:val="0"/>
+                <w:color w:val="000000"/>
+                <w:sz w:val="20"/>
+              </w:rPr>
+              <w:t>BTN{g*5+3}Setup</w:t>
+            </w:r>
+          </w:p>
+        </w:tc>
+      </w:tr>
+      <w:tr>
+        <w:tc>
+          <w:tcPr>
+            <w:tcW w:type="dxa" w:w="2412"/>
+            <w:shd w:val="clear" w:fill="EEF3F8"/>
+          </w:tcPr>
+          <w:p>
+            <w:r>
+              <w:rPr>
+                <w:rFonts w:ascii="Calibri" w:hAnsi="Calibri" w:eastAsia="Calibri"/>
+                <w:b w:val="0"/>
+                <w:color w:val="000000"/>
+                <w:sz w:val="20"/>
+              </w:rPr>
+              <w:t>4th</w:t>
+            </w:r>
+          </w:p>
+        </w:tc>
+        <w:tc>
+          <w:tcPr>
+            <w:tcW w:type="dxa" w:w="2412"/>
+            <w:shd w:val="clear" w:fill="EEF3F8"/>
+          </w:tcPr>
+          <w:p>
+            <w:pPr>
+              <w:jc w:val="right"/>
+            </w:pPr>
+            <w:r>
+              <w:rPr>
+                <w:rFonts w:ascii="Calibri" w:hAnsi="Calibri" w:eastAsia="Calibri"/>
+                <w:b w:val="0"/>
+                <w:color w:val="000000"/>
+                <w:sz w:val="20"/>
+              </w:rPr>
+              <w:t>3</w:t>
+            </w:r>
+          </w:p>
+        </w:tc>
+        <w:tc>
+          <w:tcPr>
+            <w:tcW w:type="dxa" w:w="2412"/>
+            <w:shd w:val="clear" w:fill="EEF3F8"/>
+          </w:tcPr>
+          <w:p>
+            <w:pPr>
+              <w:jc w:val="right"/>
+            </w:pPr>
+            <w:r>
+              <w:rPr>
+                <w:rFonts w:ascii="Calibri" w:hAnsi="Calibri" w:eastAsia="Calibri"/>
+                <w:b w:val="0"/>
+                <w:color w:val="000000"/>
+                <w:sz w:val="20"/>
+              </w:rPr>
+              <w:t>8</w:t>
+            </w:r>
+          </w:p>
+        </w:tc>
+        <w:tc>
+          <w:tcPr>
+            <w:tcW w:type="dxa" w:w="2412"/>
+            <w:shd w:val="clear" w:fill="EEF3F8"/>
+          </w:tcPr>
+          <w:p>
+            <w:r>
+              <w:rPr>
+                <w:rFonts w:ascii="Calibri" w:hAnsi="Calibri" w:eastAsia="Calibri"/>
+                <w:b w:val="0"/>
+                <w:color w:val="000000"/>
+                <w:sz w:val="20"/>
+              </w:rPr>
+              <w:t>BTN{g*5+4}Setup</w:t>
+            </w:r>
+          </w:p>
+        </w:tc>
+      </w:tr>
+      <w:tr>
+        <w:tc>
+          <w:tcPr>
+            <w:tcW w:type="dxa" w:w="2412"/>
+          </w:tcPr>
+          <w:p>
+            <w:r>
+              <w:rPr>
+                <w:rFonts w:ascii="Calibri" w:hAnsi="Calibri" w:eastAsia="Calibri"/>
+                <w:b w:val="0"/>
+                <w:color w:val="000000"/>
+                <w:sz w:val="20"/>
+              </w:rPr>
+              <w:t>5th</w:t>
+            </w:r>
+          </w:p>
+        </w:tc>
+        <w:tc>
+          <w:tcPr>
+            <w:tcW w:type="dxa" w:w="2412"/>
+          </w:tcPr>
+          <w:p>
+            <w:pPr>
+              <w:jc w:val="right"/>
+            </w:pPr>
+            <w:r>
+              <w:rPr>
+                <w:rFonts w:ascii="Calibri" w:hAnsi="Calibri" w:eastAsia="Calibri"/>
+                <w:b w:val="0"/>
+                <w:color w:val="000000"/>
+                <w:sz w:val="20"/>
+              </w:rPr>
+              <w:t>4</w:t>
+            </w:r>
+          </w:p>
+        </w:tc>
+        <w:tc>
+          <w:tcPr>
+            <w:tcW w:type="dxa" w:w="2412"/>
+          </w:tcPr>
+          <w:p>
+            <w:pPr>
+              <w:jc w:val="right"/>
+            </w:pPr>
+            <w:r>
+              <w:rPr>
+                <w:rFonts w:ascii="Calibri" w:hAnsi="Calibri" w:eastAsia="Calibri"/>
+                <w:b w:val="0"/>
+                <w:color w:val="000000"/>
+                <w:sz w:val="20"/>
+              </w:rPr>
+              <w:t>16</w:t>
+            </w:r>
+          </w:p>
+        </w:tc>
+        <w:tc>
+          <w:tcPr>
+            <w:tcW w:type="dxa" w:w="2412"/>
+          </w:tcPr>
+          <w:p>
+            <w:r>
+              <w:rPr>
+                <w:rFonts w:ascii="Calibri" w:hAnsi="Calibri" w:eastAsia="Calibri"/>
+                <w:b w:val="0"/>
+                <w:color w:val="000000"/>
+                <w:sz w:val="20"/>
+              </w:rPr>
+              <w:t>BTN{g*5+5}Setup</w:t>
+            </w:r>
+          </w:p>
+        </w:tc>
+      </w:tr>
+    </w:tbl>
+    <w:p>
+      <w:pPr>
+        <w:pStyle w:val="Normal"/>
+      </w:pPr>
+      <w:r>
+        <w:rPr>
+          <w:rFonts w:ascii="Calibri" w:hAnsi="Calibri" w:eastAsia="Calibri"/>
+          <w:b w:val="0"/>
+          <w:sz w:val="22"/>
+        </w:rPr>
+        <w:t xml:space="preserve">The payload stores each group as a </w:t>
+      </w:r>
+      <w:r>
+        <w:rPr>
+          <w:rFonts w:ascii="Consolas" w:hAnsi="Consolas" w:eastAsia="Consolas"/>
+          <w:b w:val="0"/>
+          <w:sz w:val="20"/>
+        </w:rPr>
+        <w:t>short</w:t>
+      </w:r>
+      <w:r>
+        <w:rPr>
+          <w:rFonts w:ascii="Calibri" w:hAnsi="Calibri" w:eastAsia="Calibri"/>
+          <w:b w:val="0"/>
+          <w:sz w:val="22"/>
+        </w:rPr>
+        <w:t xml:space="preserve">. Only bits </w:t>
+      </w:r>
+      <w:r>
+        <w:rPr>
+          <w:rFonts w:ascii="Consolas" w:hAnsi="Consolas" w:eastAsia="Consolas"/>
+          <w:b w:val="0"/>
+          <w:sz w:val="20"/>
+        </w:rPr>
+        <w:t>0..4</w:t>
+      </w:r>
+      <w:r>
+        <w:rPr>
+          <w:rFonts w:ascii="Calibri" w:hAnsi="Calibri" w:eastAsia="Calibri"/>
+          <w:b w:val="0"/>
+          <w:sz w:val="22"/>
+        </w:rPr>
+        <w:t xml:space="preserve"> are used, so each </w:t>
+      </w:r>
+      <w:r>
+        <w:rPr>
+          <w:rFonts w:ascii="Consolas" w:hAnsi="Consolas" w:eastAsia="Consolas"/>
+          <w:b w:val="0"/>
+          <w:sz w:val="20"/>
+        </w:rPr>
+        <w:t>sButtonInd[i][g]</w:t>
+      </w:r>
+      <w:r>
+        <w:rPr>
+          <w:rFonts w:ascii="Calibri" w:hAnsi="Calibri" w:eastAsia="Calibri"/>
+          <w:b w:val="0"/>
+          <w:sz w:val="22"/>
+        </w:rPr>
+        <w:t xml:space="preserve"> value is </w:t>
+      </w:r>
+      <w:r>
+        <w:rPr>
+          <w:rFonts w:ascii="Consolas" w:hAnsi="Consolas" w:eastAsia="Consolas"/>
+          <w:b w:val="0"/>
+          <w:sz w:val="20"/>
+        </w:rPr>
+        <w:t>0..31</w:t>
+      </w:r>
+      <w:r>
+        <w:rPr>
+          <w:rFonts w:ascii="Calibri" w:hAnsi="Calibri" w:eastAsia="Calibri"/>
+          <w:b w:val="0"/>
+          <w:sz w:val="22"/>
+        </w:rPr>
+        <w:t xml:space="preserve">. Channel </w:t>
+      </w:r>
+      <w:r>
+        <w:rPr>
+          <w:rFonts w:ascii="Consolas" w:hAnsi="Consolas" w:eastAsia="Consolas"/>
+          <w:b w:val="0"/>
+          <w:sz w:val="20"/>
+        </w:rPr>
+        <w:t>n</w:t>
+      </w:r>
+      <w:r>
+        <w:rPr>
+          <w:rFonts w:ascii="Calibri" w:hAnsi="Calibri" w:eastAsia="Calibri"/>
+          <w:b w:val="0"/>
+          <w:sz w:val="22"/>
+        </w:rPr>
+        <w:t xml:space="preserve"> in that group is on when </w:t>
+      </w:r>
+      <w:r>
+        <w:rPr>
+          <w:rFonts w:ascii="Consolas" w:hAnsi="Consolas" w:eastAsia="Consolas"/>
+          <w:b w:val="0"/>
+          <w:sz w:val="20"/>
+        </w:rPr>
+        <w:t>(value &amp; bit_weight) != 0</w:t>
+      </w:r>
+      <w:r>
+        <w:rPr>
+          <w:rFonts w:ascii="Calibri" w:hAnsi="Calibri" w:eastAsia="Calibri"/>
+          <w:b w:val="0"/>
+          <w:sz w:val="22"/>
+        </w:rPr>
+        <w:t xml:space="preserve">. Unused buttons in a group stay </w:t>
+      </w:r>
+      <w:r>
+        <w:rPr>
+          <w:rFonts w:ascii="Consolas" w:hAnsi="Consolas" w:eastAsia="Consolas"/>
+          <w:b w:val="0"/>
+          <w:sz w:val="20"/>
+        </w:rPr>
+        <w:t>0</w:t>
+      </w:r>
+      <w:r>
+        <w:rPr>
+          <w:rFonts w:ascii="Calibri" w:hAnsi="Calibri" w:eastAsia="Calibri"/>
+          <w:b w:val="0"/>
+          <w:sz w:val="22"/>
+        </w:rPr>
+        <w:t xml:space="preserve">. Button labels come from that </w:t>
+      </w:r>
+      <w:r>
+        <w:rPr>
+          <w:rFonts w:ascii="Consolas" w:hAnsi="Consolas" w:eastAsia="Consolas"/>
+          <w:b w:val="0"/>
+          <w:sz w:val="20"/>
+        </w:rPr>
+        <w:t>BTN#Setup</w:t>
+      </w:r>
+      <w:r>
+        <w:rPr>
+          <w:rFonts w:ascii="Calibri" w:hAnsi="Calibri" w:eastAsia="Calibri"/>
+          <w:b w:val="0"/>
+          <w:sz w:val="22"/>
+        </w:rPr>
+        <w:t xml:space="preserve"> entry. Group titles on the TCS page (for example RESET DRIVE, THRUSTER) come from the vessel GUI layout, not from this bitfield.</w:t>
+      </w:r>
+    </w:p>
+    <w:p>
+      <w:pPr>
+        <w:pStyle w:val="Normal"/>
+      </w:pPr>
+      <w:r>
+        <w:rPr>
+          <w:rFonts w:ascii="Calibri" w:hAnsi="Calibri" w:eastAsia="Calibri"/>
+          <w:b w:val="0"/>
+          <w:sz w:val="22"/>
+        </w:rPr>
+        <w:t>Group-to-key map:</w:t>
+      </w:r>
+    </w:p>
+    <w:tbl>
+      <w:tblPr>
+        <w:tblStyle w:val="TableGrid"/>
+        <w:tblW w:type="auto" w:w="0"/>
+        <w:tblLook w:firstColumn="1" w:firstRow="1" w:lastColumn="0" w:lastRow="0" w:noHBand="0" w:noVBand="1" w:val="04A0"/>
+      </w:tblPr>
+      <w:tblGrid>
+        <w:gridCol w:w="3216"/>
+        <w:gridCol w:w="3216"/>
+        <w:gridCol w:w="3216"/>
+      </w:tblGrid>
+      <w:tr>
+        <w:tc>
+          <w:tcPr>
+            <w:tcW w:type="dxa" w:w="3216"/>
+            <w:shd w:fill="1F4E79" w:val="clear"/>
+          </w:tcPr>
+          <w:p>
+            <w:pPr>
+              <w:jc w:val="right"/>
+            </w:pPr>
+            <w:r>
+              <w:rPr>
+                <w:rFonts w:ascii="Calibri" w:hAnsi="Calibri" w:eastAsia="Calibri"/>
+                <w:b/>
+                <w:color w:val="FFFFFF"/>
+                <w:sz w:val="20"/>
+              </w:rPr>
+              <w:t>Group g</w:t>
+            </w:r>
+          </w:p>
+        </w:tc>
+        <w:tc>
+          <w:tcPr>
+            <w:tcW w:type="dxa" w:w="3216"/>
+            <w:shd w:fill="1F4E79" w:val="clear"/>
+          </w:tcPr>
+          <w:p>
+            <w:r>
+              <w:rPr>
+                <w:rFonts w:ascii="Calibri" w:hAnsi="Calibri" w:eastAsia="Calibri"/>
+                <w:b/>
+                <w:color w:val="FFFFFF"/>
+                <w:sz w:val="20"/>
+              </w:rPr>
+              <w:t>sButtonInd[i][g]</w:t>
+            </w:r>
+          </w:p>
+        </w:tc>
+        <w:tc>
+          <w:tcPr>
+            <w:tcW w:type="dxa" w:w="3216"/>
+            <w:shd w:fill="1F4E79" w:val="clear"/>
+          </w:tcPr>
+          <w:p>
+            <w:r>
+              <w:rPr>
+                <w:rFonts w:ascii="Calibri" w:hAnsi="Calibri" w:eastAsia="Calibri"/>
+                <w:b/>
+                <w:color w:val="FFFFFF"/>
+                <w:sz w:val="20"/>
+              </w:rPr>
+              <w:t>TCSView.ini keys</w:t>
+            </w:r>
+          </w:p>
+        </w:tc>
+      </w:tr>
+      <w:tr>
+        <w:tc>
+          <w:tcPr>
+            <w:tcW w:type="dxa" w:w="3216"/>
+          </w:tcPr>
+          <w:p>
+            <w:pPr>
+              <w:jc w:val="right"/>
+            </w:pPr>
+            <w:r>
+              <w:rPr>
+                <w:rFonts w:ascii="Calibri" w:hAnsi="Calibri" w:eastAsia="Calibri"/>
+                <w:b w:val="0"/>
+                <w:color w:val="000000"/>
+                <w:sz w:val="20"/>
+              </w:rPr>
+              <w:t>0</w:t>
+            </w:r>
+          </w:p>
+        </w:tc>
+        <w:tc>
+          <w:tcPr>
+            <w:tcW w:type="dxa" w:w="3216"/>
+          </w:tcPr>
+          <w:p>
+            <w:r>
+              <w:rPr>
+                <w:rFonts w:ascii="Calibri" w:hAnsi="Calibri"/>
+                <w:color w:val="000000"/>
+                <w:sz w:val="20"/>
+              </w:rPr>
+              <w:t>group 0</w:t>
+            </w:r>
+          </w:p>
+        </w:tc>
+        <w:tc>
+          <w:tcPr>
+            <w:tcW w:type="dxa" w:w="3216"/>
+          </w:tcPr>
+          <w:p>
+            <w:r>
+              <w:rPr>
+                <w:rFonts w:ascii="Calibri" w:hAnsi="Calibri" w:eastAsia="Calibri"/>
+                <w:b w:val="0"/>
+                <w:color w:val="000000"/>
+                <w:sz w:val="20"/>
+              </w:rPr>
+              <w:t>BTN1Setup .. BTN5Setup</w:t>
+            </w:r>
+          </w:p>
+        </w:tc>
+      </w:tr>
+      <w:tr>
+        <w:tc>
+          <w:tcPr>
+            <w:tcW w:type="dxa" w:w="3216"/>
+            <w:shd w:val="clear" w:fill="EEF3F8"/>
+          </w:tcPr>
+          <w:p>
+            <w:pPr>
+              <w:jc w:val="right"/>
+            </w:pPr>
+            <w:r>
+              <w:rPr>
+                <w:rFonts w:ascii="Calibri" w:hAnsi="Calibri" w:eastAsia="Calibri"/>
+                <w:b w:val="0"/>
+                <w:color w:val="000000"/>
+                <w:sz w:val="20"/>
+              </w:rPr>
+              <w:t>1</w:t>
+            </w:r>
+          </w:p>
+        </w:tc>
+        <w:tc>
+          <w:tcPr>
+            <w:tcW w:type="dxa" w:w="3216"/>
+            <w:shd w:val="clear" w:fill="EEF3F8"/>
+          </w:tcPr>
+          <w:p>
+            <w:r>
+              <w:rPr>
+                <w:rFonts w:ascii="Calibri" w:hAnsi="Calibri"/>
+                <w:color w:val="000000"/>
+                <w:sz w:val="20"/>
+              </w:rPr>
+              <w:t>group 1</w:t>
+            </w:r>
+          </w:p>
+        </w:tc>
+        <w:tc>
+          <w:tcPr>
+            <w:tcW w:type="dxa" w:w="3216"/>
+            <w:shd w:val="clear" w:fill="EEF3F8"/>
+          </w:tcPr>
+          <w:p>
+            <w:r>
+              <w:rPr>
+                <w:rFonts w:ascii="Calibri" w:hAnsi="Calibri" w:eastAsia="Calibri"/>
+                <w:b w:val="0"/>
+                <w:color w:val="000000"/>
+                <w:sz w:val="20"/>
+              </w:rPr>
+              <w:t>BTN6Setup .. BTN10Setup</w:t>
+            </w:r>
+          </w:p>
+        </w:tc>
+      </w:tr>
+      <w:tr>
+        <w:tc>
+          <w:tcPr>
+            <w:tcW w:type="dxa" w:w="3216"/>
+          </w:tcPr>
+          <w:p>
+            <w:pPr>
+              <w:jc w:val="right"/>
+            </w:pPr>
+            <w:r>
+              <w:rPr>
+                <w:rFonts w:ascii="Calibri" w:hAnsi="Calibri" w:eastAsia="Calibri"/>
+                <w:b w:val="0"/>
+                <w:color w:val="000000"/>
+                <w:sz w:val="20"/>
+              </w:rPr>
+              <w:t>2</w:t>
+            </w:r>
+          </w:p>
+        </w:tc>
+        <w:tc>
+          <w:tcPr>
+            <w:tcW w:type="dxa" w:w="3216"/>
+          </w:tcPr>
+          <w:p>
+            <w:r>
+              <w:rPr>
+                <w:rFonts w:ascii="Calibri" w:hAnsi="Calibri"/>
+                <w:color w:val="000000"/>
+                <w:sz w:val="20"/>
+              </w:rPr>
+              <w:t>group 2</w:t>
+            </w:r>
+          </w:p>
+        </w:tc>
+        <w:tc>
+          <w:tcPr>
+            <w:tcW w:type="dxa" w:w="3216"/>
+          </w:tcPr>
+          <w:p>
+            <w:r>
+              <w:rPr>
+                <w:rFonts w:ascii="Calibri" w:hAnsi="Calibri" w:eastAsia="Calibri"/>
+                <w:b w:val="0"/>
+                <w:color w:val="000000"/>
+                <w:sz w:val="20"/>
+              </w:rPr>
+              <w:t>BTN11Setup .. BTN15Setup</w:t>
+            </w:r>
+          </w:p>
+        </w:tc>
+      </w:tr>
+      <w:tr>
+        <w:tc>
+          <w:tcPr>
+            <w:tcW w:type="dxa" w:w="3216"/>
+            <w:shd w:val="clear" w:fill="EEF3F8"/>
+          </w:tcPr>
+          <w:p>
+            <w:pPr>
+              <w:jc w:val="right"/>
+            </w:pPr>
+            <w:r>
+              <w:rPr>
+                <w:rFonts w:ascii="Calibri" w:hAnsi="Calibri" w:eastAsia="Calibri"/>
+                <w:b w:val="0"/>
+                <w:color w:val="000000"/>
+                <w:sz w:val="20"/>
+              </w:rPr>
+              <w:t>3</w:t>
+            </w:r>
+          </w:p>
+        </w:tc>
+        <w:tc>
+          <w:tcPr>
+            <w:tcW w:type="dxa" w:w="3216"/>
+            <w:shd w:val="clear" w:fill="EEF3F8"/>
+          </w:tcPr>
+          <w:p>
+            <w:r>
+              <w:rPr>
+                <w:rFonts w:ascii="Calibri" w:hAnsi="Calibri"/>
+                <w:color w:val="000000"/>
+                <w:sz w:val="20"/>
+              </w:rPr>
+              <w:t>group 3</w:t>
+            </w:r>
+          </w:p>
+        </w:tc>
+        <w:tc>
+          <w:tcPr>
+            <w:tcW w:type="dxa" w:w="3216"/>
+            <w:shd w:val="clear" w:fill="EEF3F8"/>
+          </w:tcPr>
+          <w:p>
+            <w:r>
+              <w:rPr>
+                <w:rFonts w:ascii="Calibri" w:hAnsi="Calibri" w:eastAsia="Calibri"/>
+                <w:b w:val="0"/>
+                <w:color w:val="000000"/>
+                <w:sz w:val="20"/>
+              </w:rPr>
+              <w:t>BTN16Setup .. BTN20Setup</w:t>
+            </w:r>
+          </w:p>
+        </w:tc>
+      </w:tr>
+      <w:tr>
+        <w:tc>
+          <w:tcPr>
+            <w:tcW w:type="dxa" w:w="3216"/>
+          </w:tcPr>
+          <w:p>
+            <w:pPr>
+              <w:jc w:val="right"/>
+            </w:pPr>
+            <w:r>
+              <w:rPr>
+                <w:rFonts w:ascii="Calibri" w:hAnsi="Calibri" w:eastAsia="Calibri"/>
+                <w:b w:val="0"/>
+                <w:color w:val="000000"/>
+                <w:sz w:val="20"/>
+              </w:rPr>
+              <w:t>4</w:t>
+            </w:r>
+          </w:p>
+        </w:tc>
+        <w:tc>
+          <w:tcPr>
+            <w:tcW w:type="dxa" w:w="3216"/>
+          </w:tcPr>
+          <w:p>
+            <w:r>
+              <w:rPr>
+                <w:rFonts w:ascii="Calibri" w:hAnsi="Calibri"/>
+                <w:color w:val="000000"/>
+                <w:sz w:val="20"/>
+              </w:rPr>
+              <w:t>group 4</w:t>
+            </w:r>
+          </w:p>
+        </w:tc>
+        <w:tc>
+          <w:tcPr>
+            <w:tcW w:type="dxa" w:w="3216"/>
+          </w:tcPr>
+          <w:p>
+            <w:r>
+              <w:rPr>
+                <w:rFonts w:ascii="Calibri" w:hAnsi="Calibri" w:eastAsia="Calibri"/>
+                <w:b w:val="0"/>
+                <w:color w:val="000000"/>
+                <w:sz w:val="20"/>
+              </w:rPr>
+              <w:t>BTN21Setup .. BTN25Setup</w:t>
+            </w:r>
+          </w:p>
+        </w:tc>
+      </w:tr>
+      <w:tr>
+        <w:tc>
+          <w:tcPr>
+            <w:tcW w:type="dxa" w:w="3216"/>
+            <w:shd w:val="clear" w:fill="EEF3F8"/>
+          </w:tcPr>
+          <w:p>
+            <w:pPr>
+              <w:jc w:val="right"/>
+            </w:pPr>
+            <w:r>
+              <w:rPr>
+                <w:rFonts w:ascii="Calibri" w:hAnsi="Calibri" w:eastAsia="Calibri"/>
+                <w:b w:val="0"/>
+                <w:color w:val="000000"/>
+                <w:sz w:val="20"/>
+              </w:rPr>
+              <w:t>5</w:t>
+            </w:r>
+          </w:p>
+        </w:tc>
+        <w:tc>
+          <w:tcPr>
+            <w:tcW w:type="dxa" w:w="3216"/>
+            <w:shd w:val="clear" w:fill="EEF3F8"/>
+          </w:tcPr>
+          <w:p>
+            <w:r>
+              <w:rPr>
+                <w:rFonts w:ascii="Calibri" w:hAnsi="Calibri"/>
+                <w:color w:val="000000"/>
+                <w:sz w:val="20"/>
+              </w:rPr>
+              <w:t>group 5</w:t>
+            </w:r>
+          </w:p>
+        </w:tc>
+        <w:tc>
+          <w:tcPr>
+            <w:tcW w:type="dxa" w:w="3216"/>
+            <w:shd w:val="clear" w:fill="EEF3F8"/>
+          </w:tcPr>
+          <w:p>
+            <w:r>
+              <w:rPr>
+                <w:rFonts w:ascii="Calibri" w:hAnsi="Calibri" w:eastAsia="Calibri"/>
+                <w:b w:val="0"/>
+                <w:color w:val="000000"/>
+                <w:sz w:val="20"/>
+              </w:rPr>
+              <w:t>BTN26Setup .. BTN30Setup</w:t>
+            </w:r>
+          </w:p>
+        </w:tc>
+      </w:tr>
+      <w:tr>
+        <w:tc>
+          <w:tcPr>
+            <w:tcW w:type="dxa" w:w="3216"/>
+          </w:tcPr>
+          <w:p>
+            <w:pPr>
+              <w:jc w:val="right"/>
+            </w:pPr>
+            <w:r>
+              <w:rPr>
+                <w:rFonts w:ascii="Calibri" w:hAnsi="Calibri" w:eastAsia="Calibri"/>
+                <w:b w:val="0"/>
+                <w:color w:val="000000"/>
+                <w:sz w:val="20"/>
+              </w:rPr>
+              <w:t>6</w:t>
+            </w:r>
+          </w:p>
+        </w:tc>
+        <w:tc>
+          <w:tcPr>
+            <w:tcW w:type="dxa" w:w="3216"/>
+          </w:tcPr>
+          <w:p>
+            <w:r>
+              <w:rPr>
+                <w:rFonts w:ascii="Calibri" w:hAnsi="Calibri"/>
+                <w:color w:val="000000"/>
+                <w:sz w:val="20"/>
+              </w:rPr>
+              <w:t>group 6</w:t>
+            </w:r>
+          </w:p>
+        </w:tc>
+        <w:tc>
+          <w:tcPr>
+            <w:tcW w:type="dxa" w:w="3216"/>
+          </w:tcPr>
+          <w:p>
+            <w:r>
+              <w:rPr>
+                <w:rFonts w:ascii="Calibri" w:hAnsi="Calibri" w:eastAsia="Calibri"/>
+                <w:b w:val="0"/>
+                <w:color w:val="000000"/>
+                <w:sz w:val="20"/>
+              </w:rPr>
+              <w:t>BTN31Setup .. BTN35Setup</w:t>
+            </w:r>
+          </w:p>
+        </w:tc>
+      </w:tr>
+      <w:tr>
+        <w:tc>
+          <w:tcPr>
+            <w:tcW w:type="dxa" w:w="3216"/>
+            <w:shd w:val="clear" w:fill="EEF3F8"/>
+          </w:tcPr>
+          <w:p>
+            <w:pPr>
+              <w:jc w:val="right"/>
+            </w:pPr>
+            <w:r>
+              <w:rPr>
+                <w:rFonts w:ascii="Calibri" w:hAnsi="Calibri" w:eastAsia="Calibri"/>
+                <w:b w:val="0"/>
+                <w:color w:val="000000"/>
+                <w:sz w:val="20"/>
+              </w:rPr>
+              <w:t>7</w:t>
+            </w:r>
+          </w:p>
+        </w:tc>
+        <w:tc>
+          <w:tcPr>
+            <w:tcW w:type="dxa" w:w="3216"/>
+            <w:shd w:val="clear" w:fill="EEF3F8"/>
+          </w:tcPr>
+          <w:p>
+            <w:r>
+              <w:rPr>
+                <w:rFonts w:ascii="Calibri" w:hAnsi="Calibri"/>
+                <w:color w:val="000000"/>
+                <w:sz w:val="20"/>
+              </w:rPr>
+              <w:t>group 7</w:t>
+            </w:r>
+          </w:p>
+        </w:tc>
+        <w:tc>
+          <w:tcPr>
+            <w:tcW w:type="dxa" w:w="3216"/>
+            <w:shd w:val="clear" w:fill="EEF3F8"/>
+          </w:tcPr>
+          <w:p>
+            <w:r>
+              <w:rPr>
+                <w:rFonts w:ascii="Calibri" w:hAnsi="Calibri" w:eastAsia="Calibri"/>
+                <w:b w:val="0"/>
+                <w:color w:val="000000"/>
+                <w:sz w:val="20"/>
+              </w:rPr>
+              <w:t>BTN36Setup .. BTN40Setup</w:t>
+            </w:r>
+          </w:p>
+        </w:tc>
+      </w:tr>
+      <w:tr>
+        <w:tc>
+          <w:tcPr>
+            <w:tcW w:type="dxa" w:w="3216"/>
+          </w:tcPr>
+          <w:p>
+            <w:pPr>
+              <w:jc w:val="right"/>
+            </w:pPr>
+            <w:r>
+              <w:rPr>
+                <w:rFonts w:ascii="Calibri" w:hAnsi="Calibri" w:eastAsia="Calibri"/>
+                <w:b w:val="0"/>
+                <w:color w:val="000000"/>
+                <w:sz w:val="20"/>
+              </w:rPr>
+              <w:t>8</w:t>
+            </w:r>
+          </w:p>
+        </w:tc>
+        <w:tc>
+          <w:tcPr>
+            <w:tcW w:type="dxa" w:w="3216"/>
+          </w:tcPr>
+          <w:p>
+            <w:r>
+              <w:rPr>
+                <w:rFonts w:ascii="Calibri" w:hAnsi="Calibri"/>
+                <w:color w:val="000000"/>
+                <w:sz w:val="20"/>
+              </w:rPr>
+              <w:t>group 8</w:t>
+            </w:r>
+          </w:p>
+        </w:tc>
+        <w:tc>
+          <w:tcPr>
+            <w:tcW w:type="dxa" w:w="3216"/>
+          </w:tcPr>
+          <w:p>
+            <w:r>
+              <w:rPr>
+                <w:rFonts w:ascii="Calibri" w:hAnsi="Calibri" w:eastAsia="Calibri"/>
+                <w:b w:val="0"/>
+                <w:color w:val="000000"/>
+                <w:sz w:val="20"/>
+              </w:rPr>
+              <w:t>BTN41Setup .. BTN45Setup</w:t>
+            </w:r>
+          </w:p>
+        </w:tc>
+      </w:tr>
+      <w:tr>
+        <w:tc>
+          <w:tcPr>
+            <w:tcW w:type="dxa" w:w="3216"/>
+            <w:shd w:val="clear" w:fill="EEF3F8"/>
+          </w:tcPr>
+          <w:p>
+            <w:pPr>
+              <w:jc w:val="right"/>
+            </w:pPr>
+            <w:r>
+              <w:rPr>
+                <w:rFonts w:ascii="Calibri" w:hAnsi="Calibri" w:eastAsia="Calibri"/>
+                <w:b w:val="0"/>
+                <w:color w:val="000000"/>
+                <w:sz w:val="20"/>
+              </w:rPr>
+              <w:t>9</w:t>
+            </w:r>
+          </w:p>
+        </w:tc>
+        <w:tc>
+          <w:tcPr>
+            <w:tcW w:type="dxa" w:w="3216"/>
+            <w:shd w:val="clear" w:fill="EEF3F8"/>
+          </w:tcPr>
+          <w:p>
+            <w:r>
+              <w:rPr>
+                <w:rFonts w:ascii="Calibri" w:hAnsi="Calibri"/>
+                <w:color w:val="000000"/>
+                <w:sz w:val="20"/>
+              </w:rPr>
+              <w:t>group 9</w:t>
+            </w:r>
+          </w:p>
+        </w:tc>
+        <w:tc>
+          <w:tcPr>
+            <w:tcW w:type="dxa" w:w="3216"/>
+            <w:shd w:val="clear" w:fill="EEF3F8"/>
+          </w:tcPr>
+          <w:p>
+            <w:r>
+              <w:rPr>
+                <w:rFonts w:ascii="Calibri" w:hAnsi="Calibri" w:eastAsia="Calibri"/>
+                <w:b w:val="0"/>
+                <w:color w:val="000000"/>
+                <w:sz w:val="20"/>
+              </w:rPr>
+              <w:t>BTN46Setup .. BTN50Setup</w:t>
+            </w:r>
+          </w:p>
+        </w:tc>
+      </w:tr>
+      <w:tr>
+        <w:tc>
+          <w:tcPr>
+            <w:tcW w:type="dxa" w:w="3216"/>
+          </w:tcPr>
+          <w:p>
+            <w:pPr>
+              <w:jc w:val="right"/>
+            </w:pPr>
+            <w:r>
+              <w:rPr>
+                <w:rFonts w:ascii="Calibri" w:hAnsi="Calibri" w:eastAsia="Calibri"/>
+                <w:b w:val="0"/>
+                <w:color w:val="000000"/>
+                <w:sz w:val="20"/>
+              </w:rPr>
+              <w:t>10</w:t>
+            </w:r>
+          </w:p>
+        </w:tc>
+        <w:tc>
+          <w:tcPr>
+            <w:tcW w:type="dxa" w:w="3216"/>
+          </w:tcPr>
+          <w:p>
+            <w:r>
+              <w:rPr>
+                <w:rFonts w:ascii="Calibri" w:hAnsi="Calibri"/>
+                <w:color w:val="000000"/>
+                <w:sz w:val="20"/>
+              </w:rPr>
+              <w:t>group 10</w:t>
+            </w:r>
+          </w:p>
+        </w:tc>
+        <w:tc>
+          <w:tcPr>
+            <w:tcW w:type="dxa" w:w="3216"/>
+          </w:tcPr>
+          <w:p>
+            <w:r>
+              <w:rPr>
+                <w:rFonts w:ascii="Calibri" w:hAnsi="Calibri" w:eastAsia="Calibri"/>
+                <w:b w:val="0"/>
+                <w:color w:val="000000"/>
+                <w:sz w:val="20"/>
+              </w:rPr>
+              <w:t>BTN51Setup .. BTN55Setup</w:t>
+            </w:r>
+          </w:p>
+        </w:tc>
+      </w:tr>
+      <w:tr>
+        <w:tc>
+          <w:tcPr>
+            <w:tcW w:type="dxa" w:w="3216"/>
+            <w:shd w:val="clear" w:fill="EEF3F8"/>
+          </w:tcPr>
+          <w:p>
+            <w:pPr>
+              <w:jc w:val="right"/>
+            </w:pPr>
+            <w:r>
+              <w:rPr>
+                <w:rFonts w:ascii="Calibri" w:hAnsi="Calibri" w:eastAsia="Calibri"/>
+                <w:b w:val="0"/>
+                <w:color w:val="000000"/>
+                <w:sz w:val="20"/>
+              </w:rPr>
+              <w:t>11</w:t>
+            </w:r>
+          </w:p>
+        </w:tc>
+        <w:tc>
+          <w:tcPr>
+            <w:tcW w:type="dxa" w:w="3216"/>
+            <w:shd w:val="clear" w:fill="EEF3F8"/>
+          </w:tcPr>
+          <w:p>
+            <w:r>
+              <w:rPr>
+                <w:rFonts w:ascii="Calibri" w:hAnsi="Calibri"/>
+                <w:color w:val="000000"/>
+                <w:sz w:val="20"/>
+              </w:rPr>
+              <w:t>group 11</w:t>
+            </w:r>
+          </w:p>
+        </w:tc>
+        <w:tc>
+          <w:tcPr>
+            <w:tcW w:type="dxa" w:w="3216"/>
+            <w:shd w:val="clear" w:fill="EEF3F8"/>
+          </w:tcPr>
+          <w:p>
+            <w:r>
+              <w:rPr>
+                <w:rFonts w:ascii="Calibri" w:hAnsi="Calibri" w:eastAsia="Calibri"/>
+                <w:b w:val="0"/>
+                <w:color w:val="000000"/>
+                <w:sz w:val="20"/>
+              </w:rPr>
+              <w:t>BTN56Setup .. BTN60Setup</w:t>
+            </w:r>
+          </w:p>
+        </w:tc>
+      </w:tr>
+      <w:tr>
+        <w:tc>
+          <w:tcPr>
+            <w:tcW w:type="dxa" w:w="3216"/>
+          </w:tcPr>
+          <w:p>
+            <w:pPr>
+              <w:jc w:val="right"/>
+            </w:pPr>
+            <w:r>
+              <w:rPr>
+                <w:rFonts w:ascii="Calibri" w:hAnsi="Calibri" w:eastAsia="Calibri"/>
+                <w:b w:val="0"/>
+                <w:color w:val="000000"/>
+                <w:sz w:val="20"/>
+              </w:rPr>
+              <w:t>12</w:t>
+            </w:r>
+          </w:p>
+        </w:tc>
+        <w:tc>
+          <w:tcPr>
+            <w:tcW w:type="dxa" w:w="3216"/>
+          </w:tcPr>
+          <w:p>
+            <w:r>
+              <w:rPr>
+                <w:rFonts w:ascii="Calibri" w:hAnsi="Calibri"/>
+                <w:color w:val="000000"/>
+                <w:sz w:val="20"/>
+              </w:rPr>
+              <w:t>group 12</w:t>
+            </w:r>
+          </w:p>
+        </w:tc>
+        <w:tc>
+          <w:tcPr>
+            <w:tcW w:type="dxa" w:w="3216"/>
+          </w:tcPr>
+          <w:p>
+            <w:r>
+              <w:rPr>
+                <w:rFonts w:ascii="Calibri" w:hAnsi="Calibri" w:eastAsia="Calibri"/>
+                <w:b w:val="0"/>
+                <w:color w:val="000000"/>
+                <w:sz w:val="20"/>
+              </w:rPr>
+              <w:t>BTN61Setup .. BTN65Setup</w:t>
+            </w:r>
+          </w:p>
+        </w:tc>
+      </w:tr>
+      <w:tr>
+        <w:tc>
+          <w:tcPr>
+            <w:tcW w:type="dxa" w:w="3216"/>
+            <w:shd w:val="clear" w:fill="EEF3F8"/>
+          </w:tcPr>
+          <w:p>
+            <w:pPr>
+              <w:jc w:val="right"/>
+            </w:pPr>
+            <w:r>
+              <w:rPr>
+                <w:rFonts w:ascii="Calibri" w:hAnsi="Calibri" w:eastAsia="Calibri"/>
+                <w:b w:val="0"/>
+                <w:color w:val="000000"/>
+                <w:sz w:val="20"/>
+              </w:rPr>
+              <w:t>13</w:t>
+            </w:r>
+          </w:p>
+        </w:tc>
+        <w:tc>
+          <w:tcPr>
+            <w:tcW w:type="dxa" w:w="3216"/>
+            <w:shd w:val="clear" w:fill="EEF3F8"/>
+          </w:tcPr>
+          <w:p>
+            <w:r>
+              <w:rPr>
+                <w:rFonts w:ascii="Calibri" w:hAnsi="Calibri"/>
+                <w:color w:val="000000"/>
+                <w:sz w:val="20"/>
+              </w:rPr>
+              <w:t>group 13</w:t>
+            </w:r>
+          </w:p>
+        </w:tc>
+        <w:tc>
+          <w:tcPr>
+            <w:tcW w:type="dxa" w:w="3216"/>
+            <w:shd w:val="clear" w:fill="EEF3F8"/>
+          </w:tcPr>
+          <w:p>
+            <w:r>
+              <w:rPr>
+                <w:rFonts w:ascii="Calibri" w:hAnsi="Calibri" w:eastAsia="Calibri"/>
+                <w:b w:val="0"/>
+                <w:color w:val="000000"/>
+                <w:sz w:val="20"/>
+              </w:rPr>
+              <w:t>BTN66Setup .. BTN70Setup</w:t>
+            </w:r>
+          </w:p>
+        </w:tc>
+      </w:tr>
+      <w:tr>
+        <w:tc>
+          <w:tcPr>
+            <w:tcW w:type="dxa" w:w="3216"/>
+          </w:tcPr>
+          <w:p>
+            <w:pPr>
+              <w:jc w:val="right"/>
+            </w:pPr>
+            <w:r>
+              <w:rPr>
+                <w:rFonts w:ascii="Calibri" w:hAnsi="Calibri" w:eastAsia="Calibri"/>
+                <w:b w:val="0"/>
+                <w:color w:val="000000"/>
+                <w:sz w:val="20"/>
+              </w:rPr>
+              <w:t>14</w:t>
+            </w:r>
+          </w:p>
+        </w:tc>
+        <w:tc>
+          <w:tcPr>
+            <w:tcW w:type="dxa" w:w="3216"/>
+          </w:tcPr>
+          <w:p>
+            <w:r>
+              <w:rPr>
+                <w:rFonts w:ascii="Calibri" w:hAnsi="Calibri"/>
+                <w:color w:val="000000"/>
+                <w:sz w:val="20"/>
+              </w:rPr>
+              <w:t>group 14</w:t>
+            </w:r>
+          </w:p>
+        </w:tc>
+        <w:tc>
+          <w:tcPr>
+            <w:tcW w:type="dxa" w:w="3216"/>
+          </w:tcPr>
+          <w:p>
+            <w:r>
+              <w:rPr>
+                <w:rFonts w:ascii="Calibri" w:hAnsi="Calibri" w:eastAsia="Calibri"/>
+                <w:b w:val="0"/>
+                <w:color w:val="000000"/>
+                <w:sz w:val="20"/>
+              </w:rPr>
+              <w:t>BTN71Setup .. BTN75Setup</w:t>
+            </w:r>
+          </w:p>
+        </w:tc>
+      </w:tr>
+      <w:tr>
+        <w:tc>
+          <w:tcPr>
+            <w:tcW w:type="dxa" w:w="3216"/>
+            <w:shd w:val="clear" w:fill="EEF3F8"/>
+          </w:tcPr>
+          <w:p>
+            <w:pPr>
+              <w:jc w:val="right"/>
+            </w:pPr>
+            <w:r>
+              <w:rPr>
+                <w:rFonts w:ascii="Calibri" w:hAnsi="Calibri" w:eastAsia="Calibri"/>
+                <w:b w:val="0"/>
+                <w:color w:val="000000"/>
+                <w:sz w:val="20"/>
+              </w:rPr>
+              <w:t>15</w:t>
+            </w:r>
+          </w:p>
+        </w:tc>
+        <w:tc>
+          <w:tcPr>
+            <w:tcW w:type="dxa" w:w="3216"/>
+            <w:shd w:val="clear" w:fill="EEF3F8"/>
+          </w:tcPr>
+          <w:p>
+            <w:r>
+              <w:rPr>
+                <w:rFonts w:ascii="Calibri" w:hAnsi="Calibri"/>
+                <w:color w:val="000000"/>
+                <w:sz w:val="20"/>
+              </w:rPr>
+              <w:t>group 15</w:t>
+            </w:r>
+          </w:p>
+        </w:tc>
+        <w:tc>
+          <w:tcPr>
+            <w:tcW w:type="dxa" w:w="3216"/>
+            <w:shd w:val="clear" w:fill="EEF3F8"/>
+          </w:tcPr>
+          <w:p>
+            <w:r>
+              <w:rPr>
+                <w:rFonts w:ascii="Calibri" w:hAnsi="Calibri" w:eastAsia="Calibri"/>
+                <w:b w:val="0"/>
+                <w:color w:val="000000"/>
+                <w:sz w:val="20"/>
+              </w:rPr>
+              <w:t>BTN76Setup .. BTN80Setup</w:t>
+            </w:r>
+          </w:p>
+        </w:tc>
+      </w:tr>
+      <w:tr>
+        <w:tc>
+          <w:tcPr>
+            <w:tcW w:type="dxa" w:w="3216"/>
+          </w:tcPr>
+          <w:p>
+            <w:pPr>
+              <w:jc w:val="right"/>
+            </w:pPr>
+            <w:r>
+              <w:rPr>
+                <w:rFonts w:ascii="Calibri" w:hAnsi="Calibri" w:eastAsia="Calibri"/>
+                <w:b w:val="0"/>
+                <w:color w:val="000000"/>
+                <w:sz w:val="20"/>
+              </w:rPr>
+              <w:t>16</w:t>
+            </w:r>
+          </w:p>
+        </w:tc>
+        <w:tc>
+          <w:tcPr>
+            <w:tcW w:type="dxa" w:w="3216"/>
+          </w:tcPr>
+          <w:p>
+            <w:r>
+              <w:rPr>
+                <w:rFonts w:ascii="Calibri" w:hAnsi="Calibri"/>
+                <w:color w:val="000000"/>
+                <w:sz w:val="20"/>
+              </w:rPr>
+              <w:t>group 16</w:t>
+            </w:r>
+          </w:p>
+        </w:tc>
+        <w:tc>
+          <w:tcPr>
+            <w:tcW w:type="dxa" w:w="3216"/>
+          </w:tcPr>
+          <w:p>
+            <w:r>
+              <w:rPr>
+                <w:rFonts w:ascii="Calibri" w:hAnsi="Calibri" w:eastAsia="Calibri"/>
+                <w:b w:val="0"/>
+                <w:color w:val="000000"/>
+                <w:sz w:val="20"/>
+              </w:rPr>
+              <w:t>BTN81Setup .. BTN85Setup</w:t>
+            </w:r>
+          </w:p>
+        </w:tc>
+      </w:tr>
+      <w:tr>
+        <w:tc>
+          <w:tcPr>
+            <w:tcW w:type="dxa" w:w="3216"/>
+            <w:shd w:val="clear" w:fill="EEF3F8"/>
+          </w:tcPr>
+          <w:p>
+            <w:pPr>
+              <w:jc w:val="right"/>
+            </w:pPr>
+            <w:r>
+              <w:rPr>
+                <w:rFonts w:ascii="Calibri" w:hAnsi="Calibri" w:eastAsia="Calibri"/>
+                <w:b w:val="0"/>
+                <w:color w:val="000000"/>
+                <w:sz w:val="20"/>
+              </w:rPr>
+              <w:t>17</w:t>
+            </w:r>
+          </w:p>
+        </w:tc>
+        <w:tc>
+          <w:tcPr>
+            <w:tcW w:type="dxa" w:w="3216"/>
+            <w:shd w:val="clear" w:fill="EEF3F8"/>
+          </w:tcPr>
+          <w:p>
+            <w:r>
+              <w:rPr>
+                <w:rFonts w:ascii="Calibri" w:hAnsi="Calibri"/>
+                <w:color w:val="000000"/>
+                <w:sz w:val="20"/>
+              </w:rPr>
+              <w:t>group 17</w:t>
+            </w:r>
+          </w:p>
+        </w:tc>
+        <w:tc>
+          <w:tcPr>
+            <w:tcW w:type="dxa" w:w="3216"/>
+            <w:shd w:val="clear" w:fill="EEF3F8"/>
+          </w:tcPr>
+          <w:p>
+            <w:r>
+              <w:rPr>
+                <w:rFonts w:ascii="Calibri" w:hAnsi="Calibri" w:eastAsia="Calibri"/>
+                <w:b w:val="0"/>
+                <w:color w:val="000000"/>
+                <w:sz w:val="20"/>
+              </w:rPr>
+              <w:t>BTN86Setup .. BTN90Setup</w:t>
+            </w:r>
+          </w:p>
+        </w:tc>
+      </w:tr>
+      <w:tr>
+        <w:tc>
+          <w:tcPr>
+            <w:tcW w:type="dxa" w:w="3216"/>
+          </w:tcPr>
+          <w:p>
+            <w:pPr>
+              <w:jc w:val="right"/>
+            </w:pPr>
+            <w:r>
+              <w:rPr>
+                <w:rFonts w:ascii="Calibri" w:hAnsi="Calibri" w:eastAsia="Calibri"/>
+                <w:b w:val="0"/>
+                <w:color w:val="000000"/>
+                <w:sz w:val="20"/>
+              </w:rPr>
+              <w:t>18</w:t>
+            </w:r>
+          </w:p>
+        </w:tc>
+        <w:tc>
+          <w:tcPr>
+            <w:tcW w:type="dxa" w:w="3216"/>
+          </w:tcPr>
+          <w:p>
+            <w:r>
+              <w:rPr>
+                <w:rFonts w:ascii="Calibri" w:hAnsi="Calibri"/>
+                <w:color w:val="000000"/>
+                <w:sz w:val="20"/>
+              </w:rPr>
+              <w:t>group 18</w:t>
+            </w:r>
+          </w:p>
+        </w:tc>
+        <w:tc>
+          <w:tcPr>
+            <w:tcW w:type="dxa" w:w="3216"/>
+          </w:tcPr>
+          <w:p>
+            <w:r>
+              <w:rPr>
+                <w:rFonts w:ascii="Calibri" w:hAnsi="Calibri" w:eastAsia="Calibri"/>
+                <w:b w:val="0"/>
+                <w:color w:val="000000"/>
+                <w:sz w:val="20"/>
+              </w:rPr>
+              <w:t>BTN91Setup .. BTN95Setup</w:t>
+            </w:r>
+          </w:p>
+        </w:tc>
+      </w:tr>
+      <w:tr>
+        <w:tc>
+          <w:tcPr>
+            <w:tcW w:type="dxa" w:w="3216"/>
+            <w:shd w:val="clear" w:fill="EEF3F8"/>
+          </w:tcPr>
+          <w:p>
+            <w:pPr>
+              <w:jc w:val="right"/>
+            </w:pPr>
+            <w:r>
+              <w:rPr>
+                <w:rFonts w:ascii="Calibri" w:hAnsi="Calibri" w:eastAsia="Calibri"/>
+                <w:b w:val="0"/>
+                <w:color w:val="000000"/>
+                <w:sz w:val="20"/>
+              </w:rPr>
+              <w:t>19</w:t>
+            </w:r>
+          </w:p>
+        </w:tc>
+        <w:tc>
+          <w:tcPr>
+            <w:tcW w:type="dxa" w:w="3216"/>
+            <w:shd w:val="clear" w:fill="EEF3F8"/>
+          </w:tcPr>
+          <w:p>
+            <w:r>
+              <w:rPr>
+                <w:rFonts w:ascii="Calibri" w:hAnsi="Calibri"/>
+                <w:color w:val="000000"/>
+                <w:sz w:val="20"/>
+              </w:rPr>
+              <w:t>group 19</w:t>
+            </w:r>
+          </w:p>
+        </w:tc>
+        <w:tc>
+          <w:tcPr>
+            <w:tcW w:type="dxa" w:w="3216"/>
+            <w:shd w:val="clear" w:fill="EEF3F8"/>
+          </w:tcPr>
+          <w:p>
+            <w:r>
+              <w:rPr>
+                <w:rFonts w:ascii="Calibri" w:hAnsi="Calibri" w:eastAsia="Calibri"/>
+                <w:b w:val="0"/>
+                <w:color w:val="000000"/>
+                <w:sz w:val="20"/>
+              </w:rPr>
+              <w:t>BTN96Setup .. BTN100Setup</w:t>
+            </w:r>
+          </w:p>
+        </w:tc>
+      </w:tr>
+      <w:tr>
+        <w:tc>
+          <w:tcPr>
+            <w:tcW w:type="dxa" w:w="3216"/>
+          </w:tcPr>
+          <w:p>
+            <w:pPr>
+              <w:jc w:val="right"/>
+            </w:pPr>
+            <w:r>
+              <w:rPr>
+                <w:rFonts w:ascii="Calibri" w:hAnsi="Calibri" w:eastAsia="Calibri"/>
+                <w:b w:val="0"/>
+                <w:color w:val="000000"/>
+                <w:sz w:val="20"/>
+              </w:rPr>
+              <w:t>20</w:t>
+            </w:r>
+          </w:p>
+        </w:tc>
+        <w:tc>
+          <w:tcPr>
+            <w:tcW w:type="dxa" w:w="3216"/>
+          </w:tcPr>
+          <w:p>
+            <w:r>
+              <w:rPr>
+                <w:rFonts w:ascii="Calibri" w:hAnsi="Calibri"/>
+                <w:color w:val="000000"/>
+                <w:sz w:val="20"/>
+              </w:rPr>
+              <w:t>group 20</w:t>
+            </w:r>
+          </w:p>
+        </w:tc>
+        <w:tc>
+          <w:tcPr>
+            <w:tcW w:type="dxa" w:w="3216"/>
+          </w:tcPr>
+          <w:p>
+            <w:r>
+              <w:rPr>
+                <w:rFonts w:ascii="Calibri" w:hAnsi="Calibri" w:eastAsia="Calibri"/>
+                <w:b w:val="0"/>
+                <w:color w:val="000000"/>
+                <w:sz w:val="20"/>
+              </w:rPr>
+              <w:t>BTN101Setup .. BTN105Setup</w:t>
+            </w:r>
+          </w:p>
+        </w:tc>
+      </w:tr>
+      <w:tr>
+        <w:tc>
+          <w:tcPr>
+            <w:tcW w:type="dxa" w:w="3216"/>
+            <w:shd w:val="clear" w:fill="EEF3F8"/>
+          </w:tcPr>
+          <w:p>
+            <w:pPr>
+              <w:jc w:val="right"/>
+            </w:pPr>
+            <w:r>
+              <w:rPr>
+                <w:rFonts w:ascii="Calibri" w:hAnsi="Calibri" w:eastAsia="Calibri"/>
+                <w:b w:val="0"/>
+                <w:color w:val="000000"/>
+                <w:sz w:val="20"/>
+              </w:rPr>
+              <w:t>21</w:t>
+            </w:r>
+          </w:p>
+        </w:tc>
+        <w:tc>
+          <w:tcPr>
+            <w:tcW w:type="dxa" w:w="3216"/>
+            <w:shd w:val="clear" w:fill="EEF3F8"/>
+          </w:tcPr>
+          <w:p>
+            <w:r>
+              <w:rPr>
+                <w:rFonts w:ascii="Calibri" w:hAnsi="Calibri"/>
+                <w:color w:val="000000"/>
+                <w:sz w:val="20"/>
+              </w:rPr>
+              <w:t>group 21</w:t>
+            </w:r>
+          </w:p>
+        </w:tc>
+        <w:tc>
+          <w:tcPr>
+            <w:tcW w:type="dxa" w:w="3216"/>
+            <w:shd w:val="clear" w:fill="EEF3F8"/>
+          </w:tcPr>
+          <w:p>
+            <w:r>
+              <w:rPr>
+                <w:rFonts w:ascii="Calibri" w:hAnsi="Calibri" w:eastAsia="Calibri"/>
+                <w:b w:val="0"/>
+                <w:color w:val="000000"/>
+                <w:sz w:val="20"/>
+              </w:rPr>
+              <w:t>BTN106Setup .. BTN110Setup</w:t>
+            </w:r>
+          </w:p>
+        </w:tc>
+      </w:tr>
+      <w:tr>
+        <w:tc>
+          <w:tcPr>
+            <w:tcW w:type="dxa" w:w="3216"/>
+          </w:tcPr>
+          <w:p>
+            <w:pPr>
+              <w:jc w:val="right"/>
+            </w:pPr>
+            <w:r>
+              <w:rPr>
+                <w:rFonts w:ascii="Calibri" w:hAnsi="Calibri" w:eastAsia="Calibri"/>
+                <w:b w:val="0"/>
+                <w:color w:val="000000"/>
+                <w:sz w:val="20"/>
+              </w:rPr>
+              <w:t>22</w:t>
+            </w:r>
+          </w:p>
+        </w:tc>
+        <w:tc>
+          <w:tcPr>
+            <w:tcW w:type="dxa" w:w="3216"/>
+          </w:tcPr>
+          <w:p>
+            <w:r>
+              <w:rPr>
+                <w:rFonts w:ascii="Calibri" w:hAnsi="Calibri"/>
+                <w:color w:val="000000"/>
+                <w:sz w:val="20"/>
+              </w:rPr>
+              <w:t>group 22</w:t>
+            </w:r>
+          </w:p>
+        </w:tc>
+        <w:tc>
+          <w:tcPr>
+            <w:tcW w:type="dxa" w:w="3216"/>
+          </w:tcPr>
+          <w:p>
+            <w:r>
+              <w:rPr>
+                <w:rFonts w:ascii="Calibri" w:hAnsi="Calibri" w:eastAsia="Calibri"/>
+                <w:b w:val="0"/>
+                <w:color w:val="000000"/>
+                <w:sz w:val="20"/>
+              </w:rPr>
+              <w:t>BTN111Setup .. BTN115Setup</w:t>
+            </w:r>
+          </w:p>
+        </w:tc>
+      </w:tr>
+      <w:tr>
+        <w:tc>
+          <w:tcPr>
+            <w:tcW w:type="dxa" w:w="3216"/>
+            <w:shd w:val="clear" w:fill="EEF3F8"/>
+          </w:tcPr>
+          <w:p>
+            <w:pPr>
+              <w:jc w:val="right"/>
+            </w:pPr>
+            <w:r>
+              <w:rPr>
+                <w:rFonts w:ascii="Calibri" w:hAnsi="Calibri" w:eastAsia="Calibri"/>
+                <w:b w:val="0"/>
+                <w:color w:val="000000"/>
+                <w:sz w:val="20"/>
+              </w:rPr>
+              <w:t>23</w:t>
+            </w:r>
+          </w:p>
+        </w:tc>
+        <w:tc>
+          <w:tcPr>
+            <w:tcW w:type="dxa" w:w="3216"/>
+            <w:shd w:val="clear" w:fill="EEF3F8"/>
+          </w:tcPr>
+          <w:p>
+            <w:r>
+              <w:rPr>
+                <w:rFonts w:ascii="Calibri" w:hAnsi="Calibri"/>
+                <w:color w:val="000000"/>
+                <w:sz w:val="20"/>
+              </w:rPr>
+              <w:t>group 23</w:t>
+            </w:r>
+          </w:p>
+        </w:tc>
+        <w:tc>
+          <w:tcPr>
+            <w:tcW w:type="dxa" w:w="3216"/>
+            <w:shd w:val="clear" w:fill="EEF3F8"/>
+          </w:tcPr>
+          <w:p>
+            <w:r>
+              <w:rPr>
+                <w:rFonts w:ascii="Calibri" w:hAnsi="Calibri" w:eastAsia="Calibri"/>
+                <w:b w:val="0"/>
+                <w:color w:val="000000"/>
+                <w:sz w:val="20"/>
+              </w:rPr>
+              <w:t>BTN116Setup .. BTN120Setup</w:t>
+            </w:r>
+          </w:p>
+        </w:tc>
+      </w:tr>
+    </w:tbl>
+    <w:p>
+      <w:pPr>
+        <w:pStyle w:val="Normal"/>
+      </w:pPr>
+      <w:r>
+        <w:rPr>
+          <w:rFonts w:ascii="Consolas" w:hAnsi="Consolas" w:eastAsia="Consolas"/>
+          <w:b w:val="0"/>
+          <w:sz w:val="20"/>
+        </w:rPr>
+        <w:t>sButtonDisable[i][g]</w:t>
+      </w:r>
+      <w:r>
+        <w:rPr>
+          <w:rFonts w:ascii="Calibri" w:hAnsi="Calibri" w:eastAsia="Calibri"/>
+          <w:b w:val="0"/>
+          <w:sz w:val="22"/>
+        </w:rPr>
+        <w:t xml:space="preserve"> uses this same table. A set bit means that </w:t>
+      </w:r>
+      <w:r>
+        <w:rPr>
+          <w:rFonts w:ascii="Consolas" w:hAnsi="Consolas" w:eastAsia="Consolas"/>
+          <w:b w:val="0"/>
+          <w:sz w:val="20"/>
+        </w:rPr>
+        <w:t>BTN#Setup</w:t>
+      </w:r>
+      <w:r>
+        <w:rPr>
+          <w:rFonts w:ascii="Calibri" w:hAnsi="Calibri" w:eastAsia="Calibri"/>
+          <w:b w:val="0"/>
+          <w:sz w:val="22"/>
+        </w:rPr>
+        <w:t xml:space="preserve"> button is disabled / not available, even if </w:t>
+      </w:r>
+      <w:r>
+        <w:rPr>
+          <w:rFonts w:ascii="Consolas" w:hAnsi="Consolas" w:eastAsia="Consolas"/>
+          <w:b w:val="0"/>
+          <w:sz w:val="20"/>
+        </w:rPr>
+        <w:t>sButtonInd</w:t>
+      </w:r>
+      <w:r>
+        <w:rPr>
+          <w:rFonts w:ascii="Calibri" w:hAnsi="Calibri" w:eastAsia="Calibri"/>
+          <w:b w:val="0"/>
+          <w:sz w:val="22"/>
+        </w:rPr>
+        <w:t xml:space="preserve"> is also set.</w:t>
+      </w:r>
+    </w:p>
+    <w:p>
+      <w:pPr>
+        <w:pStyle w:val="Normal"/>
+      </w:pPr>
+      <w:r>
+        <w:rPr>
+          <w:rFonts w:ascii="Calibri" w:hAnsi="Calibri" w:eastAsia="Calibri"/>
+          <w:b w:val="0"/>
+          <w:sz w:val="22"/>
+        </w:rPr>
+        <w:t>Examples:</w:t>
+      </w:r>
+    </w:p>
+    <w:p>
+      <w:pPr>
+        <w:pStyle w:val="ListBullet"/>
+      </w:pPr>
+      <w:r>
+        <w:rPr>
+          <w:rFonts w:ascii="Calibri" w:hAnsi="Calibri" w:eastAsia="Calibri"/>
+          <w:b w:val="0"/>
+          <w:sz w:val="22"/>
+        </w:rPr>
+        <w:t xml:space="preserve">No button LEDs on in group </w:t>
+      </w:r>
+      <w:r>
+        <w:rPr>
+          <w:rFonts w:ascii="Consolas" w:hAnsi="Consolas" w:eastAsia="Consolas"/>
+          <w:b w:val="0"/>
+          <w:sz w:val="20"/>
+        </w:rPr>
+        <w:t>g</w:t>
+      </w:r>
+      <w:r>
+        <w:rPr>
+          <w:rFonts w:ascii="Calibri" w:hAnsi="Calibri" w:eastAsia="Calibri"/>
+          <w:b w:val="0"/>
+          <w:sz w:val="22"/>
+        </w:rPr>
+        <w:t xml:space="preserve"> -&gt; </w:t>
+      </w:r>
+      <w:r>
+        <w:rPr>
+          <w:rFonts w:ascii="Consolas" w:hAnsi="Consolas" w:eastAsia="Consolas"/>
+          <w:b w:val="0"/>
+          <w:sz w:val="20"/>
+        </w:rPr>
+        <w:t>sButtonInd[i][g] = 0</w:t>
+      </w:r>
+    </w:p>
+    <w:p>
+      <w:pPr>
+        <w:pStyle w:val="ListBullet"/>
+      </w:pPr>
+      <w:r>
+        <w:rPr>
+          <w:rFonts w:ascii="Calibri" w:hAnsi="Calibri" w:eastAsia="Calibri"/>
+          <w:b w:val="0"/>
+          <w:sz w:val="22"/>
+        </w:rPr>
+        <w:t xml:space="preserve">Only the first button LED on -&gt; </w:t>
+      </w:r>
+      <w:r>
+        <w:rPr>
+          <w:rFonts w:ascii="Consolas" w:hAnsi="Consolas" w:eastAsia="Consolas"/>
+          <w:b w:val="0"/>
+          <w:sz w:val="20"/>
+        </w:rPr>
+        <w:t>1</w:t>
+      </w:r>
+    </w:p>
+    <w:p>
+      <w:pPr>
+        <w:pStyle w:val="ListBullet"/>
+      </w:pPr>
+      <w:r>
+        <w:rPr>
+          <w:rFonts w:ascii="Calibri" w:hAnsi="Calibri" w:eastAsia="Calibri"/>
+          <w:b w:val="0"/>
+          <w:sz w:val="22"/>
+        </w:rPr>
+        <w:t xml:space="preserve">First and second on -&gt; </w:t>
+      </w:r>
+      <w:r>
+        <w:rPr>
+          <w:rFonts w:ascii="Consolas" w:hAnsi="Consolas" w:eastAsia="Consolas"/>
+          <w:b w:val="0"/>
+          <w:sz w:val="20"/>
+        </w:rPr>
+        <w:t>1 + 2 = 3</w:t>
+      </w:r>
+    </w:p>
+    <w:p>
+      <w:pPr>
+        <w:pStyle w:val="ListBullet"/>
+      </w:pPr>
+      <w:r>
+        <w:rPr>
+          <w:rFonts w:ascii="Calibri" w:hAnsi="Calibri" w:eastAsia="Calibri"/>
+          <w:b w:val="0"/>
+          <w:sz w:val="22"/>
+        </w:rPr>
+        <w:t xml:space="preserve">First and third on -&gt; </w:t>
+      </w:r>
+      <w:r>
+        <w:rPr>
+          <w:rFonts w:ascii="Consolas" w:hAnsi="Consolas" w:eastAsia="Consolas"/>
+          <w:b w:val="0"/>
+          <w:sz w:val="20"/>
+        </w:rPr>
+        <w:t>1 + 4 = 5</w:t>
+      </w:r>
+    </w:p>
+    <w:p>
+      <w:pPr>
+        <w:pStyle w:val="ListBullet"/>
+      </w:pPr>
+      <w:r>
+        <w:rPr>
+          <w:rFonts w:ascii="Calibri" w:hAnsi="Calibri" w:eastAsia="Calibri"/>
+          <w:b w:val="0"/>
+          <w:sz w:val="22"/>
+        </w:rPr>
+        <w:t xml:space="preserve">All five on -&gt; </w:t>
+      </w:r>
+      <w:r>
+        <w:rPr>
+          <w:rFonts w:ascii="Consolas" w:hAnsi="Consolas" w:eastAsia="Consolas"/>
+          <w:b w:val="0"/>
+          <w:sz w:val="20"/>
+        </w:rPr>
+        <w:t>1 + 2 + 4 + 8 + 16 = 31</w:t>
+      </w:r>
+    </w:p>
+    <w:p>
+      <w:pPr>
+        <w:pStyle w:val="ListBullet"/>
+      </w:pPr>
+      <w:r>
+        <w:rPr>
+          <w:rFonts w:ascii="Calibri" w:hAnsi="Calibri" w:eastAsia="Calibri"/>
+          <w:b w:val="0"/>
+          <w:sz w:val="22"/>
+        </w:rPr>
+        <w:t xml:space="preserve">Example TCS page: RESET DRIVE is group </w:t>
+      </w:r>
+      <w:r>
+        <w:rPr>
+          <w:rFonts w:ascii="Consolas" w:hAnsi="Consolas" w:eastAsia="Consolas"/>
+          <w:b w:val="0"/>
+          <w:sz w:val="20"/>
+        </w:rPr>
+        <w:t>0</w:t>
+      </w:r>
+      <w:r>
+        <w:rPr>
+          <w:rFonts w:ascii="Calibri" w:hAnsi="Calibri" w:eastAsia="Calibri"/>
+          <w:b w:val="0"/>
+          <w:sz w:val="22"/>
+        </w:rPr>
+        <w:t xml:space="preserve"> with RESET as </w:t>
+      </w:r>
+      <w:r>
+        <w:rPr>
+          <w:rFonts w:ascii="Consolas" w:hAnsi="Consolas" w:eastAsia="Consolas"/>
+          <w:b w:val="0"/>
+          <w:sz w:val="20"/>
+        </w:rPr>
+        <w:t>BTN1Setup</w:t>
+      </w:r>
+      <w:r>
+        <w:rPr>
+          <w:rFonts w:ascii="Calibri" w:hAnsi="Calibri" w:eastAsia="Calibri"/>
+          <w:b w:val="0"/>
+          <w:sz w:val="22"/>
+        </w:rPr>
+        <w:t xml:space="preserve"> (off), THRUSTER is group </w:t>
+      </w:r>
+      <w:r>
+        <w:rPr>
+          <w:rFonts w:ascii="Consolas" w:hAnsi="Consolas" w:eastAsia="Consolas"/>
+          <w:b w:val="0"/>
+          <w:sz w:val="20"/>
+        </w:rPr>
+        <w:t>1</w:t>
+      </w:r>
+      <w:r>
+        <w:rPr>
+          <w:rFonts w:ascii="Calibri" w:hAnsi="Calibri" w:eastAsia="Calibri"/>
+          <w:b w:val="0"/>
+          <w:sz w:val="22"/>
+        </w:rPr>
+        <w:t xml:space="preserve"> with START as </w:t>
+      </w:r>
+      <w:r>
+        <w:rPr>
+          <w:rFonts w:ascii="Consolas" w:hAnsi="Consolas" w:eastAsia="Consolas"/>
+          <w:b w:val="0"/>
+          <w:sz w:val="20"/>
+        </w:rPr>
+        <w:t>BTN6Setup</w:t>
+      </w:r>
+      <w:r>
+        <w:rPr>
+          <w:rFonts w:ascii="Calibri" w:hAnsi="Calibri" w:eastAsia="Calibri"/>
+          <w:b w:val="0"/>
+          <w:sz w:val="22"/>
+        </w:rPr>
+        <w:t xml:space="preserve"> (on) and STOP as </w:t>
+      </w:r>
+      <w:r>
+        <w:rPr>
+          <w:rFonts w:ascii="Consolas" w:hAnsi="Consolas" w:eastAsia="Consolas"/>
+          <w:b w:val="0"/>
+          <w:sz w:val="20"/>
+        </w:rPr>
+        <w:t>BTN7Setup</w:t>
+      </w:r>
+      <w:r>
+        <w:rPr>
+          <w:rFonts w:ascii="Calibri" w:hAnsi="Calibri" w:eastAsia="Calibri"/>
+          <w:b w:val="0"/>
+          <w:sz w:val="22"/>
+        </w:rPr>
+        <w:t xml:space="preserve"> (off) -&gt; </w:t>
+      </w:r>
+      <w:r>
+        <w:rPr>
+          <w:rFonts w:ascii="Consolas" w:hAnsi="Consolas" w:eastAsia="Consolas"/>
+          <w:b w:val="0"/>
+          <w:sz w:val="20"/>
+        </w:rPr>
+        <w:t>sButtonInd[i][0] = 0</w:t>
+      </w:r>
+      <w:r>
+        <w:rPr>
+          <w:rFonts w:ascii="Calibri" w:hAnsi="Calibri" w:eastAsia="Calibri"/>
+          <w:b w:val="0"/>
+          <w:sz w:val="22"/>
+        </w:rPr>
+        <w:t xml:space="preserve">, </w:t>
+      </w:r>
+      <w:r>
+        <w:rPr>
+          <w:rFonts w:ascii="Consolas" w:hAnsi="Consolas" w:eastAsia="Consolas"/>
+          <w:b w:val="0"/>
+          <w:sz w:val="20"/>
+        </w:rPr>
+        <w:t>sButtonInd[i][1] = 1</w:t>
+      </w:r>
+    </w:p>
+    <w:p>
+      <w:pPr>
+        <w:pStyle w:val="Normal"/>
+      </w:pPr>
+      <w:r>
+        <w:rPr>
+          <w:rFonts w:ascii="Calibri" w:hAnsi="Calibri" w:eastAsia="Calibri"/>
+          <w:b w:val="0"/>
+          <w:sz w:val="22"/>
+        </w:rPr>
+      </w:r>
+    </w:p>
+    <w:p>
       <w:r>
         <w:rPr>
           <w:rFonts w:ascii="Calibri" w:hAnsi="Calibri" w:eastAsia="Calibri"/>
@@ -13424,6 +15927,408 @@
           <w:sz w:val="22"/>
         </w:rPr>
         <w:t xml:space="preserve"> come from vessel </w:t>
+      </w:r>
+      <w:r>
+        <w:rPr>
+          <w:rFonts w:ascii="Consolas" w:hAnsi="Consolas" w:eastAsia="Consolas"/>
+          <w:b w:val="0"/>
+          <w:sz w:val="20"/>
+        </w:rPr>
+        <w:t>TCSView.ini</w:t>
+      </w:r>
+      <w:r>
+        <w:rPr>
+          <w:rFonts w:ascii="Calibri" w:hAnsi="Calibri" w:eastAsia="Calibri"/>
+          <w:b w:val="0"/>
+          <w:sz w:val="22"/>
+        </w:rPr>
+        <w:t>.</w:t>
+      </w:r>
+    </w:p>
+    <w:p>
+      <w:pPr>
+        <w:pStyle w:val="Heading3"/>
+      </w:pPr>
+      <w:r>
+        <w:rPr>
+          <w:rFonts w:ascii="Calibri" w:hAnsi="Calibri" w:eastAsia="Calibri"/>
+          <w:b w:val="0"/>
+          <w:sz w:val="22"/>
+        </w:rPr>
+        <w:t>Button LED bits (`sButtonInd[i][g]`)</w:t>
+      </w:r>
+    </w:p>
+    <w:p>
+      <w:pPr>
+        <w:pStyle w:val="Normal"/>
+      </w:pPr>
+      <w:r>
+        <w:rPr>
+          <w:rFonts w:ascii="Calibri" w:hAnsi="Calibri" w:eastAsia="Calibri"/>
+          <w:b w:val="0"/>
+          <w:sz w:val="22"/>
+        </w:rPr>
+        <w:t xml:space="preserve">Custom TCS page button LEDs from </w:t>
+      </w:r>
+      <w:r>
+        <w:rPr>
+          <w:rFonts w:ascii="Consolas" w:hAnsi="Consolas" w:eastAsia="Consolas"/>
+          <w:b w:val="0"/>
+          <w:sz w:val="20"/>
+        </w:rPr>
+        <w:t>TCSView.ini</w:t>
+      </w:r>
+      <w:r>
+        <w:rPr>
+          <w:rFonts w:ascii="Calibri" w:hAnsi="Calibri" w:eastAsia="Calibri"/>
+          <w:b w:val="0"/>
+          <w:sz w:val="22"/>
+        </w:rPr>
+        <w:t xml:space="preserve"> </w:t>
+      </w:r>
+      <w:r>
+        <w:rPr>
+          <w:rFonts w:ascii="Consolas" w:hAnsi="Consolas" w:eastAsia="Consolas"/>
+          <w:b w:val="0"/>
+          <w:sz w:val="20"/>
+        </w:rPr>
+        <w:t>BTN#Setup</w:t>
+      </w:r>
+      <w:r>
+        <w:rPr>
+          <w:rFonts w:ascii="Calibri" w:hAnsi="Calibri" w:eastAsia="Calibri"/>
+          <w:b w:val="0"/>
+          <w:sz w:val="22"/>
+        </w:rPr>
+        <w:t xml:space="preserve">. One value per group </w:t>
+      </w:r>
+      <w:r>
+        <w:rPr>
+          <w:rFonts w:ascii="Consolas" w:hAnsi="Consolas" w:eastAsia="Consolas"/>
+          <w:b w:val="0"/>
+          <w:sz w:val="20"/>
+        </w:rPr>
+        <w:t>g</w:t>
+      </w:r>
+      <w:r>
+        <w:rPr>
+          <w:rFonts w:ascii="Calibri" w:hAnsi="Calibri" w:eastAsia="Calibri"/>
+          <w:b w:val="0"/>
+          <w:sz w:val="22"/>
+        </w:rPr>
+        <w:t xml:space="preserve"> (</w:t>
+      </w:r>
+      <w:r>
+        <w:rPr>
+          <w:rFonts w:ascii="Consolas" w:hAnsi="Consolas" w:eastAsia="Consolas"/>
+          <w:b w:val="0"/>
+          <w:sz w:val="20"/>
+        </w:rPr>
+        <w:t>0..23</w:t>
+      </w:r>
+      <w:r>
+        <w:rPr>
+          <w:rFonts w:ascii="Calibri" w:hAnsi="Calibri" w:eastAsia="Calibri"/>
+          <w:b w:val="0"/>
+          <w:sz w:val="22"/>
+        </w:rPr>
+        <w:t>).</w:t>
+      </w:r>
+    </w:p>
+    <w:p>
+      <w:pPr>
+        <w:pStyle w:val="Normal"/>
+      </w:pPr>
+      <w:r>
+        <w:rPr>
+          <w:rFonts w:ascii="Calibri" w:hAnsi="Calibri" w:eastAsia="Calibri"/>
+          <w:b w:val="0"/>
+          <w:sz w:val="22"/>
+        </w:rPr>
+      </w:r>
+    </w:p>
+    <w:tbl>
+      <w:tblPr>
+        <w:tblStyle w:val="TableGrid"/>
+        <w:tblW w:type="auto" w:w="0"/>
+        <w:tblLook w:firstColumn="1" w:firstRow="1" w:lastColumn="0" w:lastRow="0" w:noHBand="0" w:noVBand="1" w:val="04A0"/>
+      </w:tblPr>
+      <w:tblGrid>
+        <w:gridCol w:w="4824"/>
+        <w:gridCol w:w="4824"/>
+      </w:tblGrid>
+      <w:tr>
+        <w:tc>
+          <w:tcPr>
+            <w:tcW w:type="dxa" w:w="4824"/>
+            <w:shd w:fill="1F4E79" w:val="clear"/>
+          </w:tcPr>
+          <w:p>
+            <w:pPr>
+              <w:jc w:val="right"/>
+            </w:pPr>
+            <w:r>
+              <w:rPr>
+                <w:rFonts w:ascii="Calibri" w:hAnsi="Calibri" w:eastAsia="Calibri"/>
+                <w:b/>
+                <w:color w:val="FFFFFF"/>
+                <w:sz w:val="20"/>
+              </w:rPr>
+              <w:t>Value</w:t>
+            </w:r>
+          </w:p>
+        </w:tc>
+        <w:tc>
+          <w:tcPr>
+            <w:tcW w:type="dxa" w:w="4824"/>
+            <w:shd w:fill="1F4E79" w:val="clear"/>
+          </w:tcPr>
+          <w:p>
+            <w:r>
+              <w:rPr>
+                <w:rFonts w:ascii="Calibri" w:hAnsi="Calibri" w:eastAsia="Calibri"/>
+                <w:b/>
+                <w:color w:val="FFFFFF"/>
+                <w:sz w:val="20"/>
+              </w:rPr>
+              <w:t>Meaning in that group</w:t>
+            </w:r>
+          </w:p>
+        </w:tc>
+      </w:tr>
+      <w:tr>
+        <w:tc>
+          <w:tcPr>
+            <w:tcW w:type="dxa" w:w="4824"/>
+          </w:tcPr>
+          <w:p>
+            <w:pPr>
+              <w:jc w:val="right"/>
+            </w:pPr>
+            <w:r>
+              <w:rPr>
+                <w:rFonts w:ascii="Calibri" w:hAnsi="Calibri" w:eastAsia="Calibri"/>
+                <w:b w:val="0"/>
+                <w:color w:val="000000"/>
+                <w:sz w:val="20"/>
+              </w:rPr>
+              <w:t>1</w:t>
+            </w:r>
+          </w:p>
+        </w:tc>
+        <w:tc>
+          <w:tcPr>
+            <w:tcW w:type="dxa" w:w="4824"/>
+          </w:tcPr>
+          <w:p>
+            <w:r>
+              <w:rPr>
+                <w:rFonts w:ascii="Calibri" w:hAnsi="Calibri" w:eastAsia="Calibri"/>
+                <w:b w:val="0"/>
+                <w:color w:val="000000"/>
+                <w:sz w:val="20"/>
+              </w:rPr>
+              <w:t>1st button on (BTN{g*5+1}Setup)</w:t>
+            </w:r>
+          </w:p>
+        </w:tc>
+      </w:tr>
+      <w:tr>
+        <w:tc>
+          <w:tcPr>
+            <w:tcW w:type="dxa" w:w="4824"/>
+            <w:shd w:val="clear" w:fill="EEF3F8"/>
+          </w:tcPr>
+          <w:p>
+            <w:pPr>
+              <w:jc w:val="right"/>
+            </w:pPr>
+            <w:r>
+              <w:rPr>
+                <w:rFonts w:ascii="Calibri" w:hAnsi="Calibri" w:eastAsia="Calibri"/>
+                <w:b w:val="0"/>
+                <w:color w:val="000000"/>
+                <w:sz w:val="20"/>
+              </w:rPr>
+              <w:t>2</w:t>
+            </w:r>
+          </w:p>
+        </w:tc>
+        <w:tc>
+          <w:tcPr>
+            <w:tcW w:type="dxa" w:w="4824"/>
+            <w:shd w:val="clear" w:fill="EEF3F8"/>
+          </w:tcPr>
+          <w:p>
+            <w:r>
+              <w:rPr>
+                <w:rFonts w:ascii="Calibri" w:hAnsi="Calibri" w:eastAsia="Calibri"/>
+                <w:b w:val="0"/>
+                <w:color w:val="000000"/>
+                <w:sz w:val="20"/>
+              </w:rPr>
+              <w:t>2nd button on (BTN{g*5+2}Setup)</w:t>
+            </w:r>
+          </w:p>
+        </w:tc>
+      </w:tr>
+      <w:tr>
+        <w:tc>
+          <w:tcPr>
+            <w:tcW w:type="dxa" w:w="4824"/>
+          </w:tcPr>
+          <w:p>
+            <w:pPr>
+              <w:jc w:val="right"/>
+            </w:pPr>
+            <w:r>
+              <w:rPr>
+                <w:rFonts w:ascii="Calibri" w:hAnsi="Calibri" w:eastAsia="Calibri"/>
+                <w:b w:val="0"/>
+                <w:color w:val="000000"/>
+                <w:sz w:val="20"/>
+              </w:rPr>
+              <w:t>4</w:t>
+            </w:r>
+          </w:p>
+        </w:tc>
+        <w:tc>
+          <w:tcPr>
+            <w:tcW w:type="dxa" w:w="4824"/>
+          </w:tcPr>
+          <w:p>
+            <w:r>
+              <w:rPr>
+                <w:rFonts w:ascii="Calibri" w:hAnsi="Calibri" w:eastAsia="Calibri"/>
+                <w:b w:val="0"/>
+                <w:color w:val="000000"/>
+                <w:sz w:val="20"/>
+              </w:rPr>
+              <w:t>3rd button on (BTN{g*5+3}Setup)</w:t>
+            </w:r>
+          </w:p>
+        </w:tc>
+      </w:tr>
+      <w:tr>
+        <w:tc>
+          <w:tcPr>
+            <w:tcW w:type="dxa" w:w="4824"/>
+            <w:shd w:val="clear" w:fill="EEF3F8"/>
+          </w:tcPr>
+          <w:p>
+            <w:pPr>
+              <w:jc w:val="right"/>
+            </w:pPr>
+            <w:r>
+              <w:rPr>
+                <w:rFonts w:ascii="Calibri" w:hAnsi="Calibri" w:eastAsia="Calibri"/>
+                <w:b w:val="0"/>
+                <w:color w:val="000000"/>
+                <w:sz w:val="20"/>
+              </w:rPr>
+              <w:t>8</w:t>
+            </w:r>
+          </w:p>
+        </w:tc>
+        <w:tc>
+          <w:tcPr>
+            <w:tcW w:type="dxa" w:w="4824"/>
+            <w:shd w:val="clear" w:fill="EEF3F8"/>
+          </w:tcPr>
+          <w:p>
+            <w:r>
+              <w:rPr>
+                <w:rFonts w:ascii="Calibri" w:hAnsi="Calibri" w:eastAsia="Calibri"/>
+                <w:b w:val="0"/>
+                <w:color w:val="000000"/>
+                <w:sz w:val="20"/>
+              </w:rPr>
+              <w:t>4th button on (BTN{g*5+4}Setup)</w:t>
+            </w:r>
+          </w:p>
+        </w:tc>
+      </w:tr>
+      <w:tr>
+        <w:tc>
+          <w:tcPr>
+            <w:tcW w:type="dxa" w:w="4824"/>
+          </w:tcPr>
+          <w:p>
+            <w:pPr>
+              <w:jc w:val="right"/>
+            </w:pPr>
+            <w:r>
+              <w:rPr>
+                <w:rFonts w:ascii="Calibri" w:hAnsi="Calibri" w:eastAsia="Calibri"/>
+                <w:b w:val="0"/>
+                <w:color w:val="000000"/>
+                <w:sz w:val="20"/>
+              </w:rPr>
+              <w:t>16</w:t>
+            </w:r>
+          </w:p>
+        </w:tc>
+        <w:tc>
+          <w:tcPr>
+            <w:tcW w:type="dxa" w:w="4824"/>
+          </w:tcPr>
+          <w:p>
+            <w:r>
+              <w:rPr>
+                <w:rFonts w:ascii="Calibri" w:hAnsi="Calibri" w:eastAsia="Calibri"/>
+                <w:b w:val="0"/>
+                <w:color w:val="000000"/>
+                <w:sz w:val="20"/>
+              </w:rPr>
+              <w:t>5th button on (BTN{g*5+5}Setup)</w:t>
+            </w:r>
+          </w:p>
+        </w:tc>
+      </w:tr>
+    </w:tbl>
+    <w:p>
+      <w:pPr>
+        <w:pStyle w:val="Normal"/>
+      </w:pPr>
+      <w:r>
+        <w:rPr>
+          <w:rFonts w:ascii="Calibri" w:hAnsi="Calibri" w:eastAsia="Calibri"/>
+          <w:b w:val="0"/>
+          <w:sz w:val="22"/>
+        </w:rPr>
+        <w:t>Values can combine (</w:t>
+      </w:r>
+      <w:r>
+        <w:rPr>
+          <w:rFonts w:ascii="Consolas" w:hAnsi="Consolas" w:eastAsia="Consolas"/>
+          <w:b w:val="0"/>
+          <w:sz w:val="20"/>
+        </w:rPr>
+        <w:t>0..31</w:t>
+      </w:r>
+      <w:r>
+        <w:rPr>
+          <w:rFonts w:ascii="Calibri" w:hAnsi="Calibri" w:eastAsia="Calibri"/>
+          <w:b w:val="0"/>
+          <w:sz w:val="22"/>
+        </w:rPr>
+        <w:t xml:space="preserve">). </w:t>
+      </w:r>
+      <w:r>
+        <w:rPr>
+          <w:rFonts w:ascii="Consolas" w:hAnsi="Consolas" w:eastAsia="Consolas"/>
+          <w:b w:val="0"/>
+          <w:sz w:val="20"/>
+        </w:rPr>
+        <w:t>sButtonDisable[i][g]</w:t>
+      </w:r>
+      <w:r>
+        <w:rPr>
+          <w:rFonts w:ascii="Calibri" w:hAnsi="Calibri" w:eastAsia="Calibri"/>
+          <w:b w:val="0"/>
+          <w:sz w:val="22"/>
+        </w:rPr>
+        <w:t xml:space="preserve"> uses the same bits for disabled / not available. Button labels come from vessel </w:t>
       </w:r>
       <w:r>
         <w:rPr>

</xml_diff>